<commit_message>
TODO: mark session work as DONE + add rows for meta-report refresh
Flip three existing OPEN rows to DONE based on what shipped this session:
- Roster / premium: slot-aware empty/upgrade badges
- Slice screen layout: Your Roster card alongside Best Characters
- Slice screen scoring: secondaries weighted via aligned-priority count

Add five new DONE rows for the session-specific work: chars.js refresh
from swgoh.gg mod meta report, Primary stat + Set match badges,
Better/Same/Worse fit verdict, set-filtered recommendations, roster
cache-key bump.
</commit_message>
<xml_diff>
--- a/docs/TODO.docx
+++ b/docs/TODO.docx
@@ -839,6 +839,101 @@
               <w:bottom w:val="single" w:color="CCCCCC" w:sz="1"/>
               <w:right w:val="single" w:color="CCCCCC" w:sz="1"/>
             </w:tcBorders>
+            <w:shd w:fill="D5F0D5" w:val="clear"/>
+            <w:tcMar>
+              <w:top w:type="dxa" w:w="80"/>
+              <w:left w:type="dxa" w:w="120"/>
+              <w:bottom w:type="dxa" w:w="80"/>
+              <w:right w:type="dxa" w:w="120"/>
+            </w:tcMar>
+          </w:tcPr>
+          <w:p>
+            <w:r>
+              <w:rPr>
+                <w:b/>
+                <w:bCs/>
+              </w:rPr>
+              <w:t xml:space="preserve">DONE</w:t>
+            </w:r>
+          </w:p>
+        </w:tc>
+        <w:tc>
+          <w:tcPr>
+            <w:tcW w:type="dxa" w:w="2000"/>
+            <w:tcBorders>
+              <w:top w:val="single" w:color="CCCCCC" w:sz="1"/>
+              <w:left w:val="single" w:color="CCCCCC" w:sz="1"/>
+              <w:bottom w:val="single" w:color="CCCCCC" w:sz="1"/>
+              <w:right w:val="single" w:color="CCCCCC" w:sz="1"/>
+            </w:tcBorders>
+            <w:tcMar>
+              <w:top w:type="dxa" w:w="80"/>
+              <w:left w:type="dxa" w:w="120"/>
+              <w:bottom w:type="dxa" w:w="80"/>
+              <w:right w:type="dxa" w:w="120"/>
+            </w:tcMar>
+          </w:tcPr>
+          <w:p>
+            <w:r>
+              <w:t xml:space="preserve">Slice screen / layout</w:t>
+            </w:r>
+          </w:p>
+        </w:tc>
+        <w:tc>
+          <w:tcPr>
+            <w:tcW w:type="dxa" w:w="3500"/>
+            <w:tcBorders>
+              <w:top w:val="single" w:color="CCCCCC" w:sz="1"/>
+              <w:left w:val="single" w:color="CCCCCC" w:sz="1"/>
+              <w:bottom w:val="single" w:color="CCCCCC" w:sz="1"/>
+              <w:right w:val="single" w:color="CCCCCC" w:sz="1"/>
+            </w:tcBorders>
+            <w:tcMar>
+              <w:top w:type="dxa" w:w="80"/>
+              <w:left w:type="dxa" w:w="120"/>
+              <w:bottom w:type="dxa" w:w="80"/>
+              <w:right w:type="dxa" w:w="120"/>
+            </w:tcMar>
+          </w:tcPr>
+          <w:p>
+            <w:r>
+              <w:t xml:space="preserve">Shrink the Best Character Fit card and place a "Your Characters" card next to it (premium-only)</w:t>
+            </w:r>
+          </w:p>
+        </w:tc>
+        <w:tc>
+          <w:tcPr>
+            <w:tcW w:type="dxa" w:w="2460"/>
+            <w:tcBorders>
+              <w:top w:val="single" w:color="CCCCCC" w:sz="1"/>
+              <w:left w:val="single" w:color="CCCCCC" w:sz="1"/>
+              <w:bottom w:val="single" w:color="CCCCCC" w:sz="1"/>
+              <w:right w:val="single" w:color="CCCCCC" w:sz="1"/>
+            </w:tcBorders>
+            <w:tcMar>
+              <w:top w:type="dxa" w:w="80"/>
+              <w:left w:type="dxa" w:w="120"/>
+              <w:bottom w:type="dxa" w:w="80"/>
+              <w:right w:type="dxa" w:w="120"/>
+            </w:tcMar>
+          </w:tcPr>
+          <w:p>
+            <w:r>
+              <w:t xml:space="preserve">Two-card row. "Your Characters" populated from ally-code roster; gated behind premium.</w:t>
+            </w:r>
+          </w:p>
+        </w:tc>
+      </w:tr>
+      <w:tr>
+        <w:tc>
+          <w:tcPr>
+            <w:tcW w:type="dxa" w:w="1400"/>
+            <w:tcBorders>
+              <w:top w:val="single" w:color="CCCCCC" w:sz="1"/>
+              <w:left w:val="single" w:color="CCCCCC" w:sz="1"/>
+              <w:bottom w:val="single" w:color="CCCCCC" w:sz="1"/>
+              <w:right w:val="single" w:color="CCCCCC" w:sz="1"/>
+            </w:tcBorders>
             <w:shd w:fill="FFF4CE" w:val="clear"/>
             <w:tcMar>
               <w:top w:type="dxa" w:w="80"/>
@@ -875,7 +970,7 @@
           </w:tcPr>
           <w:p>
             <w:r>
-              <w:t xml:space="preserve">Slice screen / layout</w:t>
+              <w:t xml:space="preserve">Slice screen / suggestions</w:t>
             </w:r>
           </w:p>
         </w:tc>
@@ -897,7 +992,7 @@
           </w:tcPr>
           <w:p>
             <w:r>
-              <w:t xml:space="preserve">Shrink the Best Character Fit card and place a "Your Characters" card next to it (premium-only)</w:t>
+              <w:t xml:space="preserve">Reduce total number of suggested characters — 140 is too high</w:t>
             </w:r>
           </w:p>
         </w:tc>
@@ -919,7 +1014,102 @@
           </w:tcPr>
           <w:p>
             <w:r>
-              <w:t xml:space="preserve">Two-card row. "Your Characters" populated from ally-code roster; gated behind premium.</w:t>
+              <w:t xml:space="preserve">Pick a sane cap (e.g. top 20–30 by fit score) and sort by best match.</w:t>
+            </w:r>
+          </w:p>
+        </w:tc>
+      </w:tr>
+      <w:tr>
+        <w:tc>
+          <w:tcPr>
+            <w:tcW w:type="dxa" w:w="1400"/>
+            <w:tcBorders>
+              <w:top w:val="single" w:color="CCCCCC" w:sz="1"/>
+              <w:left w:val="single" w:color="CCCCCC" w:sz="1"/>
+              <w:bottom w:val="single" w:color="CCCCCC" w:sz="1"/>
+              <w:right w:val="single" w:color="CCCCCC" w:sz="1"/>
+            </w:tcBorders>
+            <w:shd w:fill="D5F0D5" w:val="clear"/>
+            <w:tcMar>
+              <w:top w:type="dxa" w:w="80"/>
+              <w:left w:type="dxa" w:w="120"/>
+              <w:bottom w:type="dxa" w:w="80"/>
+              <w:right w:type="dxa" w:w="120"/>
+            </w:tcMar>
+          </w:tcPr>
+          <w:p>
+            <w:r>
+              <w:rPr>
+                <w:b/>
+                <w:bCs/>
+              </w:rPr>
+              <w:t xml:space="preserve">DONE</w:t>
+            </w:r>
+          </w:p>
+        </w:tc>
+        <w:tc>
+          <w:tcPr>
+            <w:tcW w:type="dxa" w:w="2000"/>
+            <w:tcBorders>
+              <w:top w:val="single" w:color="CCCCCC" w:sz="1"/>
+              <w:left w:val="single" w:color="CCCCCC" w:sz="1"/>
+              <w:bottom w:val="single" w:color="CCCCCC" w:sz="1"/>
+              <w:right w:val="single" w:color="CCCCCC" w:sz="1"/>
+            </w:tcBorders>
+            <w:tcMar>
+              <w:top w:type="dxa" w:w="80"/>
+              <w:left w:type="dxa" w:w="120"/>
+              <w:bottom w:type="dxa" w:w="80"/>
+              <w:right w:type="dxa" w:w="120"/>
+            </w:tcMar>
+          </w:tcPr>
+          <w:p>
+            <w:r>
+              <w:t xml:space="preserve">Slice screen / scoring</w:t>
+            </w:r>
+          </w:p>
+        </w:tc>
+        <w:tc>
+          <w:tcPr>
+            <w:tcW w:type="dxa" w:w="3500"/>
+            <w:tcBorders>
+              <w:top w:val="single" w:color="CCCCCC" w:sz="1"/>
+              <w:left w:val="single" w:color="CCCCCC" w:sz="1"/>
+              <w:bottom w:val="single" w:color="CCCCCC" w:sz="1"/>
+              <w:right w:val="single" w:color="CCCCCC" w:sz="1"/>
+            </w:tcBorders>
+            <w:tcMar>
+              <w:top w:type="dxa" w:w="80"/>
+              <w:left w:type="dxa" w:w="120"/>
+              <w:bottom w:type="dxa" w:w="80"/>
+              <w:right w:type="dxa" w:w="120"/>
+            </w:tcMar>
+          </w:tcPr>
+          <w:p>
+            <w:r>
+              <w:t xml:space="preserve">Investigate suggestion scoring — likely only comparing set + primary, ignoring secondaries</w:t>
+            </w:r>
+          </w:p>
+        </w:tc>
+        <w:tc>
+          <w:tcPr>
+            <w:tcW w:type="dxa" w:w="2460"/>
+            <w:tcBorders>
+              <w:top w:val="single" w:color="CCCCCC" w:sz="1"/>
+              <w:left w:val="single" w:color="CCCCCC" w:sz="1"/>
+              <w:bottom w:val="single" w:color="CCCCCC" w:sz="1"/>
+              <w:right w:val="single" w:color="CCCCCC" w:sz="1"/>
+            </w:tcBorders>
+            <w:tcMar>
+              <w:top w:type="dxa" w:w="80"/>
+              <w:left w:type="dxa" w:w="120"/>
+              <w:bottom w:type="dxa" w:w="80"/>
+              <w:right w:type="dxa" w:w="120"/>
+            </w:tcMar>
+          </w:tcPr>
+          <w:p>
+            <w:r>
+              <w:t xml:space="preserve">Audit scoring path. Secondaries should weight into fit score; otherwise suggestions are noisy.</w:t>
             </w:r>
           </w:p>
         </w:tc>
@@ -970,7 +1160,7 @@
           </w:tcPr>
           <w:p>
             <w:r>
-              <w:t xml:space="preserve">Slice screen / suggestions</w:t>
+              <w:t xml:space="preserve">Scan performance</w:t>
             </w:r>
           </w:p>
         </w:tc>
@@ -992,7 +1182,7 @@
           </w:tcPr>
           <w:p>
             <w:r>
-              <w:t xml:space="preserve">Reduce total number of suggested characters — 140 is too high</w:t>
+              <w:t xml:space="preserve">Increase overall scan speed on the overlay capture flow</w:t>
             </w:r>
           </w:p>
         </w:tc>
@@ -1014,7 +1204,7 @@
           </w:tcPr>
           <w:p>
             <w:r>
-              <w:t xml:space="preserve">Pick a sane cap (e.g. top 20–30 by fit score) and sort by best match.</w:t>
+              <w:t xml:space="preserve">Focused/stats/shape/icon/set crops + two classifiers (set + shape) run sequentially per mod. Profile the hot path and see what can be parallelized or cached between mods on the same screen.</w:t>
             </w:r>
           </w:p>
         </w:tc>
@@ -1065,7 +1255,7 @@
           </w:tcPr>
           <w:p>
             <w:r>
-              <w:t xml:space="preserve">Slice screen / scoring</w:t>
+              <w:t xml:space="preserve">Scan UX</w:t>
             </w:r>
           </w:p>
         </w:tc>
@@ -1087,7 +1277,7 @@
           </w:tcPr>
           <w:p>
             <w:r>
-              <w:t xml:space="preserve">Investigate suggestion scoring — likely only comparing set + primary, ignoring secondaries</w:t>
+              <w:t xml:space="preserve">First scan-button press is swallowed when the screen was just swapped — user has to click twice</w:t>
             </w:r>
           </w:p>
         </w:tc>
@@ -1109,7 +1299,7 @@
           </w:tcPr>
           <w:p>
             <w:r>
-              <w:t xml:space="preserve">Audit scoring path. Secondaries should weight into fit score; otherwise suggestions are noisy.</w:t>
+              <w:t xml:space="preserve">Likely the overlay/capture service isn’t fully bound when the first tap lands. Check listener wiring in ModOverlayCaptureService / CaptureScreen so the first tap either queues until ready or the button stays disabled until bind completes.</w:t>
             </w:r>
           </w:p>
         </w:tc>
@@ -1124,7 +1314,7 @@
               <w:bottom w:val="single" w:color="CCCCCC" w:sz="1"/>
               <w:right w:val="single" w:color="CCCCCC" w:sz="1"/>
             </w:tcBorders>
-            <w:shd w:fill="FFF4CE" w:val="clear"/>
+            <w:shd w:fill="D5F0D5" w:val="clear"/>
             <w:tcMar>
               <w:top w:type="dxa" w:w="80"/>
               <w:left w:type="dxa" w:w="120"/>
@@ -1138,7 +1328,7 @@
                 <w:b/>
                 <w:bCs/>
               </w:rPr>
-              <w:t xml:space="preserve">OPEN</w:t>
+              <w:t xml:space="preserve">DONE</w:t>
             </w:r>
           </w:p>
         </w:tc>
@@ -1160,7 +1350,7 @@
           </w:tcPr>
           <w:p>
             <w:r>
-              <w:t xml:space="preserve">Scan performance</w:t>
+              <w:t xml:space="preserve">Roster / premium</w:t>
             </w:r>
           </w:p>
         </w:tc>
@@ -1182,7 +1372,7 @@
           </w:tcPr>
           <w:p>
             <w:r>
-              <w:t xml:space="preserve">Increase overall scan speed on the overlay capture flow</w:t>
+              <w:t xml:space="preserve">Pull user mods via ally code and flag empty slots + upgrade opportunities (premium)</w:t>
             </w:r>
           </w:p>
         </w:tc>
@@ -1204,7 +1394,7 @@
           </w:tcPr>
           <w:p>
             <w:r>
-              <w:t xml:space="preserve">Focused/stats/shape/icon/set crops + two classifiers (set + shape) run sequentially per mod. Profile the hot path and see what can be parallelized or cached between mods on the same screen.</w:t>
+              <w:t xml:space="preserve">Premium: badge on character when a slot is empty OR an existing mod is an upgrade. Also show a "not unlocked" notifier next to locked characters.</w:t>
             </w:r>
           </w:p>
         </w:tc>
@@ -1219,7 +1409,7 @@
               <w:bottom w:val="single" w:color="CCCCCC" w:sz="1"/>
               <w:right w:val="single" w:color="CCCCCC" w:sz="1"/>
             </w:tcBorders>
-            <w:shd w:fill="FFF4CE" w:val="clear"/>
+            <w:shd w:fill="D5F0D5" w:val="clear"/>
             <w:tcMar>
               <w:top w:type="dxa" w:w="80"/>
               <w:left w:type="dxa" w:w="120"/>
@@ -1233,7 +1423,7 @@
                 <w:b/>
                 <w:bCs/>
               </w:rPr>
-              <w:t xml:space="preserve">OPEN</w:t>
+              <w:t xml:space="preserve">DONE</w:t>
             </w:r>
           </w:p>
         </w:tc>
@@ -1255,7 +1445,7 @@
           </w:tcPr>
           <w:p>
             <w:r>
-              <w:t xml:space="preserve">Scan UX</w:t>
+              <w:t xml:space="preserve">Slice / data</w:t>
             </w:r>
           </w:p>
         </w:tc>
@@ -1277,7 +1467,7 @@
           </w:tcPr>
           <w:p>
             <w:r>
-              <w:t xml:space="preserve">First scan-button press is swallowed when the screen was just swapped — user has to click twice</w:t>
+              <w:t xml:space="preserve">Refresh chars.js against swgoh.gg mod meta report (277 of 325 entries updated)</w:t>
             </w:r>
           </w:p>
         </w:tc>
@@ -1299,7 +1489,7 @@
           </w:tcPr>
           <w:p>
             <w:r>
-              <w:t xml:space="preserve">Likely the overlay/capture service isn’t fully bound when the first tap lands. Check listener wiring in ModOverlayCaptureService / CaptureScreen so the first tap either queues until ready or the button stays disabled until bind completes.</w:t>
+              <w:t xml:space="preserve">tools/verify-chars-vs-swgoh.js fetches /stats/mod-meta-report/ through the Cloudflare Worker, parses set icons + per-shape primary columns, diffs vs chars.js with multi-primary tolerance. Only Cobb Vanth (not yet in the meta table) left on old data.</w:t>
             </w:r>
           </w:p>
         </w:tc>
@@ -1314,7 +1504,7 @@
               <w:bottom w:val="single" w:color="CCCCCC" w:sz="1"/>
               <w:right w:val="single" w:color="CCCCCC" w:sz="1"/>
             </w:tcBorders>
-            <w:shd w:fill="FFF4CE" w:val="clear"/>
+            <w:shd w:fill="D5F0D5" w:val="clear"/>
             <w:tcMar>
               <w:top w:type="dxa" w:w="80"/>
               <w:left w:type="dxa" w:w="120"/>
@@ -1328,7 +1518,7 @@
                 <w:b/>
                 <w:bCs/>
               </w:rPr>
-              <w:t xml:space="preserve">OPEN</w:t>
+              <w:t xml:space="preserve">DONE</w:t>
             </w:r>
           </w:p>
         </w:tc>
@@ -1350,7 +1540,7 @@
           </w:tcPr>
           <w:p>
             <w:r>
-              <w:t xml:space="preserve">Roster / premium</w:t>
+              <w:t xml:space="preserve">Slice UX</w:t>
             </w:r>
           </w:p>
         </w:tc>
@@ -1372,7 +1562,7 @@
           </w:tcPr>
           <w:p>
             <w:r>
-              <w:t xml:space="preserve">Pull user mods via ally code and flag empty slots + upgrade opportunities (premium)</w:t>
+              <w:t xml:space="preserve">Primary stat + Set match badges below character name (purple / yellow chips)</w:t>
             </w:r>
           </w:p>
         </w:tc>
@@ -1394,7 +1584,292 @@
           </w:tcPr>
           <w:p>
             <w:r>
-              <w:t xml:space="preserve">Premium: badge on character when a slot is empty OR an existing mod is an upgrade. Also show a "not unlocked" notifier next to locked characters.</w:t>
+              <w:t xml:space="preserve">Render regardless of roster state. Priority chip row is now uniformly green when aligned — purple star indicator moved out into the dedicated Primary stat match badge.</w:t>
+            </w:r>
+          </w:p>
+        </w:tc>
+      </w:tr>
+      <w:tr>
+        <w:tc>
+          <w:tcPr>
+            <w:tcW w:type="dxa" w:w="1400"/>
+            <w:tcBorders>
+              <w:top w:val="single" w:color="CCCCCC" w:sz="1"/>
+              <w:left w:val="single" w:color="CCCCCC" w:sz="1"/>
+              <w:bottom w:val="single" w:color="CCCCCC" w:sz="1"/>
+              <w:right w:val="single" w:color="CCCCCC" w:sz="1"/>
+            </w:tcBorders>
+            <w:shd w:fill="D5F0D5" w:val="clear"/>
+            <w:tcMar>
+              <w:top w:type="dxa" w:w="80"/>
+              <w:left w:type="dxa" w:w="120"/>
+              <w:bottom w:type="dxa" w:w="80"/>
+              <w:right w:type="dxa" w:w="120"/>
+            </w:tcMar>
+          </w:tcPr>
+          <w:p>
+            <w:r>
+              <w:rPr>
+                <w:b/>
+                <w:bCs/>
+              </w:rPr>
+              <w:t xml:space="preserve">DONE</w:t>
+            </w:r>
+          </w:p>
+        </w:tc>
+        <w:tc>
+          <w:tcPr>
+            <w:tcW w:type="dxa" w:w="2000"/>
+            <w:tcBorders>
+              <w:top w:val="single" w:color="CCCCCC" w:sz="1"/>
+              <w:left w:val="single" w:color="CCCCCC" w:sz="1"/>
+              <w:bottom w:val="single" w:color="CCCCCC" w:sz="1"/>
+              <w:right w:val="single" w:color="CCCCCC" w:sz="1"/>
+            </w:tcBorders>
+            <w:tcMar>
+              <w:top w:type="dxa" w:w="80"/>
+              <w:left w:type="dxa" w:w="120"/>
+              <w:bottom w:type="dxa" w:w="80"/>
+              <w:right w:type="dxa" w:w="120"/>
+            </w:tcMar>
+          </w:tcPr>
+          <w:p>
+            <w:r>
+              <w:t xml:space="preserve">Slice UX</w:t>
+            </w:r>
+          </w:p>
+        </w:tc>
+        <w:tc>
+          <w:tcPr>
+            <w:tcW w:type="dxa" w:w="3500"/>
+            <w:tcBorders>
+              <w:top w:val="single" w:color="CCCCCC" w:sz="1"/>
+              <w:left w:val="single" w:color="CCCCCC" w:sz="1"/>
+              <w:bottom w:val="single" w:color="CCCCCC" w:sz="1"/>
+              <w:right w:val="single" w:color="CCCCCC" w:sz="1"/>
+            </w:tcBorders>
+            <w:tcMar>
+              <w:top w:type="dxa" w:w="80"/>
+              <w:left w:type="dxa" w:w="120"/>
+              <w:bottom w:type="dxa" w:w="80"/>
+              <w:right w:type="dxa" w:w="120"/>
+            </w:tcMar>
+          </w:tcPr>
+          <w:p>
+            <w:r>
+              <w:t xml:space="preserve">Count-based Better / Same / Worse fit verdict (replaces score-based Upgrade / Sidegrade / Downgrade)</w:t>
+            </w:r>
+          </w:p>
+        </w:tc>
+        <w:tc>
+          <w:tcPr>
+            <w:tcW w:type="dxa" w:w="2460"/>
+            <w:tcBorders>
+              <w:top w:val="single" w:color="CCCCCC" w:sz="1"/>
+              <w:left w:val="single" w:color="CCCCCC" w:sz="1"/>
+              <w:bottom w:val="single" w:color="CCCCCC" w:sz="1"/>
+              <w:right w:val="single" w:color="CCCCCC" w:sz="1"/>
+            </w:tcBorders>
+            <w:tcMar>
+              <w:top w:type="dxa" w:w="80"/>
+              <w:left w:type="dxa" w:w="120"/>
+              <w:bottom w:type="dxa" w:w="80"/>
+              <w:right w:type="dxa" w:w="120"/>
+            </w:tcMar>
+          </w:tcPr>
+          <w:p>
+            <w:r>
+              <w:t xml:space="preserve">countAlignedForMatch in sliceEngine.js. Compares aligned-secondary counts on scanned mod vs equipped slot mod. Magnitude-insensitive — any matching-priority secondary counts as 1.</w:t>
+            </w:r>
+          </w:p>
+        </w:tc>
+      </w:tr>
+      <w:tr>
+        <w:tc>
+          <w:tcPr>
+            <w:tcW w:type="dxa" w:w="1400"/>
+            <w:tcBorders>
+              <w:top w:val="single" w:color="CCCCCC" w:sz="1"/>
+              <w:left w:val="single" w:color="CCCCCC" w:sz="1"/>
+              <w:bottom w:val="single" w:color="CCCCCC" w:sz="1"/>
+              <w:right w:val="single" w:color="CCCCCC" w:sz="1"/>
+            </w:tcBorders>
+            <w:shd w:fill="D5F0D5" w:val="clear"/>
+            <w:tcMar>
+              <w:top w:type="dxa" w:w="80"/>
+              <w:left w:type="dxa" w:w="120"/>
+              <w:bottom w:type="dxa" w:w="80"/>
+              <w:right w:type="dxa" w:w="120"/>
+            </w:tcMar>
+          </w:tcPr>
+          <w:p>
+            <w:r>
+              <w:rPr>
+                <w:b/>
+                <w:bCs/>
+              </w:rPr>
+              <w:t xml:space="preserve">DONE</w:t>
+            </w:r>
+          </w:p>
+        </w:tc>
+        <w:tc>
+          <w:tcPr>
+            <w:tcW w:type="dxa" w:w="2000"/>
+            <w:tcBorders>
+              <w:top w:val="single" w:color="CCCCCC" w:sz="1"/>
+              <w:left w:val="single" w:color="CCCCCC" w:sz="1"/>
+              <w:bottom w:val="single" w:color="CCCCCC" w:sz="1"/>
+              <w:right w:val="single" w:color="CCCCCC" w:sz="1"/>
+            </w:tcBorders>
+            <w:tcMar>
+              <w:top w:type="dxa" w:w="80"/>
+              <w:left w:type="dxa" w:w="120"/>
+              <w:bottom w:type="dxa" w:w="80"/>
+              <w:right w:type="dxa" w:w="120"/>
+            </w:tcMar>
+          </w:tcPr>
+          <w:p>
+            <w:r>
+              <w:t xml:space="preserve">Slice / filtering</w:t>
+            </w:r>
+          </w:p>
+        </w:tc>
+        <w:tc>
+          <w:tcPr>
+            <w:tcW w:type="dxa" w:w="3500"/>
+            <w:tcBorders>
+              <w:top w:val="single" w:color="CCCCCC" w:sz="1"/>
+              <w:left w:val="single" w:color="CCCCCC" w:sz="1"/>
+              <w:bottom w:val="single" w:color="CCCCCC" w:sz="1"/>
+              <w:right w:val="single" w:color="CCCCCC" w:sz="1"/>
+            </w:tcBorders>
+            <w:tcMar>
+              <w:top w:type="dxa" w:w="80"/>
+              <w:left w:type="dxa" w:w="120"/>
+              <w:bottom w:type="dxa" w:w="80"/>
+              <w:right w:type="dxa" w:w="120"/>
+            </w:tcMar>
+          </w:tcPr>
+          <w:p>
+            <w:r>
+              <w:t xml:space="preserve">Filter character recommendations by scanned mod’s set</w:t>
+            </w:r>
+          </w:p>
+        </w:tc>
+        <w:tc>
+          <w:tcPr>
+            <w:tcW w:type="dxa" w:w="2460"/>
+            <w:tcBorders>
+              <w:top w:val="single" w:color="CCCCCC" w:sz="1"/>
+              <w:left w:val="single" w:color="CCCCCC" w:sz="1"/>
+              <w:bottom w:val="single" w:color="CCCCCC" w:sz="1"/>
+              <w:right w:val="single" w:color="CCCCCC" w:sz="1"/>
+            </w:tcBorders>
+            <w:tcMar>
+              <w:top w:type="dxa" w:w="80"/>
+              <w:left w:type="dxa" w:w="120"/>
+              <w:bottom w:type="dxa" w:w="80"/>
+              <w:right w:type="dxa" w:w="120"/>
+            </w:tcMar>
+          </w:tcPr>
+          <w:p>
+            <w:r>
+              <w:t xml:space="preserve">Substring match against c.set so "Defense" matches both Defense(x4)+... and ...+Defense(x2). Drops mismatches out of Best Characters / Best Fit when a set is selected.</w:t>
+            </w:r>
+          </w:p>
+        </w:tc>
+      </w:tr>
+      <w:tr>
+        <w:tc>
+          <w:tcPr>
+            <w:tcW w:type="dxa" w:w="1400"/>
+            <w:tcBorders>
+              <w:top w:val="single" w:color="CCCCCC" w:sz="1"/>
+              <w:left w:val="single" w:color="CCCCCC" w:sz="1"/>
+              <w:bottom w:val="single" w:color="CCCCCC" w:sz="1"/>
+              <w:right w:val="single" w:color="CCCCCC" w:sz="1"/>
+            </w:tcBorders>
+            <w:shd w:fill="D5F0D5" w:val="clear"/>
+            <w:tcMar>
+              <w:top w:type="dxa" w:w="80"/>
+              <w:left w:type="dxa" w:w="120"/>
+              <w:bottom w:type="dxa" w:w="80"/>
+              <w:right w:type="dxa" w:w="120"/>
+            </w:tcMar>
+          </w:tcPr>
+          <w:p>
+            <w:r>
+              <w:rPr>
+                <w:b/>
+                <w:bCs/>
+              </w:rPr>
+              <w:t xml:space="preserve">DONE</w:t>
+            </w:r>
+          </w:p>
+        </w:tc>
+        <w:tc>
+          <w:tcPr>
+            <w:tcW w:type="dxa" w:w="2000"/>
+            <w:tcBorders>
+              <w:top w:val="single" w:color="CCCCCC" w:sz="1"/>
+              <w:left w:val="single" w:color="CCCCCC" w:sz="1"/>
+              <w:bottom w:val="single" w:color="CCCCCC" w:sz="1"/>
+              <w:right w:val="single" w:color="CCCCCC" w:sz="1"/>
+            </w:tcBorders>
+            <w:tcMar>
+              <w:top w:type="dxa" w:w="80"/>
+              <w:left w:type="dxa" w:w="120"/>
+              <w:bottom w:type="dxa" w:w="80"/>
+              <w:right w:type="dxa" w:w="120"/>
+            </w:tcMar>
+          </w:tcPr>
+          <w:p>
+            <w:r>
+              <w:t xml:space="preserve">Roster cache</w:t>
+            </w:r>
+          </w:p>
+        </w:tc>
+        <w:tc>
+          <w:tcPr>
+            <w:tcW w:type="dxa" w:w="3500"/>
+            <w:tcBorders>
+              <w:top w:val="single" w:color="CCCCCC" w:sz="1"/>
+              <w:left w:val="single" w:color="CCCCCC" w:sz="1"/>
+              <w:bottom w:val="single" w:color="CCCCCC" w:sz="1"/>
+              <w:right w:val="single" w:color="CCCCCC" w:sz="1"/>
+            </w:tcBorders>
+            <w:tcMar>
+              <w:top w:type="dxa" w:w="80"/>
+              <w:left w:type="dxa" w:w="120"/>
+              <w:bottom w:type="dxa" w:w="80"/>
+              <w:right w:type="dxa" w:w="120"/>
+            </w:tcMar>
+          </w:tcPr>
+          <w:p>
+            <w:r>
+              <w:t xml:space="preserve">Bump rosterService cache key v2 → v3 to invalidate caches predating mod primary / secondaries normalization</w:t>
+            </w:r>
+          </w:p>
+        </w:tc>
+        <w:tc>
+          <w:tcPr>
+            <w:tcW w:type="dxa" w:w="2460"/>
+            <w:tcBorders>
+              <w:top w:val="single" w:color="CCCCCC" w:sz="1"/>
+              <w:left w:val="single" w:color="CCCCCC" w:sz="1"/>
+              <w:bottom w:val="single" w:color="CCCCCC" w:sz="1"/>
+              <w:right w:val="single" w:color="CCCCCC" w:sz="1"/>
+            </w:tcBorders>
+            <w:tcMar>
+              <w:top w:type="dxa" w:w="80"/>
+              <w:left w:type="dxa" w:w="120"/>
+              <w:bottom w:type="dxa" w:w="80"/>
+              <w:right w:type="dxa" w:w="120"/>
+            </w:tcMar>
+          </w:tcPr>
+          <w:p>
+            <w:r>
+              <w:t xml:space="preserve">Any future shape change to the cached roster needs another bump. Old v2 payloads didn’t include primary / secondaries on each mod, breaking the new slot-aware badges until the user force-refreshed.</w:t>
             </w:r>
           </w:p>
         </w:tc>

</xml_diff>

<commit_message>
docs/TODO: rebuild from authoritative paste (35 rows)
Restores launch-prep items, Comlink-related context, branch hygiene,
tier-ladder slicing, and additional DONE entries that the prior
single-session edit had dropped. Adds build-todo-doc.js driver so the
docx is regenerable.

Co-Authored-By: Claude Opus 4.7 <noreply@anthropic.com>
</commit_message>
<xml_diff>
--- a/docs/TODO.docx
+++ b/docs/TODO.docx
@@ -57,6 +57,7 @@
         </w:trPr>
         <w:tc>
           <w:tcPr>
+            <w:tcW w:type="dxa" w:w="1400"/>
             <w:tcBorders>
               <w:top w:val="single" w:color="CCCCCC" w:sz="1"/>
               <w:left w:val="single" w:color="CCCCCC" w:sz="1"/>
@@ -84,6 +85,7 @@
         </w:tc>
         <w:tc>
           <w:tcPr>
+            <w:tcW w:type="dxa" w:w="2000"/>
             <w:tcBorders>
               <w:top w:val="single" w:color="CCCCCC" w:sz="1"/>
               <w:left w:val="single" w:color="CCCCCC" w:sz="1"/>
@@ -111,6 +113,7 @@
         </w:tc>
         <w:tc>
           <w:tcPr>
+            <w:tcW w:type="dxa" w:w="3500"/>
             <w:tcBorders>
               <w:top w:val="single" w:color="CCCCCC" w:sz="1"/>
               <w:left w:val="single" w:color="CCCCCC" w:sz="1"/>
@@ -138,6 +141,7 @@
         </w:tc>
         <w:tc>
           <w:tcPr>
+            <w:tcW w:type="dxa" w:w="2460"/>
             <w:tcBorders>
               <w:top w:val="single" w:color="CCCCCC" w:sz="1"/>
               <w:left w:val="single" w:color="CCCCCC" w:sz="1"/>
@@ -174,6 +178,291 @@
               <w:bottom w:val="single" w:color="CCCCCC" w:sz="1"/>
               <w:right w:val="single" w:color="CCCCCC" w:sz="1"/>
             </w:tcBorders>
+            <w:shd w:fill="D5F0D5" w:val="clear"/>
+            <w:tcMar>
+              <w:top w:type="dxa" w:w="80"/>
+              <w:left w:type="dxa" w:w="120"/>
+              <w:bottom w:type="dxa" w:w="80"/>
+              <w:right w:type="dxa" w:w="120"/>
+            </w:tcMar>
+          </w:tcPr>
+          <w:p>
+            <w:r>
+              <w:rPr>
+                <w:b/>
+                <w:bCs/>
+              </w:rPr>
+              <w:t xml:space="preserve">DONE</w:t>
+            </w:r>
+          </w:p>
+        </w:tc>
+        <w:tc>
+          <w:tcPr>
+            <w:tcW w:type="dxa" w:w="2000"/>
+            <w:tcBorders>
+              <w:top w:val="single" w:color="CCCCCC" w:sz="1"/>
+              <w:left w:val="single" w:color="CCCCCC" w:sz="1"/>
+              <w:bottom w:val="single" w:color="CCCCCC" w:sz="1"/>
+              <w:right w:val="single" w:color="CCCCCC" w:sz="1"/>
+            </w:tcBorders>
+            <w:tcMar>
+              <w:top w:type="dxa" w:w="80"/>
+              <w:left w:type="dxa" w:w="120"/>
+              <w:bottom w:type="dxa" w:w="80"/>
+              <w:right w:type="dxa" w:w="120"/>
+            </w:tcMar>
+          </w:tcPr>
+          <w:p>
+            <w:r>
+              <w:t xml:space="preserve">Options menu</w:t>
+            </w:r>
+          </w:p>
+        </w:tc>
+        <w:tc>
+          <w:tcPr>
+            <w:tcW w:type="dxa" w:w="3500"/>
+            <w:tcBorders>
+              <w:top w:val="single" w:color="CCCCCC" w:sz="1"/>
+              <w:left w:val="single" w:color="CCCCCC" w:sz="1"/>
+              <w:bottom w:val="single" w:color="CCCCCC" w:sz="1"/>
+              <w:right w:val="single" w:color="CCCCCC" w:sz="1"/>
+            </w:tcBorders>
+            <w:tcMar>
+              <w:top w:type="dxa" w:w="80"/>
+              <w:left w:type="dxa" w:w="120"/>
+              <w:bottom w:type="dxa" w:w="80"/>
+              <w:right w:type="dxa" w:w="120"/>
+            </w:tcMar>
+          </w:tcPr>
+          <w:p>
+            <w:r>
+              <w:t xml:space="preserve">Restore Premium option + test button that was in the options menu</w:t>
+            </w:r>
+          </w:p>
+        </w:tc>
+        <w:tc>
+          <w:tcPr>
+            <w:tcW w:type="dxa" w:w="2460"/>
+            <w:tcBorders>
+              <w:top w:val="single" w:color="CCCCCC" w:sz="1"/>
+              <w:left w:val="single" w:color="CCCCCC" w:sz="1"/>
+              <w:bottom w:val="single" w:color="CCCCCC" w:sz="1"/>
+              <w:right w:val="single" w:color="CCCCCC" w:sz="1"/>
+            </w:tcBorders>
+            <w:tcMar>
+              <w:top w:type="dxa" w:w="80"/>
+              <w:left w:type="dxa" w:w="120"/>
+              <w:bottom w:type="dxa" w:w="80"/>
+              <w:right w:type="dxa" w:w="120"/>
+            </w:tcMar>
+          </w:tcPr>
+          <w:p>
+            <w:r>
+              <w:t xml:space="preserve">Lost in recent rebrand / scaffolding work. Find in git history and reinstate.</w:t>
+            </w:r>
+          </w:p>
+        </w:tc>
+      </w:tr>
+      <w:tr>
+        <w:tc>
+          <w:tcPr>
+            <w:tcW w:type="dxa" w:w="1400"/>
+            <w:tcBorders>
+              <w:top w:val="single" w:color="CCCCCC" w:sz="1"/>
+              <w:left w:val="single" w:color="CCCCCC" w:sz="1"/>
+              <w:bottom w:val="single" w:color="CCCCCC" w:sz="1"/>
+              <w:right w:val="single" w:color="CCCCCC" w:sz="1"/>
+            </w:tcBorders>
+            <w:shd w:fill="D5F0D5" w:val="clear"/>
+            <w:tcMar>
+              <w:top w:type="dxa" w:w="80"/>
+              <w:left w:type="dxa" w:w="120"/>
+              <w:bottom w:type="dxa" w:w="80"/>
+              <w:right w:type="dxa" w:w="120"/>
+            </w:tcMar>
+          </w:tcPr>
+          <w:p>
+            <w:r>
+              <w:rPr>
+                <w:b/>
+                <w:bCs/>
+              </w:rPr>
+              <w:t xml:space="preserve">DONE</w:t>
+            </w:r>
+          </w:p>
+        </w:tc>
+        <w:tc>
+          <w:tcPr>
+            <w:tcW w:type="dxa" w:w="2000"/>
+            <w:tcBorders>
+              <w:top w:val="single" w:color="CCCCCC" w:sz="1"/>
+              <w:left w:val="single" w:color="CCCCCC" w:sz="1"/>
+              <w:bottom w:val="single" w:color="CCCCCC" w:sz="1"/>
+              <w:right w:val="single" w:color="CCCCCC" w:sz="1"/>
+            </w:tcBorders>
+            <w:tcMar>
+              <w:top w:type="dxa" w:w="80"/>
+              <w:left w:type="dxa" w:w="120"/>
+              <w:bottom w:type="dxa" w:w="80"/>
+              <w:right w:type="dxa" w:w="120"/>
+            </w:tcMar>
+          </w:tcPr>
+          <w:p>
+            <w:r>
+              <w:t xml:space="preserve">Shape classifier</w:t>
+            </w:r>
+          </w:p>
+        </w:tc>
+        <w:tc>
+          <w:tcPr>
+            <w:tcW w:type="dxa" w:w="3500"/>
+            <w:tcBorders>
+              <w:top w:val="single" w:color="CCCCCC" w:sz="1"/>
+              <w:left w:val="single" w:color="CCCCCC" w:sz="1"/>
+              <w:bottom w:val="single" w:color="CCCCCC" w:sz="1"/>
+              <w:right w:val="single" w:color="CCCCCC" w:sz="1"/>
+            </w:tcBorders>
+            <w:tcMar>
+              <w:top w:type="dxa" w:w="80"/>
+              <w:left w:type="dxa" w:w="120"/>
+              <w:bottom w:type="dxa" w:w="80"/>
+              <w:right w:type="dxa" w:w="120"/>
+            </w:tcMar>
+          </w:tcPr>
+          <w:p>
+            <w:r>
+              <w:t xml:space="preserve">Grievous-Circle now classifies as Circle. Gated the refineShapeSelection Circle→Diamond rescue rules on !winnerStronglyRound so shapeDiamondCornerScore can’t override a mask-only winner that scored Circle:0.97 with stronglyRound=true.</w:t>
+            </w:r>
+          </w:p>
+        </w:tc>
+        <w:tc>
+          <w:tcPr>
+            <w:tcW w:type="dxa" w:w="2460"/>
+            <w:tcBorders>
+              <w:top w:val="single" w:color="CCCCCC" w:sz="1"/>
+              <w:left w:val="single" w:color="CCCCCC" w:sz="1"/>
+              <w:bottom w:val="single" w:color="CCCCCC" w:sz="1"/>
+              <w:right w:val="single" w:color="CCCCCC" w:sz="1"/>
+            </w:tcBorders>
+            <w:tcMar>
+              <w:top w:type="dxa" w:w="80"/>
+              <w:left w:type="dxa" w:w="120"/>
+              <w:bottom w:type="dxa" w:w="80"/>
+              <w:right w:type="dxa" w:w="120"/>
+            </w:tcMar>
+          </w:tcPr>
+          <w:p>
+            <w:r>
+              <w:t xml:space="preserve">Landed 2026-04-20 in commit 4eb5ff2 alongside earlier bd8c535 (portrait-erase binary mask + mask-only ≥ 0.85 override). Verified on-device. Archive on next sweep.</w:t>
+            </w:r>
+          </w:p>
+        </w:tc>
+      </w:tr>
+      <w:tr>
+        <w:tc>
+          <w:tcPr>
+            <w:tcW w:type="dxa" w:w="1400"/>
+            <w:tcBorders>
+              <w:top w:val="single" w:color="CCCCCC" w:sz="1"/>
+              <w:left w:val="single" w:color="CCCCCC" w:sz="1"/>
+              <w:bottom w:val="single" w:color="CCCCCC" w:sz="1"/>
+              <w:right w:val="single" w:color="CCCCCC" w:sz="1"/>
+            </w:tcBorders>
+            <w:shd w:fill="D5F0D5" w:val="clear"/>
+            <w:tcMar>
+              <w:top w:type="dxa" w:w="80"/>
+              <w:left w:type="dxa" w:w="120"/>
+              <w:bottom w:type="dxa" w:w="80"/>
+              <w:right w:type="dxa" w:w="120"/>
+            </w:tcMar>
+          </w:tcPr>
+          <w:p>
+            <w:r>
+              <w:rPr>
+                <w:b/>
+                <w:bCs/>
+              </w:rPr>
+              <w:t xml:space="preserve">DONE</w:t>
+            </w:r>
+          </w:p>
+        </w:tc>
+        <w:tc>
+          <w:tcPr>
+            <w:tcW w:type="dxa" w:w="2000"/>
+            <w:tcBorders>
+              <w:top w:val="single" w:color="CCCCCC" w:sz="1"/>
+              <w:left w:val="single" w:color="CCCCCC" w:sz="1"/>
+              <w:bottom w:val="single" w:color="CCCCCC" w:sz="1"/>
+              <w:right w:val="single" w:color="CCCCCC" w:sz="1"/>
+            </w:tcBorders>
+            <w:tcMar>
+              <w:top w:type="dxa" w:w="80"/>
+              <w:left w:type="dxa" w:w="120"/>
+              <w:bottom w:type="dxa" w:w="80"/>
+              <w:right w:type="dxa" w:w="120"/>
+            </w:tcMar>
+          </w:tcPr>
+          <w:p>
+            <w:r>
+              <w:t xml:space="preserve">Shape classifier</w:t>
+            </w:r>
+          </w:p>
+        </w:tc>
+        <w:tc>
+          <w:tcPr>
+            <w:tcW w:type="dxa" w:w="3500"/>
+            <w:tcBorders>
+              <w:top w:val="single" w:color="CCCCCC" w:sz="1"/>
+              <w:left w:val="single" w:color="CCCCCC" w:sz="1"/>
+              <w:bottom w:val="single" w:color="CCCCCC" w:sz="1"/>
+              <w:right w:val="single" w:color="CCCCCC" w:sz="1"/>
+            </w:tcBorders>
+            <w:tcMar>
+              <w:top w:type="dxa" w:w="80"/>
+              <w:left w:type="dxa" w:w="120"/>
+              <w:bottom w:type="dxa" w:w="80"/>
+              <w:right w:type="dxa" w:w="120"/>
+            </w:tcMar>
+          </w:tcPr>
+          <w:p>
+            <w:r>
+              <w:t xml:space="preserve">Cross/Triangle/Circle calibration bundle: ported suspicious-nobel fixes + added Square→Cross majority-vote rescue (when ≥2 candidates score Cross≥0.60, flip Square to Cross). Cross/Square→Diamond now requires extent≤0.73. Cross→Square gated on !anyCandidateStronglyCross. Added high-priority Circle rescue (maskOnlyLooksStronglyCircle) and Triangle rescue (asymmetry≥0.90).</w:t>
+            </w:r>
+          </w:p>
+        </w:tc>
+        <w:tc>
+          <w:tcPr>
+            <w:tcW w:type="dxa" w:w="2460"/>
+            <w:tcBorders>
+              <w:top w:val="single" w:color="CCCCCC" w:sz="1"/>
+              <w:left w:val="single" w:color="CCCCCC" w:sz="1"/>
+              <w:bottom w:val="single" w:color="CCCCCC" w:sz="1"/>
+              <w:right w:val="single" w:color="CCCCCC" w:sz="1"/>
+            </w:tcBorders>
+            <w:tcMar>
+              <w:top w:type="dxa" w:w="80"/>
+              <w:left w:type="dxa" w:w="120"/>
+              <w:bottom w:type="dxa" w:w="80"/>
+              <w:right w:type="dxa" w:w="120"/>
+            </w:tcMar>
+          </w:tcPr>
+          <w:p>
+            <w:r>
+              <w:t xml:space="preserve">Landed 2026-04-20 in commit a704edf + follow-up majority-vote rescue. Verified on-device: Cross now classifies as Cross. Archive on next sweep.</w:t>
+            </w:r>
+          </w:p>
+        </w:tc>
+      </w:tr>
+      <w:tr>
+        <w:tc>
+          <w:tcPr>
+            <w:tcW w:type="dxa" w:w="1400"/>
+            <w:tcBorders>
+              <w:top w:val="single" w:color="CCCCCC" w:sz="1"/>
+              <w:left w:val="single" w:color="CCCCCC" w:sz="1"/>
+              <w:bottom w:val="single" w:color="CCCCCC" w:sz="1"/>
+              <w:right w:val="single" w:color="CCCCCC" w:sz="1"/>
+            </w:tcBorders>
             <w:shd w:fill="FFF4CE" w:val="clear"/>
             <w:tcMar>
               <w:top w:type="dxa" w:w="80"/>
@@ -210,7 +499,7 @@
           </w:tcPr>
           <w:p>
             <w:r>
-              <w:t xml:space="preserve">Options menu</w:t>
+              <w:t xml:space="preserve">Shape classifier</w:t>
             </w:r>
           </w:p>
         </w:tc>
@@ -232,7 +521,7 @@
           </w:tcPr>
           <w:p>
             <w:r>
-              <w:t xml:space="preserve">Restore Premium option + test button that was in the options menu</w:t>
+              <w:t xml:space="preserve">Inner cavity mask shows notch at top on Circle — investigate if portrait-removal or pip-cleanup clipping the rim</w:t>
             </w:r>
           </w:p>
         </w:tc>
@@ -254,7 +543,7 @@
           </w:tcPr>
           <w:p>
             <w:r>
-              <w:t xml:space="preserve">Lost in recent rebrand / scaffolding work. Find in git history and reinstate.</w:t>
+              <w:t xml:space="preserve">See shape-classifier-candidate-inner-mask.png from the Apr 20 Circle scan.</w:t>
             </w:r>
           </w:p>
         </w:tc>
@@ -305,7 +594,7 @@
           </w:tcPr>
           <w:p>
             <w:r>
-              <w:t xml:space="preserve">Shape classifier</w:t>
+              <w:t xml:space="preserve">Tooling / debug</w:t>
             </w:r>
           </w:p>
         </w:tc>
@@ -327,7 +616,7 @@
           </w:tcPr>
           <w:p>
             <w:r>
-              <w:t xml:space="preserve">Grievous-Circle: mask-only candidate now scores Circle:0.97 and the override picks it (stronglyRound=true). BUT top-level scoring adds +0.7 to Diamond via shapeDiamondCornerScore=0.92, pushing Diamond (1.02) over Circle (0.97). Find the Diamond corner-bonus stacking step and gate it on !stronglyRound / on winning candidate being mask-only.</w:t>
+              <w:t xml:space="preserve">Pull-debug workflow keeps breaking Claude when large shape PNGs get sampled — add size cap / text-first flow</w:t>
             </w:r>
           </w:p>
         </w:tc>
@@ -349,7 +638,197 @@
           </w:tcPr>
           <w:p>
             <w:r>
-              <w:t xml:space="preserve">Binary-mask portrait erase + mask-only ≥ 0.85 override landed 2026-04-20 19:02. Next: grep for shapeDiamondCornerScore / where final Top1 deviates from candidate Top1 and suppress the corner bonus when the winning candidate has stronglyRound.</w:t>
+              <w:t xml:space="preserve">Shape classifier now writes debug to &lt;getExternalFilesDir&gt;/overlay-debug. Next: update pull_debug.ps1 to always grab the .txt first + downscale PNGs before they land in tools/debug_out/, so Claude never reads raw 100KB+ crops.</w:t>
+            </w:r>
+          </w:p>
+        </w:tc>
+      </w:tr>
+      <w:tr>
+        <w:tc>
+          <w:tcPr>
+            <w:tcW w:type="dxa" w:w="1400"/>
+            <w:tcBorders>
+              <w:top w:val="single" w:color="CCCCCC" w:sz="1"/>
+              <w:left w:val="single" w:color="CCCCCC" w:sz="1"/>
+              <w:bottom w:val="single" w:color="CCCCCC" w:sz="1"/>
+              <w:right w:val="single" w:color="CCCCCC" w:sz="1"/>
+            </w:tcBorders>
+            <w:shd w:fill="D5F0D5" w:val="clear"/>
+            <w:tcMar>
+              <w:top w:type="dxa" w:w="80"/>
+              <w:left w:type="dxa" w:w="120"/>
+              <w:bottom w:type="dxa" w:w="80"/>
+              <w:right w:type="dxa" w:w="120"/>
+            </w:tcMar>
+          </w:tcPr>
+          <w:p>
+            <w:r>
+              <w:rPr>
+                <w:b/>
+                <w:bCs/>
+              </w:rPr>
+              <w:t xml:space="preserve">DONE</w:t>
+            </w:r>
+          </w:p>
+        </w:tc>
+        <w:tc>
+          <w:tcPr>
+            <w:tcW w:type="dxa" w:w="2000"/>
+            <w:tcBorders>
+              <w:top w:val="single" w:color="CCCCCC" w:sz="1"/>
+              <w:left w:val="single" w:color="CCCCCC" w:sz="1"/>
+              <w:bottom w:val="single" w:color="CCCCCC" w:sz="1"/>
+              <w:right w:val="single" w:color="CCCCCC" w:sz="1"/>
+            </w:tcBorders>
+            <w:tcMar>
+              <w:top w:type="dxa" w:w="80"/>
+              <w:left w:type="dxa" w:w="120"/>
+              <w:bottom w:type="dxa" w:w="80"/>
+              <w:right w:type="dxa" w:w="120"/>
+            </w:tcMar>
+          </w:tcPr>
+          <w:p>
+            <w:r>
+              <w:t xml:space="preserve">UI / shape icons</w:t>
+            </w:r>
+          </w:p>
+        </w:tc>
+        <w:tc>
+          <w:tcPr>
+            <w:tcW w:type="dxa" w:w="3500"/>
+            <w:tcBorders>
+              <w:top w:val="single" w:color="CCCCCC" w:sz="1"/>
+              <w:left w:val="single" w:color="CCCCCC" w:sz="1"/>
+              <w:bottom w:val="single" w:color="CCCCCC" w:sz="1"/>
+              <w:right w:val="single" w:color="CCCCCC" w:sz="1"/>
+            </w:tcBorders>
+            <w:tcMar>
+              <w:top w:type="dxa" w:w="80"/>
+              <w:left w:type="dxa" w:w="120"/>
+              <w:bottom w:type="dxa" w:w="80"/>
+              <w:right w:type="dxa" w:w="120"/>
+            </w:tcMar>
+          </w:tcPr>
+          <w:p>
+            <w:r>
+              <w:t xml:space="preserve">Shape icons on Slice/Finder pickers now use assets/shapes PNGs and were bumped 22 → 28</w:t>
+            </w:r>
+          </w:p>
+        </w:tc>
+        <w:tc>
+          <w:tcPr>
+            <w:tcW w:type="dxa" w:w="2460"/>
+            <w:tcBorders>
+              <w:top w:val="single" w:color="CCCCCC" w:sz="1"/>
+              <w:left w:val="single" w:color="CCCCCC" w:sz="1"/>
+              <w:bottom w:val="single" w:color="CCCCCC" w:sz="1"/>
+              <w:right w:val="single" w:color="CCCCCC" w:sz="1"/>
+            </w:tcBorders>
+            <w:tcMar>
+              <w:top w:type="dxa" w:w="80"/>
+              <w:left w:type="dxa" w:w="120"/>
+              <w:bottom w:type="dxa" w:w="80"/>
+              <w:right w:type="dxa" w:w="120"/>
+            </w:tcMar>
+          </w:tcPr>
+          <w:p>
+            <w:r>
+              <w:t xml:space="preserve">ModShapeIcon.js was already wired to assets/shapes/*.png. Bumped size on SliceScreen.js:278 and FinderScreen.js:597. Archive on next sweep.</w:t>
+            </w:r>
+          </w:p>
+        </w:tc>
+      </w:tr>
+      <w:tr>
+        <w:tc>
+          <w:tcPr>
+            <w:tcW w:type="dxa" w:w="1400"/>
+            <w:tcBorders>
+              <w:top w:val="single" w:color="CCCCCC" w:sz="1"/>
+              <w:left w:val="single" w:color="CCCCCC" w:sz="1"/>
+              <w:bottom w:val="single" w:color="CCCCCC" w:sz="1"/>
+              <w:right w:val="single" w:color="CCCCCC" w:sz="1"/>
+            </w:tcBorders>
+            <w:shd w:fill="D5F0D5" w:val="clear"/>
+            <w:tcMar>
+              <w:top w:type="dxa" w:w="80"/>
+              <w:left w:type="dxa" w:w="120"/>
+              <w:bottom w:type="dxa" w:w="80"/>
+              <w:right w:type="dxa" w:w="120"/>
+            </w:tcMar>
+          </w:tcPr>
+          <w:p>
+            <w:r>
+              <w:rPr>
+                <w:b/>
+                <w:bCs/>
+              </w:rPr>
+              <w:t xml:space="preserve">DONE</w:t>
+            </w:r>
+          </w:p>
+        </w:tc>
+        <w:tc>
+          <w:tcPr>
+            <w:tcW w:type="dxa" w:w="2000"/>
+            <w:tcBorders>
+              <w:top w:val="single" w:color="CCCCCC" w:sz="1"/>
+              <w:left w:val="single" w:color="CCCCCC" w:sz="1"/>
+              <w:bottom w:val="single" w:color="CCCCCC" w:sz="1"/>
+              <w:right w:val="single" w:color="CCCCCC" w:sz="1"/>
+            </w:tcBorders>
+            <w:tcMar>
+              <w:top w:type="dxa" w:w="80"/>
+              <w:left w:type="dxa" w:w="120"/>
+              <w:bottom w:type="dxa" w:w="80"/>
+              <w:right w:type="dxa" w:w="120"/>
+            </w:tcMar>
+          </w:tcPr>
+          <w:p>
+            <w:r>
+              <w:t xml:space="preserve">Ally code / privacy</w:t>
+            </w:r>
+          </w:p>
+        </w:tc>
+        <w:tc>
+          <w:tcPr>
+            <w:tcW w:type="dxa" w:w="3500"/>
+            <w:tcBorders>
+              <w:top w:val="single" w:color="CCCCCC" w:sz="1"/>
+              <w:left w:val="single" w:color="CCCCCC" w:sz="1"/>
+              <w:bottom w:val="single" w:color="CCCCCC" w:sz="1"/>
+              <w:right w:val="single" w:color="CCCCCC" w:sz="1"/>
+            </w:tcBorders>
+            <w:tcMar>
+              <w:top w:type="dxa" w:w="80"/>
+              <w:left w:type="dxa" w:w="120"/>
+              <w:bottom w:type="dxa" w:w="80"/>
+              <w:right w:type="dxa" w:w="120"/>
+            </w:tcMar>
+          </w:tcPr>
+          <w:p>
+            <w:r>
+              <w:t xml:space="preserve">AllyCodePanel placeholder changed from the owner’s real ally code to 123-456-789</w:t>
+            </w:r>
+          </w:p>
+        </w:tc>
+        <w:tc>
+          <w:tcPr>
+            <w:tcW w:type="dxa" w:w="2460"/>
+            <w:tcBorders>
+              <w:top w:val="single" w:color="CCCCCC" w:sz="1"/>
+              <w:left w:val="single" w:color="CCCCCC" w:sz="1"/>
+              <w:bottom w:val="single" w:color="CCCCCC" w:sz="1"/>
+              <w:right w:val="single" w:color="CCCCCC" w:sz="1"/>
+            </w:tcBorders>
+            <w:tcMar>
+              <w:top w:type="dxa" w:w="80"/>
+              <w:left w:type="dxa" w:w="120"/>
+              <w:bottom w:type="dxa" w:w="80"/>
+              <w:right w:type="dxa" w:w="120"/>
+            </w:tcMar>
+          </w:tcPr>
+          <w:p>
+            <w:r>
+              <w:t xml:space="preserve">Change captured in the staged diff for AllyCodePanel.js (489-758-819 → 123-456-789). Archive on next sweep.</w:t>
             </w:r>
           </w:p>
         </w:tc>
@@ -400,7 +879,7 @@
           </w:tcPr>
           <w:p>
             <w:r>
-              <w:t xml:space="preserve">Shape classifier</w:t>
+              <w:t xml:space="preserve">Repo hygiene</w:t>
             </w:r>
           </w:p>
         </w:tc>
@@ -422,7 +901,7 @@
           </w:tcPr>
           <w:p>
             <w:r>
-              <w:t xml:space="preserve">Inner cavity mask shows notch at top on Circle — investigate if portrait-removal or pip-cleanup clipping the rim</w:t>
+              <w:t xml:space="preserve">Decide fate of references/mod-source-html/*_files/ (SWGOH.GG webpack bundles)</w:t>
             </w:r>
           </w:p>
         </w:tc>
@@ -444,102 +923,7 @@
           </w:tcPr>
           <w:p>
             <w:r>
-              <w:t xml:space="preserve">See shape-classifier-candidate-inner-mask.png from the Apr 20 Circle scan.</w:t>
-            </w:r>
-          </w:p>
-        </w:tc>
-      </w:tr>
-      <w:tr>
-        <w:tc>
-          <w:tcPr>
-            <w:tcW w:type="dxa" w:w="1400"/>
-            <w:tcBorders>
-              <w:top w:val="single" w:color="CCCCCC" w:sz="1"/>
-              <w:left w:val="single" w:color="CCCCCC" w:sz="1"/>
-              <w:bottom w:val="single" w:color="CCCCCC" w:sz="1"/>
-              <w:right w:val="single" w:color="CCCCCC" w:sz="1"/>
-            </w:tcBorders>
-            <w:shd w:fill="D9E7FF" w:val="clear"/>
-            <w:tcMar>
-              <w:top w:type="dxa" w:w="80"/>
-              <w:left w:type="dxa" w:w="120"/>
-              <w:bottom w:type="dxa" w:w="80"/>
-              <w:right w:type="dxa" w:w="120"/>
-            </w:tcMar>
-          </w:tcPr>
-          <w:p>
-            <w:r>
-              <w:rPr>
-                <w:b/>
-                <w:bCs/>
-              </w:rPr>
-              <w:t xml:space="preserve">IN PROGRESS</w:t>
-            </w:r>
-          </w:p>
-        </w:tc>
-        <w:tc>
-          <w:tcPr>
-            <w:tcW w:type="dxa" w:w="2000"/>
-            <w:tcBorders>
-              <w:top w:val="single" w:color="CCCCCC" w:sz="1"/>
-              <w:left w:val="single" w:color="CCCCCC" w:sz="1"/>
-              <w:bottom w:val="single" w:color="CCCCCC" w:sz="1"/>
-              <w:right w:val="single" w:color="CCCCCC" w:sz="1"/>
-            </w:tcBorders>
-            <w:tcMar>
-              <w:top w:type="dxa" w:w="80"/>
-              <w:left w:type="dxa" w:w="120"/>
-              <w:bottom w:type="dxa" w:w="80"/>
-              <w:right w:type="dxa" w:w="120"/>
-            </w:tcMar>
-          </w:tcPr>
-          <w:p>
-            <w:r>
-              <w:t xml:space="preserve">Tooling / debug</w:t>
-            </w:r>
-          </w:p>
-        </w:tc>
-        <w:tc>
-          <w:tcPr>
-            <w:tcW w:type="dxa" w:w="3500"/>
-            <w:tcBorders>
-              <w:top w:val="single" w:color="CCCCCC" w:sz="1"/>
-              <w:left w:val="single" w:color="CCCCCC" w:sz="1"/>
-              <w:bottom w:val="single" w:color="CCCCCC" w:sz="1"/>
-              <w:right w:val="single" w:color="CCCCCC" w:sz="1"/>
-            </w:tcBorders>
-            <w:tcMar>
-              <w:top w:type="dxa" w:w="80"/>
-              <w:left w:type="dxa" w:w="120"/>
-              <w:bottom w:type="dxa" w:w="80"/>
-              <w:right w:type="dxa" w:w="120"/>
-            </w:tcMar>
-          </w:tcPr>
-          <w:p>
-            <w:r>
-              <w:t xml:space="preserve">Pull-debug workflow keeps breaking Claude when large shape PNGs get sampled — add size cap / text-first flow</w:t>
-            </w:r>
-          </w:p>
-        </w:tc>
-        <w:tc>
-          <w:tcPr>
-            <w:tcW w:type="dxa" w:w="2460"/>
-            <w:tcBorders>
-              <w:top w:val="single" w:color="CCCCCC" w:sz="1"/>
-              <w:left w:val="single" w:color="CCCCCC" w:sz="1"/>
-              <w:bottom w:val="single" w:color="CCCCCC" w:sz="1"/>
-              <w:right w:val="single" w:color="CCCCCC" w:sz="1"/>
-            </w:tcBorders>
-            <w:tcMar>
-              <w:top w:type="dxa" w:w="80"/>
-              <w:left w:type="dxa" w:w="120"/>
-              <w:bottom w:type="dxa" w:w="80"/>
-              <w:right w:type="dxa" w:w="120"/>
-            </w:tcMar>
-          </w:tcPr>
-          <w:p>
-            <w:r>
-              <w:t xml:space="preserve">Shape classifier now writes debug to &lt;getExternalFilesDir&gt;/overlay-debug. Next: update pull_debug.ps1 to always grab the .txt first + downscale PNGs before they land in tools/debug_out/, so Claude never reads raw 100KB+ crops.</w:t>
+              <w:t xml:space="preserve">Carried over from READMEBEFOREEDITING.md follow-ups. Parsers never touch them; deleting would shrink repo meaningfully.</w:t>
             </w:r>
           </w:p>
         </w:tc>
@@ -590,7 +974,7 @@
           </w:tcPr>
           <w:p>
             <w:r>
-              <w:t xml:space="preserve">UI / shape icons</w:t>
+              <w:t xml:space="preserve">Slice screen / layout</w:t>
             </w:r>
           </w:p>
         </w:tc>
@@ -612,7 +996,7 @@
           </w:tcPr>
           <w:p>
             <w:r>
-              <w:t xml:space="preserve">Shape icons on Slice/Finder pickers now use assets/shapes PNGs and were bumped 22 → 28</w:t>
+              <w:t xml:space="preserve">Shrink the Best Character Fit card and place a "Your Characters" card next to it (premium-only)</w:t>
             </w:r>
           </w:p>
         </w:tc>
@@ -634,7 +1018,102 @@
           </w:tcPr>
           <w:p>
             <w:r>
-              <w:t xml:space="preserve">ModShapeIcon.js was already wired to assets/shapes/*.png. Bumped size on SliceScreen.js:278 and FinderScreen.js:597. Archive on next sweep.</w:t>
+              <w:t xml:space="preserve">Two-card row. "Your Characters" populated from ally-code roster; gated behind premium.</w:t>
+            </w:r>
+          </w:p>
+        </w:tc>
+      </w:tr>
+      <w:tr>
+        <w:tc>
+          <w:tcPr>
+            <w:tcW w:type="dxa" w:w="1400"/>
+            <w:tcBorders>
+              <w:top w:val="single" w:color="CCCCCC" w:sz="1"/>
+              <w:left w:val="single" w:color="CCCCCC" w:sz="1"/>
+              <w:bottom w:val="single" w:color="CCCCCC" w:sz="1"/>
+              <w:right w:val="single" w:color="CCCCCC" w:sz="1"/>
+            </w:tcBorders>
+            <w:shd w:fill="FFF4CE" w:val="clear"/>
+            <w:tcMar>
+              <w:top w:type="dxa" w:w="80"/>
+              <w:left w:type="dxa" w:w="120"/>
+              <w:bottom w:type="dxa" w:w="80"/>
+              <w:right w:type="dxa" w:w="120"/>
+            </w:tcMar>
+          </w:tcPr>
+          <w:p>
+            <w:r>
+              <w:rPr>
+                <w:b/>
+                <w:bCs/>
+              </w:rPr>
+              <w:t xml:space="preserve">OPEN</w:t>
+            </w:r>
+          </w:p>
+        </w:tc>
+        <w:tc>
+          <w:tcPr>
+            <w:tcW w:type="dxa" w:w="2000"/>
+            <w:tcBorders>
+              <w:top w:val="single" w:color="CCCCCC" w:sz="1"/>
+              <w:left w:val="single" w:color="CCCCCC" w:sz="1"/>
+              <w:bottom w:val="single" w:color="CCCCCC" w:sz="1"/>
+              <w:right w:val="single" w:color="CCCCCC" w:sz="1"/>
+            </w:tcBorders>
+            <w:tcMar>
+              <w:top w:type="dxa" w:w="80"/>
+              <w:left w:type="dxa" w:w="120"/>
+              <w:bottom w:type="dxa" w:w="80"/>
+              <w:right w:type="dxa" w:w="120"/>
+            </w:tcMar>
+          </w:tcPr>
+          <w:p>
+            <w:r>
+              <w:t xml:space="preserve">Slice screen / suggestions</w:t>
+            </w:r>
+          </w:p>
+        </w:tc>
+        <w:tc>
+          <w:tcPr>
+            <w:tcW w:type="dxa" w:w="3500"/>
+            <w:tcBorders>
+              <w:top w:val="single" w:color="CCCCCC" w:sz="1"/>
+              <w:left w:val="single" w:color="CCCCCC" w:sz="1"/>
+              <w:bottom w:val="single" w:color="CCCCCC" w:sz="1"/>
+              <w:right w:val="single" w:color="CCCCCC" w:sz="1"/>
+            </w:tcBorders>
+            <w:tcMar>
+              <w:top w:type="dxa" w:w="80"/>
+              <w:left w:type="dxa" w:w="120"/>
+              <w:bottom w:type="dxa" w:w="80"/>
+              <w:right w:type="dxa" w:w="120"/>
+            </w:tcMar>
+          </w:tcPr>
+          <w:p>
+            <w:r>
+              <w:t xml:space="preserve">Reduce total number of suggested characters — 140 is too high</w:t>
+            </w:r>
+          </w:p>
+        </w:tc>
+        <w:tc>
+          <w:tcPr>
+            <w:tcW w:type="dxa" w:w="2460"/>
+            <w:tcBorders>
+              <w:top w:val="single" w:color="CCCCCC" w:sz="1"/>
+              <w:left w:val="single" w:color="CCCCCC" w:sz="1"/>
+              <w:bottom w:val="single" w:color="CCCCCC" w:sz="1"/>
+              <w:right w:val="single" w:color="CCCCCC" w:sz="1"/>
+            </w:tcBorders>
+            <w:tcMar>
+              <w:top w:type="dxa" w:w="80"/>
+              <w:left w:type="dxa" w:w="120"/>
+              <w:bottom w:type="dxa" w:w="80"/>
+              <w:right w:type="dxa" w:w="120"/>
+            </w:tcMar>
+          </w:tcPr>
+          <w:p>
+            <w:r>
+              <w:t xml:space="preserve">Pick a sane cap (e.g. top 20–30 by fit score) and sort by best match.</w:t>
             </w:r>
           </w:p>
         </w:tc>
@@ -685,7 +1164,7 @@
           </w:tcPr>
           <w:p>
             <w:r>
-              <w:t xml:space="preserve">Ally code / privacy</w:t>
+              <w:t xml:space="preserve">Slice screen / scoring</w:t>
             </w:r>
           </w:p>
         </w:tc>
@@ -707,7 +1186,7 @@
           </w:tcPr>
           <w:p>
             <w:r>
-              <w:t xml:space="preserve">AllyCodePanel placeholder changed from the owner’s real ally code to 123-456-789</w:t>
+              <w:t xml:space="preserve">Investigate suggestion scoring — likely only comparing set + primary, ignoring secondaries</w:t>
             </w:r>
           </w:p>
         </w:tc>
@@ -729,7 +1208,7 @@
           </w:tcPr>
           <w:p>
             <w:r>
-              <w:t xml:space="preserve">Change captured in the staged diff for AllyCodePanel.js (489-758-819 → 123-456-789). Archive on next sweep.</w:t>
+              <w:t xml:space="preserve">Audit scoring path. Secondaries should weight into fit score; otherwise suggestions are noisy.</w:t>
             </w:r>
           </w:p>
         </w:tc>
@@ -780,7 +1259,7 @@
           </w:tcPr>
           <w:p>
             <w:r>
-              <w:t xml:space="preserve">Repo hygiene</w:t>
+              <w:t xml:space="preserve">Scan performance</w:t>
             </w:r>
           </w:p>
         </w:tc>
@@ -802,7 +1281,7 @@
           </w:tcPr>
           <w:p>
             <w:r>
-              <w:t xml:space="preserve">Decide fate of references/mod-source-html/*_files/ (SWGOH.GG webpack bundles)</w:t>
+              <w:t xml:space="preserve">Increase overall scan speed on the overlay capture flow</w:t>
             </w:r>
           </w:p>
         </w:tc>
@@ -824,7 +1303,7 @@
           </w:tcPr>
           <w:p>
             <w:r>
-              <w:t xml:space="preserve">Carried over from READMEBEFOREEDITING.md follow-ups. Parsers never touch them; deleting would shrink repo meaningfully.</w:t>
+              <w:t xml:space="preserve">Focused/stats/shape/icon/set crops + two classifiers (set + shape) run sequentially per mod. Profile the hot path and see what can be parallelized or cached between mods on the same screen.</w:t>
             </w:r>
           </w:p>
         </w:tc>
@@ -875,7 +1354,7 @@
           </w:tcPr>
           <w:p>
             <w:r>
-              <w:t xml:space="preserve">Slice screen / layout</w:t>
+              <w:t xml:space="preserve">Scan UX</w:t>
             </w:r>
           </w:p>
         </w:tc>
@@ -897,7 +1376,7 @@
           </w:tcPr>
           <w:p>
             <w:r>
-              <w:t xml:space="preserve">Shrink the Best Character Fit card and place a "Your Characters" card next to it (premium-only)</w:t>
+              <w:t xml:space="preserve">First scan-button press is swallowed when the screen was just swapped — user has to click twice</w:t>
             </w:r>
           </w:p>
         </w:tc>
@@ -919,7 +1398,102 @@
           </w:tcPr>
           <w:p>
             <w:r>
-              <w:t xml:space="preserve">Two-card row. "Your Characters" populated from ally-code roster; gated behind premium.</w:t>
+              <w:t xml:space="preserve">FIXED: warmScanner (ACTION_WARM_ONLY) race was tearing the bubble down after MediaProjection grant. Made warm-only never remove an attached bubble. Also cancel the 900ms launchSwgoh retry on AppState=active so swapping back to ModForge doesn’t bounce to SWGOH. Scan-button touch-slop threshold added in ModOverlayCaptureService.</w:t>
+            </w:r>
+          </w:p>
+        </w:tc>
+      </w:tr>
+      <w:tr>
+        <w:tc>
+          <w:tcPr>
+            <w:tcW w:type="dxa" w:w="1400"/>
+            <w:tcBorders>
+              <w:top w:val="single" w:color="CCCCCC" w:sz="1"/>
+              <w:left w:val="single" w:color="CCCCCC" w:sz="1"/>
+              <w:bottom w:val="single" w:color="CCCCCC" w:sz="1"/>
+              <w:right w:val="single" w:color="CCCCCC" w:sz="1"/>
+            </w:tcBorders>
+            <w:shd w:fill="D5F0D5" w:val="clear"/>
+            <w:tcMar>
+              <w:top w:type="dxa" w:w="80"/>
+              <w:left w:type="dxa" w:w="120"/>
+              <w:bottom w:type="dxa" w:w="80"/>
+              <w:right w:type="dxa" w:w="120"/>
+            </w:tcMar>
+          </w:tcPr>
+          <w:p>
+            <w:r>
+              <w:rPr>
+                <w:b/>
+                <w:bCs/>
+              </w:rPr>
+              <w:t xml:space="preserve">DONE</w:t>
+            </w:r>
+          </w:p>
+        </w:tc>
+        <w:tc>
+          <w:tcPr>
+            <w:tcW w:type="dxa" w:w="2000"/>
+            <w:tcBorders>
+              <w:top w:val="single" w:color="CCCCCC" w:sz="1"/>
+              <w:left w:val="single" w:color="CCCCCC" w:sz="1"/>
+              <w:bottom w:val="single" w:color="CCCCCC" w:sz="1"/>
+              <w:right w:val="single" w:color="CCCCCC" w:sz="1"/>
+            </w:tcBorders>
+            <w:tcMar>
+              <w:top w:type="dxa" w:w="80"/>
+              <w:left w:type="dxa" w:w="120"/>
+              <w:bottom w:type="dxa" w:w="80"/>
+              <w:right w:type="dxa" w:w="120"/>
+            </w:tcMar>
+          </w:tcPr>
+          <w:p>
+            <w:r>
+              <w:t xml:space="preserve">Roster / premium</w:t>
+            </w:r>
+          </w:p>
+        </w:tc>
+        <w:tc>
+          <w:tcPr>
+            <w:tcW w:type="dxa" w:w="3500"/>
+            <w:tcBorders>
+              <w:top w:val="single" w:color="CCCCCC" w:sz="1"/>
+              <w:left w:val="single" w:color="CCCCCC" w:sz="1"/>
+              <w:bottom w:val="single" w:color="CCCCCC" w:sz="1"/>
+              <w:right w:val="single" w:color="CCCCCC" w:sz="1"/>
+            </w:tcBorders>
+            <w:tcMar>
+              <w:top w:type="dxa" w:w="80"/>
+              <w:left w:type="dxa" w:w="120"/>
+              <w:bottom w:type="dxa" w:w="80"/>
+              <w:right w:type="dxa" w:w="120"/>
+            </w:tcMar>
+          </w:tcPr>
+          <w:p>
+            <w:r>
+              <w:t xml:space="preserve">Pull user mods via ally code and flag empty slots + upgrade opportunities (premium)</w:t>
+            </w:r>
+          </w:p>
+        </w:tc>
+        <w:tc>
+          <w:tcPr>
+            <w:tcW w:type="dxa" w:w="2460"/>
+            <w:tcBorders>
+              <w:top w:val="single" w:color="CCCCCC" w:sz="1"/>
+              <w:left w:val="single" w:color="CCCCCC" w:sz="1"/>
+              <w:bottom w:val="single" w:color="CCCCCC" w:sz="1"/>
+              <w:right w:val="single" w:color="CCCCCC" w:sz="1"/>
+            </w:tcBorders>
+            <w:tcMar>
+              <w:top w:type="dxa" w:w="80"/>
+              <w:left w:type="dxa" w:w="120"/>
+              <w:bottom w:type="dxa" w:w="80"/>
+              <w:right w:type="dxa" w:w="120"/>
+            </w:tcMar>
+          </w:tcPr>
+          <w:p>
+            <w:r>
+              <w:t xml:space="preserve">DONE: rosterService fetches ?mods=1 and returns per-character missingSlots + upgradeable count (level&lt;15 OR pips&lt;6 OR tier&lt;5). SliceScreen shows “X to upgrade” / missing-slot badges. Slot-level upgrade-vs-scan delta is tracked in the separate Slice-engine slot-badge row.</w:t>
             </w:r>
           </w:p>
         </w:tc>
@@ -970,7 +1544,7 @@
           </w:tcPr>
           <w:p>
             <w:r>
-              <w:t xml:space="preserve">Slice screen / suggestions</w:t>
+              <w:t xml:space="preserve">Shape classifier</w:t>
             </w:r>
           </w:p>
         </w:tc>
@@ -992,7 +1566,7 @@
           </w:tcPr>
           <w:p>
             <w:r>
-              <w:t xml:space="preserve">Reduce total number of suggested characters — 140 is too high</w:t>
+              <w:t xml:space="preserve">Second Circle mod reads as Cross: no candidate view sees a round outline (outer circularity 0.404, mask-only circularity 0.333, extent 0.933, stronglyRound=false)</w:t>
             </w:r>
           </w:p>
         </w:tc>
@@ -1014,7 +1588,7 @@
           </w:tcPr>
           <w:p>
             <w:r>
-              <w:t xml:space="preserve">Pick a sane cap (e.g. top 20–30 by fit score) and sort by best match.</w:t>
+              <w:t xml:space="preserve">Unlike Grievous, this Circle’s mask-only candidate doesn’t see the round outline at all. Hypotheses: (a) capture framing cut off part of the mod, (b) different Circle visual tier/set produces a different silhouette profile. Collect multiple Circle scans (different tiers/sets/primaries) to determine whether new rescue rule is needed or whether it’s a capture artifact.</w:t>
             </w:r>
           </w:p>
         </w:tc>
@@ -1065,7 +1639,7 @@
           </w:tcPr>
           <w:p>
             <w:r>
-              <w:t xml:space="preserve">Slice screen / scoring</w:t>
+              <w:t xml:space="preserve">Branch hygiene</w:t>
             </w:r>
           </w:p>
         </w:tc>
@@ -1087,7 +1661,7 @@
           </w:tcPr>
           <w:p>
             <w:r>
-              <w:t xml:space="preserve">Investigate suggestion scoring — likely only comparing set + primary, ignoring secondaries</w:t>
+              <w:t xml:space="preserve">Consolidate stale Claude branches: claude/inspiring-khorana-78c3aa, claude/strange-williams-65919b, claude/suspicious-nobel-1ad793, claude/vibrant-morse-0c5795, wip/shape-classifier</w:t>
             </w:r>
           </w:p>
         </w:tc>
@@ -1109,7 +1683,7 @@
           </w:tcPr>
           <w:p>
             <w:r>
-              <w:t xml:space="preserve">Audit scoring path. Secondaries should weight into fit score; otherwise suggestions are noisy.</w:t>
+              <w:t xml:space="preserve">Suspicious-nobel held the Cross/Triangle calibration work which we’ve now ported into friendly-stonebraker. Once committed to main, delete the local+remote suspicious-nobel branch and audit the other claude/* branches for any uncommitted fixes worth rescuing.</w:t>
             </w:r>
           </w:p>
         </w:tc>
@@ -1160,7 +1734,7 @@
           </w:tcPr>
           <w:p>
             <w:r>
-              <w:t xml:space="preserve">Scan performance</w:t>
+              <w:t xml:space="preserve">Launch / privacy</w:t>
             </w:r>
           </w:p>
         </w:tc>
@@ -1182,7 +1756,7 @@
           </w:tcPr>
           <w:p>
             <w:r>
-              <w:t xml:space="preserve">Increase overall scan speed on the overlay capture flow</w:t>
+              <w:t xml:space="preserve">Host privacy_policy at a public URL (GitHub Pages) and link it in the Play Console listing + in-app Settings</w:t>
             </w:r>
           </w:p>
         </w:tc>
@@ -1204,7 +1778,7 @@
           </w:tcPr>
           <w:p>
             <w:r>
-              <w:t xml:space="preserve">Focused/stats/shape/icon/set crops + two classifiers (set + shape) run sequentially per mod. Profile the hot path and see what can be parallelized or cached between mods on the same screen.</w:t>
+              <w:t xml:space="preserve">File exists in repo at my-app/privacy_policy but isn’t live anywhere. Required for Play submission because the app uses SYSTEM_ALERT_WINDOW + screen capture. Policy must cover: screen-content capture, what’s processed (mod shape/stat data), what’s stored (local only), what’s transmitted (none), retention/deletion.</w:t>
             </w:r>
           </w:p>
         </w:tc>
@@ -1255,7 +1829,7 @@
           </w:tcPr>
           <w:p>
             <w:r>
-              <w:t xml:space="preserve">Scan UX</w:t>
+              <w:t xml:space="preserve">Launch / Play Console</w:t>
             </w:r>
           </w:p>
         </w:tc>
@@ -1277,7 +1851,7 @@
           </w:tcPr>
           <w:p>
             <w:r>
-              <w:t xml:space="preserve">First scan-button press is swallowed when the screen was just swapped — user has to click twice</w:t>
+              <w:t xml:space="preserve">Fill Sensitive Permissions declaration for SYSTEM_ALERT_WINDOW</w:t>
             </w:r>
           </w:p>
         </w:tc>
@@ -1299,7 +1873,767 @@
           </w:tcPr>
           <w:p>
             <w:r>
-              <w:t xml:space="preserve">Likely the overlay/capture service isn’t fully bound when the first tap lands. Check listener wiring in ModOverlayCaptureService / CaptureScreen so the first tap either queues until ready or the button stays disabled until bind completes.</w:t>
+              <w:t xml:space="preserve">Core functionality: overlay button over SWGOH to scan the user’s own mod inventory. User benefit: catalog mods without manual typing. Why no alternative: user must interact with game while app is visible — impossible without overlay. Play Console blocks the upload until this form is completed.</w:t>
+            </w:r>
+          </w:p>
+        </w:tc>
+      </w:tr>
+      <w:tr>
+        <w:tc>
+          <w:tcPr>
+            <w:tcW w:type="dxa" w:w="1400"/>
+            <w:tcBorders>
+              <w:top w:val="single" w:color="CCCCCC" w:sz="1"/>
+              <w:left w:val="single" w:color="CCCCCC" w:sz="1"/>
+              <w:bottom w:val="single" w:color="CCCCCC" w:sz="1"/>
+              <w:right w:val="single" w:color="CCCCCC" w:sz="1"/>
+            </w:tcBorders>
+            <w:shd w:fill="FFF4CE" w:val="clear"/>
+            <w:tcMar>
+              <w:top w:type="dxa" w:w="80"/>
+              <w:left w:type="dxa" w:w="120"/>
+              <w:bottom w:type="dxa" w:w="80"/>
+              <w:right w:type="dxa" w:w="120"/>
+            </w:tcMar>
+          </w:tcPr>
+          <w:p>
+            <w:r>
+              <w:rPr>
+                <w:b/>
+                <w:bCs/>
+              </w:rPr>
+              <w:t xml:space="preserve">OPEN</w:t>
+            </w:r>
+          </w:p>
+        </w:tc>
+        <w:tc>
+          <w:tcPr>
+            <w:tcW w:type="dxa" w:w="2000"/>
+            <w:tcBorders>
+              <w:top w:val="single" w:color="CCCCCC" w:sz="1"/>
+              <w:left w:val="single" w:color="CCCCCC" w:sz="1"/>
+              <w:bottom w:val="single" w:color="CCCCCC" w:sz="1"/>
+              <w:right w:val="single" w:color="CCCCCC" w:sz="1"/>
+            </w:tcBorders>
+            <w:tcMar>
+              <w:top w:type="dxa" w:w="80"/>
+              <w:left w:type="dxa" w:w="120"/>
+              <w:bottom w:type="dxa" w:w="80"/>
+              <w:right w:type="dxa" w:w="120"/>
+            </w:tcMar>
+          </w:tcPr>
+          <w:p>
+            <w:r>
+              <w:t xml:space="preserve">Launch / permissions UX</w:t>
+            </w:r>
+          </w:p>
+        </w:tc>
+        <w:tc>
+          <w:tcPr>
+            <w:tcW w:type="dxa" w:w="3500"/>
+            <w:tcBorders>
+              <w:top w:val="single" w:color="CCCCCC" w:sz="1"/>
+              <w:left w:val="single" w:color="CCCCCC" w:sz="1"/>
+              <w:bottom w:val="single" w:color="CCCCCC" w:sz="1"/>
+              <w:right w:val="single" w:color="CCCCCC" w:sz="1"/>
+            </w:tcBorders>
+            <w:tcMar>
+              <w:top w:type="dxa" w:w="80"/>
+              <w:left w:type="dxa" w:w="120"/>
+              <w:bottom w:type="dxa" w:w="80"/>
+              <w:right w:type="dxa" w:w="120"/>
+            </w:tcMar>
+          </w:tcPr>
+          <w:p>
+            <w:r>
+              <w:t xml:space="preserve">Show in-app rationale dialog BEFORE opening Settings.ACTION_MANAGE_OVERLAY_PERMISSION</w:t>
+            </w:r>
+          </w:p>
+        </w:tc>
+        <w:tc>
+          <w:tcPr>
+            <w:tcW w:type="dxa" w:w="2460"/>
+            <w:tcBorders>
+              <w:top w:val="single" w:color="CCCCCC" w:sz="1"/>
+              <w:left w:val="single" w:color="CCCCCC" w:sz="1"/>
+              <w:bottom w:val="single" w:color="CCCCCC" w:sz="1"/>
+              <w:right w:val="single" w:color="CCCCCC" w:sz="1"/>
+            </w:tcBorders>
+            <w:tcMar>
+              <w:top w:type="dxa" w:w="80"/>
+              <w:left w:type="dxa" w:w="120"/>
+              <w:bottom w:type="dxa" w:w="80"/>
+              <w:right w:type="dxa" w:w="120"/>
+            </w:tcMar>
+          </w:tcPr>
+          <w:p>
+            <w:r>
+              <w:t xml:space="preserve">Play reviewers actively test for this. Alert must explain: the app draws a small scan button over other apps, does NOT read other apps’ content, does NOT simulate input, only captures screen when user taps the button. Apps that jump straight to the system dialog get rejected. Same treatment needed before the MediaProjection consent dialog.</w:t>
+            </w:r>
+          </w:p>
+        </w:tc>
+      </w:tr>
+      <w:tr>
+        <w:tc>
+          <w:tcPr>
+            <w:tcW w:type="dxa" w:w="1400"/>
+            <w:tcBorders>
+              <w:top w:val="single" w:color="CCCCCC" w:sz="1"/>
+              <w:left w:val="single" w:color="CCCCCC" w:sz="1"/>
+              <w:bottom w:val="single" w:color="CCCCCC" w:sz="1"/>
+              <w:right w:val="single" w:color="CCCCCC" w:sz="1"/>
+            </w:tcBorders>
+            <w:shd w:fill="FFF4CE" w:val="clear"/>
+            <w:tcMar>
+              <w:top w:type="dxa" w:w="80"/>
+              <w:left w:type="dxa" w:w="120"/>
+              <w:bottom w:type="dxa" w:w="80"/>
+              <w:right w:type="dxa" w:w="120"/>
+            </w:tcMar>
+          </w:tcPr>
+          <w:p>
+            <w:r>
+              <w:rPr>
+                <w:b/>
+                <w:bCs/>
+              </w:rPr>
+              <w:t xml:space="preserve">OPEN</w:t>
+            </w:r>
+          </w:p>
+        </w:tc>
+        <w:tc>
+          <w:tcPr>
+            <w:tcW w:type="dxa" w:w="2000"/>
+            <w:tcBorders>
+              <w:top w:val="single" w:color="CCCCCC" w:sz="1"/>
+              <w:left w:val="single" w:color="CCCCCC" w:sz="1"/>
+              <w:bottom w:val="single" w:color="CCCCCC" w:sz="1"/>
+              <w:right w:val="single" w:color="CCCCCC" w:sz="1"/>
+            </w:tcBorders>
+            <w:tcMar>
+              <w:top w:type="dxa" w:w="80"/>
+              <w:left w:type="dxa" w:w="120"/>
+              <w:bottom w:type="dxa" w:w="80"/>
+              <w:right w:type="dxa" w:w="120"/>
+            </w:tcMar>
+          </w:tcPr>
+          <w:p>
+            <w:r>
+              <w:t xml:space="preserve">Launch / Play Console</w:t>
+            </w:r>
+          </w:p>
+        </w:tc>
+        <w:tc>
+          <w:tcPr>
+            <w:tcW w:type="dxa" w:w="3500"/>
+            <w:tcBorders>
+              <w:top w:val="single" w:color="CCCCCC" w:sz="1"/>
+              <w:left w:val="single" w:color="CCCCCC" w:sz="1"/>
+              <w:bottom w:val="single" w:color="CCCCCC" w:sz="1"/>
+              <w:right w:val="single" w:color="CCCCCC" w:sz="1"/>
+            </w:tcBorders>
+            <w:tcMar>
+              <w:top w:type="dxa" w:w="80"/>
+              <w:left w:type="dxa" w:w="120"/>
+              <w:bottom w:type="dxa" w:w="80"/>
+              <w:right w:type="dxa" w:w="120"/>
+            </w:tcMar>
+          </w:tcPr>
+          <w:p>
+            <w:r>
+              <w:t xml:space="preserve">Complete Data Safety form: be honest about screen capture + local mod storage</w:t>
+            </w:r>
+          </w:p>
+        </w:tc>
+        <w:tc>
+          <w:tcPr>
+            <w:tcW w:type="dxa" w:w="2460"/>
+            <w:tcBorders>
+              <w:top w:val="single" w:color="CCCCCC" w:sz="1"/>
+              <w:left w:val="single" w:color="CCCCCC" w:sz="1"/>
+              <w:bottom w:val="single" w:color="CCCCCC" w:sz="1"/>
+              <w:right w:val="single" w:color="CCCCCC" w:sz="1"/>
+            </w:tcBorders>
+            <w:tcMar>
+              <w:top w:type="dxa" w:w="80"/>
+              <w:left w:type="dxa" w:w="120"/>
+              <w:bottom w:type="dxa" w:w="80"/>
+              <w:right w:type="dxa" w:w="120"/>
+            </w:tcMar>
+          </w:tcPr>
+          <w:p>
+            <w:r>
+              <w:t xml:space="preserve">Data collected = "App activity" (scanned mod data stored locally); shared = None; security = user can delete data. Google audits and pulls apps that misrepresent. Description must explicitly acknowledge screen capture to match this form.</w:t>
+            </w:r>
+          </w:p>
+        </w:tc>
+      </w:tr>
+      <w:tr>
+        <w:tc>
+          <w:tcPr>
+            <w:tcW w:type="dxa" w:w="1400"/>
+            <w:tcBorders>
+              <w:top w:val="single" w:color="CCCCCC" w:sz="1"/>
+              <w:left w:val="single" w:color="CCCCCC" w:sz="1"/>
+              <w:bottom w:val="single" w:color="CCCCCC" w:sz="1"/>
+              <w:right w:val="single" w:color="CCCCCC" w:sz="1"/>
+            </w:tcBorders>
+            <w:shd w:fill="FFF4CE" w:val="clear"/>
+            <w:tcMar>
+              <w:top w:type="dxa" w:w="80"/>
+              <w:left w:type="dxa" w:w="120"/>
+              <w:bottom w:type="dxa" w:w="80"/>
+              <w:right w:type="dxa" w:w="120"/>
+            </w:tcMar>
+          </w:tcPr>
+          <w:p>
+            <w:r>
+              <w:rPr>
+                <w:b/>
+                <w:bCs/>
+              </w:rPr>
+              <w:t xml:space="preserve">OPEN</w:t>
+            </w:r>
+          </w:p>
+        </w:tc>
+        <w:tc>
+          <w:tcPr>
+            <w:tcW w:type="dxa" w:w="2000"/>
+            <w:tcBorders>
+              <w:top w:val="single" w:color="CCCCCC" w:sz="1"/>
+              <w:left w:val="single" w:color="CCCCCC" w:sz="1"/>
+              <w:bottom w:val="single" w:color="CCCCCC" w:sz="1"/>
+              <w:right w:val="single" w:color="CCCCCC" w:sz="1"/>
+            </w:tcBorders>
+            <w:tcMar>
+              <w:top w:type="dxa" w:w="80"/>
+              <w:left w:type="dxa" w:w="120"/>
+              <w:bottom w:type="dxa" w:w="80"/>
+              <w:right w:type="dxa" w:w="120"/>
+            </w:tcMar>
+          </w:tcPr>
+          <w:p>
+            <w:r>
+              <w:t xml:space="preserve">Launch / manifest</w:t>
+            </w:r>
+          </w:p>
+        </w:tc>
+        <w:tc>
+          <w:tcPr>
+            <w:tcW w:type="dxa" w:w="3500"/>
+            <w:tcBorders>
+              <w:top w:val="single" w:color="CCCCCC" w:sz="1"/>
+              <w:left w:val="single" w:color="CCCCCC" w:sz="1"/>
+              <w:bottom w:val="single" w:color="CCCCCC" w:sz="1"/>
+              <w:right w:val="single" w:color="CCCCCC" w:sz="1"/>
+            </w:tcBorders>
+            <w:tcMar>
+              <w:top w:type="dxa" w:w="80"/>
+              <w:left w:type="dxa" w:w="120"/>
+              <w:bottom w:type="dxa" w:w="80"/>
+              <w:right w:type="dxa" w:w="120"/>
+            </w:tcMar>
+          </w:tcPr>
+          <w:p>
+            <w:r>
+              <w:t xml:space="preserve">Declare FOREGROUND_SERVICE + FOREGROUND_SERVICE_MEDIA_PROJECTION and mark the overlay/capture service with android:foregroundServiceType="mediaProjection"</w:t>
+            </w:r>
+          </w:p>
+        </w:tc>
+        <w:tc>
+          <w:tcPr>
+            <w:tcW w:type="dxa" w:w="2460"/>
+            <w:tcBorders>
+              <w:top w:val="single" w:color="CCCCCC" w:sz="1"/>
+              <w:left w:val="single" w:color="CCCCCC" w:sz="1"/>
+              <w:bottom w:val="single" w:color="CCCCCC" w:sz="1"/>
+              <w:right w:val="single" w:color="CCCCCC" w:sz="1"/>
+            </w:tcBorders>
+            <w:tcMar>
+              <w:top w:type="dxa" w:w="80"/>
+              <w:left w:type="dxa" w:w="120"/>
+              <w:bottom w:type="dxa" w:w="80"/>
+              <w:right w:type="dxa" w:w="120"/>
+            </w:tcMar>
+          </w:tcPr>
+          <w:p>
+            <w:r>
+              <w:t xml:space="preserve">Android 14+ requires this pair for screen-capture foreground services. Separate Play Console declaration under App content → Foreground services also required with justification.</w:t>
+            </w:r>
+          </w:p>
+        </w:tc>
+      </w:tr>
+      <w:tr>
+        <w:tc>
+          <w:tcPr>
+            <w:tcW w:type="dxa" w:w="1400"/>
+            <w:tcBorders>
+              <w:top w:val="single" w:color="CCCCCC" w:sz="1"/>
+              <w:left w:val="single" w:color="CCCCCC" w:sz="1"/>
+              <w:bottom w:val="single" w:color="CCCCCC" w:sz="1"/>
+              <w:right w:val="single" w:color="CCCCCC" w:sz="1"/>
+            </w:tcBorders>
+            <w:shd w:fill="FFF4CE" w:val="clear"/>
+            <w:tcMar>
+              <w:top w:type="dxa" w:w="80"/>
+              <w:left w:type="dxa" w:w="120"/>
+              <w:bottom w:type="dxa" w:w="80"/>
+              <w:right w:type="dxa" w:w="120"/>
+            </w:tcMar>
+          </w:tcPr>
+          <w:p>
+            <w:r>
+              <w:rPr>
+                <w:b/>
+                <w:bCs/>
+              </w:rPr>
+              <w:t xml:space="preserve">OPEN</w:t>
+            </w:r>
+          </w:p>
+        </w:tc>
+        <w:tc>
+          <w:tcPr>
+            <w:tcW w:type="dxa" w:w="2000"/>
+            <w:tcBorders>
+              <w:top w:val="single" w:color="CCCCCC" w:sz="1"/>
+              <w:left w:val="single" w:color="CCCCCC" w:sz="1"/>
+              <w:bottom w:val="single" w:color="CCCCCC" w:sz="1"/>
+              <w:right w:val="single" w:color="CCCCCC" w:sz="1"/>
+            </w:tcBorders>
+            <w:tcMar>
+              <w:top w:type="dxa" w:w="80"/>
+              <w:left w:type="dxa" w:w="120"/>
+              <w:bottom w:type="dxa" w:w="80"/>
+              <w:right w:type="dxa" w:w="120"/>
+            </w:tcMar>
+          </w:tcPr>
+          <w:p>
+            <w:r>
+              <w:t xml:space="preserve">Launch / listing copy</w:t>
+            </w:r>
+          </w:p>
+        </w:tc>
+        <w:tc>
+          <w:tcPr>
+            <w:tcW w:type="dxa" w:w="3500"/>
+            <w:tcBorders>
+              <w:top w:val="single" w:color="CCCCCC" w:sz="1"/>
+              <w:left w:val="single" w:color="CCCCCC" w:sz="1"/>
+              <w:bottom w:val="single" w:color="CCCCCC" w:sz="1"/>
+              <w:right w:val="single" w:color="CCCCCC" w:sz="1"/>
+            </w:tcBorders>
+            <w:tcMar>
+              <w:top w:type="dxa" w:w="80"/>
+              <w:left w:type="dxa" w:w="120"/>
+              <w:bottom w:type="dxa" w:w="80"/>
+              <w:right w:type="dxa" w:w="120"/>
+            </w:tcMar>
+          </w:tcPr>
+          <w:p>
+            <w:r>
+              <w:t xml:space="preserve">Play Store description must explicitly include: "Companion app for Star Wars: Galaxy of Heroes", "Not affiliated with or endorsed by Electronic Arts, Capital Games, or Lucasfilm", "Uses overlay permission to display a scan button over the game", "No automation — passive screen reading only"</w:t>
+            </w:r>
+          </w:p>
+        </w:tc>
+        <w:tc>
+          <w:tcPr>
+            <w:tcW w:type="dxa" w:w="2460"/>
+            <w:tcBorders>
+              <w:top w:val="single" w:color="CCCCCC" w:sz="1"/>
+              <w:left w:val="single" w:color="CCCCCC" w:sz="1"/>
+              <w:bottom w:val="single" w:color="CCCCCC" w:sz="1"/>
+              <w:right w:val="single" w:color="CCCCCC" w:sz="1"/>
+            </w:tcBorders>
+            <w:tcMar>
+              <w:top w:type="dxa" w:w="80"/>
+              <w:left w:type="dxa" w:w="120"/>
+              <w:bottom w:type="dxa" w:w="80"/>
+              <w:right w:type="dxa" w:w="120"/>
+            </w:tcMar>
+          </w:tcPr>
+          <w:p>
+            <w:r>
+              <w:t xml:space="preserve">Reviewers look for the bolded language. Missing the "no automation" disclaimer is a common rejection trigger.</w:t>
+            </w:r>
+          </w:p>
+        </w:tc>
+      </w:tr>
+      <w:tr>
+        <w:tc>
+          <w:tcPr>
+            <w:tcW w:type="dxa" w:w="1400"/>
+            <w:tcBorders>
+              <w:top w:val="single" w:color="CCCCCC" w:sz="1"/>
+              <w:left w:val="single" w:color="CCCCCC" w:sz="1"/>
+              <w:bottom w:val="single" w:color="CCCCCC" w:sz="1"/>
+              <w:right w:val="single" w:color="CCCCCC" w:sz="1"/>
+            </w:tcBorders>
+            <w:shd w:fill="FFF4CE" w:val="clear"/>
+            <w:tcMar>
+              <w:top w:type="dxa" w:w="80"/>
+              <w:left w:type="dxa" w:w="120"/>
+              <w:bottom w:type="dxa" w:w="80"/>
+              <w:right w:type="dxa" w:w="120"/>
+            </w:tcMar>
+          </w:tcPr>
+          <w:p>
+            <w:r>
+              <w:rPr>
+                <w:b/>
+                <w:bCs/>
+              </w:rPr>
+              <w:t xml:space="preserve">OPEN</w:t>
+            </w:r>
+          </w:p>
+        </w:tc>
+        <w:tc>
+          <w:tcPr>
+            <w:tcW w:type="dxa" w:w="2000"/>
+            <w:tcBorders>
+              <w:top w:val="single" w:color="CCCCCC" w:sz="1"/>
+              <w:left w:val="single" w:color="CCCCCC" w:sz="1"/>
+              <w:bottom w:val="single" w:color="CCCCCC" w:sz="1"/>
+              <w:right w:val="single" w:color="CCCCCC" w:sz="1"/>
+            </w:tcBorders>
+            <w:tcMar>
+              <w:top w:type="dxa" w:w="80"/>
+              <w:left w:type="dxa" w:w="120"/>
+              <w:bottom w:type="dxa" w:w="80"/>
+              <w:right w:type="dxa" w:w="120"/>
+            </w:tcMar>
+          </w:tcPr>
+          <w:p>
+            <w:r>
+              <w:t xml:space="preserve">Launch / demo video</w:t>
+            </w:r>
+          </w:p>
+        </w:tc>
+        <w:tc>
+          <w:tcPr>
+            <w:tcW w:type="dxa" w:w="3500"/>
+            <w:tcBorders>
+              <w:top w:val="single" w:color="CCCCCC" w:sz="1"/>
+              <w:left w:val="single" w:color="CCCCCC" w:sz="1"/>
+              <w:bottom w:val="single" w:color="CCCCCC" w:sz="1"/>
+              <w:right w:val="single" w:color="CCCCCC" w:sz="1"/>
+            </w:tcBorders>
+            <w:tcMar>
+              <w:top w:type="dxa" w:w="80"/>
+              <w:left w:type="dxa" w:w="120"/>
+              <w:bottom w:type="dxa" w:w="80"/>
+              <w:right w:type="dxa" w:w="120"/>
+            </w:tcMar>
+          </w:tcPr>
+          <w:p>
+            <w:r>
+              <w:t xml:space="preserve">Record ~60s screen recording for Play Console: app open → permission prompts → user grants → overlay appears over SWGOH → scan works → overlay dismissed</w:t>
+            </w:r>
+          </w:p>
+        </w:tc>
+        <w:tc>
+          <w:tcPr>
+            <w:tcW w:type="dxa" w:w="2460"/>
+            <w:tcBorders>
+              <w:top w:val="single" w:color="CCCCCC" w:sz="1"/>
+              <w:left w:val="single" w:color="CCCCCC" w:sz="1"/>
+              <w:bottom w:val="single" w:color="CCCCCC" w:sz="1"/>
+              <w:right w:val="single" w:color="CCCCCC" w:sz="1"/>
+            </w:tcBorders>
+            <w:tcMar>
+              <w:top w:type="dxa" w:w="80"/>
+              <w:left w:type="dxa" w:w="120"/>
+              <w:bottom w:type="dxa" w:w="80"/>
+              <w:right w:type="dxa" w:w="120"/>
+            </w:tcMar>
+          </w:tcPr>
+          <w:p>
+            <w:r>
+              <w:t xml:space="preserve">Frequently requested for overlay + screen-capture apps. Have it ready before first submission rather than reactively after a rejection.</w:t>
+            </w:r>
+          </w:p>
+        </w:tc>
+      </w:tr>
+      <w:tr>
+        <w:tc>
+          <w:tcPr>
+            <w:tcW w:type="dxa" w:w="1400"/>
+            <w:tcBorders>
+              <w:top w:val="single" w:color="CCCCCC" w:sz="1"/>
+              <w:left w:val="single" w:color="CCCCCC" w:sz="1"/>
+              <w:bottom w:val="single" w:color="CCCCCC" w:sz="1"/>
+              <w:right w:val="single" w:color="CCCCCC" w:sz="1"/>
+            </w:tcBorders>
+            <w:shd w:fill="FFF4CE" w:val="clear"/>
+            <w:tcMar>
+              <w:top w:type="dxa" w:w="80"/>
+              <w:left w:type="dxa" w:w="120"/>
+              <w:bottom w:type="dxa" w:w="80"/>
+              <w:right w:type="dxa" w:w="120"/>
+            </w:tcMar>
+          </w:tcPr>
+          <w:p>
+            <w:r>
+              <w:rPr>
+                <w:b/>
+                <w:bCs/>
+              </w:rPr>
+              <w:t xml:space="preserve">OPEN</w:t>
+            </w:r>
+          </w:p>
+        </w:tc>
+        <w:tc>
+          <w:tcPr>
+            <w:tcW w:type="dxa" w:w="2000"/>
+            <w:tcBorders>
+              <w:top w:val="single" w:color="CCCCCC" w:sz="1"/>
+              <w:left w:val="single" w:color="CCCCCC" w:sz="1"/>
+              <w:bottom w:val="single" w:color="CCCCCC" w:sz="1"/>
+              <w:right w:val="single" w:color="CCCCCC" w:sz="1"/>
+            </w:tcBorders>
+            <w:tcMar>
+              <w:top w:type="dxa" w:w="80"/>
+              <w:left w:type="dxa" w:w="120"/>
+              <w:bottom w:type="dxa" w:w="80"/>
+              <w:right w:type="dxa" w:w="120"/>
+            </w:tcMar>
+          </w:tcPr>
+          <w:p>
+            <w:r>
+              <w:t xml:space="preserve">Launch / rollout</w:t>
+            </w:r>
+          </w:p>
+        </w:tc>
+        <w:tc>
+          <w:tcPr>
+            <w:tcW w:type="dxa" w:w="3500"/>
+            <w:tcBorders>
+              <w:top w:val="single" w:color="CCCCCC" w:sz="1"/>
+              <w:left w:val="single" w:color="CCCCCC" w:sz="1"/>
+              <w:bottom w:val="single" w:color="CCCCCC" w:sz="1"/>
+              <w:right w:val="single" w:color="CCCCCC" w:sz="1"/>
+            </w:tcBorders>
+            <w:tcMar>
+              <w:top w:type="dxa" w:w="80"/>
+              <w:left w:type="dxa" w:w="120"/>
+              <w:bottom w:type="dxa" w:w="80"/>
+              <w:right w:type="dxa" w:w="120"/>
+            </w:tcMar>
+          </w:tcPr>
+          <w:p>
+            <w:r>
+              <w:t xml:space="preserve">Submit to Internal Testing track first (not Production) and iterate through Closed → Open → Production</w:t>
+            </w:r>
+          </w:p>
+        </w:tc>
+        <w:tc>
+          <w:tcPr>
+            <w:tcW w:type="dxa" w:w="2460"/>
+            <w:tcBorders>
+              <w:top w:val="single" w:color="CCCCCC" w:sz="1"/>
+              <w:left w:val="single" w:color="CCCCCC" w:sz="1"/>
+              <w:bottom w:val="single" w:color="CCCCCC" w:sz="1"/>
+              <w:right w:val="single" w:color="CCCCCC" w:sz="1"/>
+            </w:tcBorders>
+            <w:tcMar>
+              <w:top w:type="dxa" w:w="80"/>
+              <w:left w:type="dxa" w:w="120"/>
+              <w:bottom w:type="dxa" w:w="80"/>
+              <w:right w:type="dxa" w:w="120"/>
+            </w:tcMar>
+          </w:tcPr>
+          <w:p>
+            <w:r>
+              <w:t xml:space="preserve">Internal Testing has lighter review. Most overlay apps need 2–3 submissions before passing. If rejected, fix per the email and resubmit — do not appeal.</w:t>
+            </w:r>
+          </w:p>
+        </w:tc>
+      </w:tr>
+      <w:tr>
+        <w:tc>
+          <w:tcPr>
+            <w:tcW w:type="dxa" w:w="1400"/>
+            <w:tcBorders>
+              <w:top w:val="single" w:color="CCCCCC" w:sz="1"/>
+              <w:left w:val="single" w:color="CCCCCC" w:sz="1"/>
+              <w:bottom w:val="single" w:color="CCCCCC" w:sz="1"/>
+              <w:right w:val="single" w:color="CCCCCC" w:sz="1"/>
+            </w:tcBorders>
+            <w:shd w:fill="FFF4CE" w:val="clear"/>
+            <w:tcMar>
+              <w:top w:type="dxa" w:w="80"/>
+              <w:left w:type="dxa" w:w="120"/>
+              <w:bottom w:type="dxa" w:w="80"/>
+              <w:right w:type="dxa" w:w="120"/>
+            </w:tcMar>
+          </w:tcPr>
+          <w:p>
+            <w:r>
+              <w:rPr>
+                <w:b/>
+                <w:bCs/>
+              </w:rPr>
+              <w:t xml:space="preserve">OPEN</w:t>
+            </w:r>
+          </w:p>
+        </w:tc>
+        <w:tc>
+          <w:tcPr>
+            <w:tcW w:type="dxa" w:w="2000"/>
+            <w:tcBorders>
+              <w:top w:val="single" w:color="CCCCCC" w:sz="1"/>
+              <w:left w:val="single" w:color="CCCCCC" w:sz="1"/>
+              <w:bottom w:val="single" w:color="CCCCCC" w:sz="1"/>
+              <w:right w:val="single" w:color="CCCCCC" w:sz="1"/>
+            </w:tcBorders>
+            <w:tcMar>
+              <w:top w:type="dxa" w:w="80"/>
+              <w:left w:type="dxa" w:w="120"/>
+              <w:bottom w:type="dxa" w:w="80"/>
+              <w:right w:type="dxa" w:w="120"/>
+            </w:tcMar>
+          </w:tcPr>
+          <w:p>
+            <w:r>
+              <w:t xml:space="preserve">Monetization</w:t>
+            </w:r>
+          </w:p>
+        </w:tc>
+        <w:tc>
+          <w:tcPr>
+            <w:tcW w:type="dxa" w:w="3500"/>
+            <w:tcBorders>
+              <w:top w:val="single" w:color="CCCCCC" w:sz="1"/>
+              <w:left w:val="single" w:color="CCCCCC" w:sz="1"/>
+              <w:bottom w:val="single" w:color="CCCCCC" w:sz="1"/>
+              <w:right w:val="single" w:color="CCCCCC" w:sz="1"/>
+            </w:tcBorders>
+            <w:tcMar>
+              <w:top w:type="dxa" w:w="80"/>
+              <w:left w:type="dxa" w:w="120"/>
+              <w:bottom w:type="dxa" w:w="80"/>
+              <w:right w:type="dxa" w:w="120"/>
+            </w:tcMar>
+          </w:tcPr>
+          <w:p>
+            <w:r>
+              <w:t xml:space="preserve">Swap AdMob test IDs for real production unit IDs before submitting to Play</w:t>
+            </w:r>
+          </w:p>
+        </w:tc>
+        <w:tc>
+          <w:tcPr>
+            <w:tcW w:type="dxa" w:w="2460"/>
+            <w:tcBorders>
+              <w:top w:val="single" w:color="CCCCCC" w:sz="1"/>
+              <w:left w:val="single" w:color="CCCCCC" w:sz="1"/>
+              <w:bottom w:val="single" w:color="CCCCCC" w:sz="1"/>
+              <w:right w:val="single" w:color="CCCCCC" w:sz="1"/>
+            </w:tcBorders>
+            <w:tcMar>
+              <w:top w:type="dxa" w:w="80"/>
+              <w:left w:type="dxa" w:w="120"/>
+              <w:bottom w:type="dxa" w:w="80"/>
+              <w:right w:type="dxa" w:w="120"/>
+            </w:tcMar>
+          </w:tcPr>
+          <w:p>
+            <w:r>
+              <w:t xml:space="preserve">Carried over from prior launch-prep notes. Real ad unit IDs must be wired in before Production rollout; leaving test IDs in a shipped build returns nothing but causes listing review issues if Data Safety mentions ads.</w:t>
+            </w:r>
+          </w:p>
+        </w:tc>
+      </w:tr>
+      <w:tr>
+        <w:tc>
+          <w:tcPr>
+            <w:tcW w:type="dxa" w:w="1400"/>
+            <w:tcBorders>
+              <w:top w:val="single" w:color="CCCCCC" w:sz="1"/>
+              <w:left w:val="single" w:color="CCCCCC" w:sz="1"/>
+              <w:bottom w:val="single" w:color="CCCCCC" w:sz="1"/>
+              <w:right w:val="single" w:color="CCCCCC" w:sz="1"/>
+            </w:tcBorders>
+            <w:shd w:fill="FFF4CE" w:val="clear"/>
+            <w:tcMar>
+              <w:top w:type="dxa" w:w="80"/>
+              <w:left w:type="dxa" w:w="120"/>
+              <w:bottom w:type="dxa" w:w="80"/>
+              <w:right w:type="dxa" w:w="120"/>
+            </w:tcMar>
+          </w:tcPr>
+          <w:p>
+            <w:r>
+              <w:rPr>
+                <w:b/>
+                <w:bCs/>
+              </w:rPr>
+              <w:t xml:space="preserve">OPEN</w:t>
+            </w:r>
+          </w:p>
+        </w:tc>
+        <w:tc>
+          <w:tcPr>
+            <w:tcW w:type="dxa" w:w="2000"/>
+            <w:tcBorders>
+              <w:top w:val="single" w:color="CCCCCC" w:sz="1"/>
+              <w:left w:val="single" w:color="CCCCCC" w:sz="1"/>
+              <w:bottom w:val="single" w:color="CCCCCC" w:sz="1"/>
+              <w:right w:val="single" w:color="CCCCCC" w:sz="1"/>
+            </w:tcBorders>
+            <w:tcMar>
+              <w:top w:type="dxa" w:w="80"/>
+              <w:left w:type="dxa" w:w="120"/>
+              <w:bottom w:type="dxa" w:w="80"/>
+              <w:right w:type="dxa" w:w="120"/>
+            </w:tcMar>
+          </w:tcPr>
+          <w:p>
+            <w:r>
+              <w:t xml:space="preserve">Slice engine / tier progression</w:t>
+            </w:r>
+          </w:p>
+        </w:tc>
+        <w:tc>
+          <w:tcPr>
+            <w:tcW w:type="dxa" w:w="3500"/>
+            <w:tcBorders>
+              <w:top w:val="single" w:color="CCCCCC" w:sz="1"/>
+              <w:left w:val="single" w:color="CCCCCC" w:sz="1"/>
+              <w:bottom w:val="single" w:color="CCCCCC" w:sz="1"/>
+              <w:right w:val="single" w:color="CCCCCC" w:sz="1"/>
+            </w:tcBorders>
+            <w:tcMar>
+              <w:top w:type="dxa" w:w="80"/>
+              <w:left w:type="dxa" w:w="120"/>
+              <w:bottom w:type="dxa" w:w="80"/>
+              <w:right w:type="dxa" w:w="120"/>
+            </w:tcMar>
+          </w:tcPr>
+          <w:p>
+            <w:r>
+              <w:t xml:space="preserve">Update slicing recommendation to walk the tier ladder (E → D → C → B → A → 6-dot) using the previous roll as signal. Stop early if the rolls trend bad and surface a final verdict: Usable / Sellable / Not sliceable.</w:t>
+            </w:r>
+          </w:p>
+        </w:tc>
+        <w:tc>
+          <w:tcPr>
+            <w:tcW w:type="dxa" w:w="2460"/>
+            <w:tcBorders>
+              <w:top w:val="single" w:color="CCCCCC" w:sz="1"/>
+              <w:left w:val="single" w:color="CCCCCC" w:sz="1"/>
+              <w:bottom w:val="single" w:color="CCCCCC" w:sz="1"/>
+              <w:right w:val="single" w:color="CCCCCC" w:sz="1"/>
+            </w:tcBorders>
+            <w:tcMar>
+              <w:top w:type="dxa" w:w="80"/>
+              <w:left w:type="dxa" w:w="120"/>
+              <w:bottom w:type="dxa" w:w="80"/>
+              <w:right w:type="dxa" w:w="120"/>
+            </w:tcMar>
+          </w:tcPr>
+          <w:p>
+            <w:r>
+              <w:t xml:space="preserve">Current engine rates a single current-tier mod. New flow: for each tier step, weigh the roll outcome (which secondary bumped, by how much) to decide whether to continue or cut losses. Example: E→D rolls a non-target stat by minimum → mark Sellable. Needs: per-tier simulated expected-value model, a stop condition threshold, and 3-state output mapping. Audit src/services/sliceEngine.js and slice screen UI to surface the verdict.</w:t>
             </w:r>
           </w:p>
         </w:tc>
@@ -1350,7 +2684,7 @@
           </w:tcPr>
           <w:p>
             <w:r>
-              <w:t xml:space="preserve">Roster / premium</w:t>
+              <w:t xml:space="preserve">GAC / premium</w:t>
             </w:r>
           </w:p>
         </w:tc>
@@ -1372,7 +2706,7 @@
           </w:tcPr>
           <w:p>
             <w:r>
-              <w:t xml:space="preserve">Pull user mods via ally code and flag empty slots + upgrade opportunities (premium)</w:t>
+              <w:t xml:space="preserve">3v3 + 5v5 Grand Arena team recommender backed by swgoh.gg meta HTML scrape</w:t>
             </w:r>
           </w:p>
         </w:tc>
@@ -1394,7 +2728,7 @@
           </w:tcPr>
           <w:p>
             <w:r>
-              <w:t xml:space="preserve">Premium: badge on character when a slot is empty OR an existing mod is an upgrade. Also show a "not unlocked" notifier next to locked characters.</w:t>
+              <w:t xml:space="preserve">Landed via Cloudflare Worker route + client service + state module + GacScreen UI (offense/defense split, roster filter). Installed on R5CX10W4LJY. Archive on next sweep.</w:t>
             </w:r>
           </w:p>
         </w:tc>
@@ -1445,7 +2779,7 @@
           </w:tcPr>
           <w:p>
             <w:r>
-              <w:t xml:space="preserve">Slice / data</w:t>
+              <w:t xml:space="preserve">Slice screen / layout</w:t>
             </w:r>
           </w:p>
         </w:tc>
@@ -1467,7 +2801,7 @@
           </w:tcPr>
           <w:p>
             <w:r>
-              <w:t xml:space="preserve">Refresh chars.js against swgoh.gg mod meta report (277 of 325 entries updated)</w:t>
+              <w:t xml:space="preserve">Removed Best Fit split card; premium Slice screen shows a single full-width Your Roster card</w:t>
             </w:r>
           </w:p>
         </w:tc>
@@ -1489,7 +2823,7 @@
           </w:tcPr>
           <w:p>
             <w:r>
-              <w:t xml:space="preserve">tools/verify-chars-vs-swgoh.js fetches /stats/mod-meta-report/ through the Cloudflare Worker, parses set icons + per-shape primary columns, diffs vs chars.js with multi-primary tolerance. Only Cobb Vanth (not yet in the meta table) left on old data.</w:t>
+              <w:t xml:space="preserve">Supersedes the earlier “shrink Best Character Fit + Your Characters card” row — user asked to drop Best Fit entirely. See SliceScreen.js.</w:t>
             </w:r>
           </w:p>
         </w:tc>
@@ -1540,7 +2874,7 @@
           </w:tcPr>
           <w:p>
             <w:r>
-              <w:t xml:space="preserve">Slice UX</w:t>
+              <w:t xml:space="preserve">Slice engine / scoring</w:t>
             </w:r>
           </w:p>
         </w:tc>
@@ -1562,7 +2896,7 @@
           </w:tcPr>
           <w:p>
             <w:r>
-              <w:t xml:space="preserve">Primary stat + Set match badges below character name (purple / yellow chips)</w:t>
+              <w:t xml:space="preserve">Audit + fix character suggestion scoring: secondaries now weighted, primary bonus adds priority-band points, set/shell tiering preserved</w:t>
             </w:r>
           </w:p>
         </w:tc>
@@ -1584,7 +2918,7 @@
           </w:tcPr>
           <w:p>
             <w:r>
-              <w:t xml:space="preserve">Render regardless of roster state. Priority chip row is now uniformly green when aligned — purple star indicator moved out into the dedicated Primary stat match badge.</w:t>
+              <w:t xml:space="preserve">scoreMatchAgainstEnteredSecondaries returns alignedPriorityIndices + primaryPriorityIndex; final score = rankFitTier*100 + avgSecondaryScore + primaryBonus.</w:t>
             </w:r>
           </w:p>
         </w:tc>
@@ -1635,7 +2969,7 @@
           </w:tcPr>
           <w:p>
             <w:r>
-              <w:t xml:space="preserve">Slice UX</w:t>
+              <w:t xml:space="preserve">Slice UI / chips</w:t>
             </w:r>
           </w:p>
         </w:tc>
@@ -1657,7 +2991,7 @@
           </w:tcPr>
           <w:p>
             <w:r>
-              <w:t xml:space="preserve">Count-based Better / Same / Worse fit verdict (replaces score-based Upgrade / Sidegrade / Downgrade)</w:t>
+              <w:t xml:space="preserve">Match rows show priority alignment chips (✓ scanned secondary hit, ★ primary hit, muted otherwise)</w:t>
             </w:r>
           </w:p>
         </w:tc>
@@ -1679,7 +3013,7 @@
           </w:tcPr>
           <w:p>
             <w:r>
-              <w:t xml:space="preserve">countAlignedForMatch in sliceEngine.js. Compares aligned-secondary counts on scanned mod vs equipped slot mod. Magnitude-insensitive — any matching-priority secondary counts as 1.</w:t>
+              <w:t xml:space="preserve">Primary ★ now takes visual precedence over ✓ when both hit the same slot so users see the primary match even when a secondary aligns at #1.</w:t>
             </w:r>
           </w:p>
         </w:tc>
@@ -1730,7 +3064,7 @@
           </w:tcPr>
           <w:p>
             <w:r>
-              <w:t xml:space="preserve">Slice / filtering</w:t>
+              <w:t xml:space="preserve">Slice engine / alt builds</w:t>
             </w:r>
           </w:p>
         </w:tc>
@@ -1752,7 +3086,7 @@
           </w:tcPr>
           <w:p>
             <w:r>
-              <w:t xml:space="preserve">Filter character recommendations by scanned mod’s set</w:t>
+              <w:t xml:space="preserve">Alt-build priorities derived at runtime from SEC_FOCUS research (positions #1,#2 from main + #5,#6 from ranked usage, Speed locked to main position)</w:t>
             </w:r>
           </w:p>
         </w:tc>
@@ -1774,7 +3108,7 @@
           </w:tcPr>
           <w:p>
             <w:r>
-              <w:t xml:space="preserve">Substring match against c.set so "Defense" matches both Defense(x4)+... and ...+Defense(x2). Drops mismatches out of Best Characters / Best Fit when a set is selected.</w:t>
+              <w:t xml:space="preserve">Falls back to hand-curated buSecs when SEC_FOCUS missing. Added soft no-Speed penalty (12pts) when 3+ secondaries revealed without Speed.</w:t>
             </w:r>
           </w:p>
         </w:tc>
@@ -1825,7 +3159,7 @@
           </w:tcPr>
           <w:p>
             <w:r>
-              <w:t xml:space="preserve">Roster cache</w:t>
+              <w:t xml:space="preserve">Slice engine / flat vs %</w:t>
             </w:r>
           </w:p>
         </w:tc>
@@ -1847,7 +3181,7 @@
           </w:tcPr>
           <w:p>
             <w:r>
-              <w:t xml:space="preserve">Bump rosterService cache key v2 → v3 to invalidate caches predating mod primary / secondaries normalization</w:t>
+              <w:t xml:space="preserve">Flat and % priority stats now match each other asymmetrically: scanned % satisfies a flat priority fully; scanned flat gives 25% credit vs a % priority</w:t>
             </w:r>
           </w:p>
         </w:tc>
@@ -1869,7 +3203,292 @@
           </w:tcPr>
           <w:p>
             <w:r>
-              <w:t xml:space="preserve">Any future shape change to the cached roster needs another bump. Old v2 payloads didn’t include primary / secondaries on each mod, breaking the new slot-aware badges until the user force-refreshed.</w:t>
+              <w:t xml:space="preserve">normalizePriorityName promotes Health/Offense/Protection/Defense → their % form for comparison. Primary bonus lookup normalized too.</w:t>
+            </w:r>
+          </w:p>
+        </w:tc>
+      </w:tr>
+      <w:tr>
+        <w:tc>
+          <w:tcPr>
+            <w:tcW w:type="dxa" w:w="1400"/>
+            <w:tcBorders>
+              <w:top w:val="single" w:color="CCCCCC" w:sz="1"/>
+              <w:left w:val="single" w:color="CCCCCC" w:sz="1"/>
+              <w:bottom w:val="single" w:color="CCCCCC" w:sz="1"/>
+              <w:right w:val="single" w:color="CCCCCC" w:sz="1"/>
+            </w:tcBorders>
+            <w:shd w:fill="D5F0D5" w:val="clear"/>
+            <w:tcMar>
+              <w:top w:type="dxa" w:w="80"/>
+              <w:left w:type="dxa" w:w="120"/>
+              <w:bottom w:type="dxa" w:w="80"/>
+              <w:right w:type="dxa" w:w="120"/>
+            </w:tcMar>
+          </w:tcPr>
+          <w:p>
+            <w:r>
+              <w:rPr>
+                <w:b/>
+                <w:bCs/>
+              </w:rPr>
+              <w:t xml:space="preserve">DONE</w:t>
+            </w:r>
+          </w:p>
+        </w:tc>
+        <w:tc>
+          <w:tcPr>
+            <w:tcW w:type="dxa" w:w="2000"/>
+            <w:tcBorders>
+              <w:top w:val="single" w:color="CCCCCC" w:sz="1"/>
+              <w:left w:val="single" w:color="CCCCCC" w:sz="1"/>
+              <w:bottom w:val="single" w:color="CCCCCC" w:sz="1"/>
+              <w:right w:val="single" w:color="CCCCCC" w:sz="1"/>
+            </w:tcBorders>
+            <w:tcMar>
+              <w:top w:type="dxa" w:w="80"/>
+              <w:left w:type="dxa" w:w="120"/>
+              <w:bottom w:type="dxa" w:w="80"/>
+              <w:right w:type="dxa" w:w="120"/>
+            </w:tcMar>
+          </w:tcPr>
+          <w:p>
+            <w:r>
+              <w:t xml:space="preserve">Overlay / premium gating</w:t>
+            </w:r>
+          </w:p>
+        </w:tc>
+        <w:tc>
+          <w:tcPr>
+            <w:tcW w:type="dxa" w:w="3500"/>
+            <w:tcBorders>
+              <w:top w:val="single" w:color="CCCCCC" w:sz="1"/>
+              <w:left w:val="single" w:color="CCCCCC" w:sz="1"/>
+              <w:bottom w:val="single" w:color="CCCCCC" w:sz="1"/>
+              <w:right w:val="single" w:color="CCCCCC" w:sz="1"/>
+            </w:tcBorders>
+            <w:tcMar>
+              <w:top w:type="dxa" w:w="80"/>
+              <w:left w:type="dxa" w:w="120"/>
+              <w:bottom w:type="dxa" w:w="80"/>
+              <w:right w:type="dxa" w:w="120"/>
+            </w:tcMar>
+          </w:tcPr>
+          <w:p>
+            <w:r>
+              <w:t xml:space="preserve">Free-user overlay now gates the characters panel behind ROSTER unlock; top character list expanded from 6 to 20</w:t>
+            </w:r>
+          </w:p>
+        </w:tc>
+        <w:tc>
+          <w:tcPr>
+            <w:tcW w:type="dxa" w:w="2460"/>
+            <w:tcBorders>
+              <w:top w:val="single" w:color="CCCCCC" w:sz="1"/>
+              <w:left w:val="single" w:color="CCCCCC" w:sz="1"/>
+              <w:bottom w:val="single" w:color="CCCCCC" w:sz="1"/>
+              <w:right w:val="single" w:color="CCCCCC" w:sz="1"/>
+            </w:tcBorders>
+            <w:tcMar>
+              <w:top w:type="dxa" w:w="80"/>
+              <w:left w:type="dxa" w:w="120"/>
+              <w:bottom w:type="dxa" w:w="80"/>
+              <w:right w:type="dxa" w:w="120"/>
+            </w:tcMar>
+          </w:tcPr>
+          <w:p>
+            <w:r>
+              <w:t xml:space="preserve">buildOverlayRecommendations() slices to 20; App.js substitutes a “Premium” placeholder card when ROSTER is locked.</w:t>
+            </w:r>
+          </w:p>
+        </w:tc>
+      </w:tr>
+      <w:tr>
+        <w:tc>
+          <w:tcPr>
+            <w:tcW w:type="dxa" w:w="1400"/>
+            <w:tcBorders>
+              <w:top w:val="single" w:color="CCCCCC" w:sz="1"/>
+              <w:left w:val="single" w:color="CCCCCC" w:sz="1"/>
+              <w:bottom w:val="single" w:color="CCCCCC" w:sz="1"/>
+              <w:right w:val="single" w:color="CCCCCC" w:sz="1"/>
+            </w:tcBorders>
+            <w:shd w:fill="D5F0D5" w:val="clear"/>
+            <w:tcMar>
+              <w:top w:type="dxa" w:w="80"/>
+              <w:left w:type="dxa" w:w="120"/>
+              <w:bottom w:type="dxa" w:w="80"/>
+              <w:right w:type="dxa" w:w="120"/>
+            </w:tcMar>
+          </w:tcPr>
+          <w:p>
+            <w:r>
+              <w:rPr>
+                <w:b/>
+                <w:bCs/>
+              </w:rPr>
+              <w:t xml:space="preserve">DONE</w:t>
+            </w:r>
+          </w:p>
+        </w:tc>
+        <w:tc>
+          <w:tcPr>
+            <w:tcW w:type="dxa" w:w="2000"/>
+            <w:tcBorders>
+              <w:top w:val="single" w:color="CCCCCC" w:sz="1"/>
+              <w:left w:val="single" w:color="CCCCCC" w:sz="1"/>
+              <w:bottom w:val="single" w:color="CCCCCC" w:sz="1"/>
+              <w:right w:val="single" w:color="CCCCCC" w:sz="1"/>
+            </w:tcBorders>
+            <w:tcMar>
+              <w:top w:type="dxa" w:w="80"/>
+              <w:left w:type="dxa" w:w="120"/>
+              <w:bottom w:type="dxa" w:w="80"/>
+              <w:right w:type="dxa" w:w="120"/>
+            </w:tcMar>
+          </w:tcPr>
+          <w:p>
+            <w:r>
+              <w:t xml:space="preserve">Scan UX</w:t>
+            </w:r>
+          </w:p>
+        </w:tc>
+        <w:tc>
+          <w:tcPr>
+            <w:tcW w:type="dxa" w:w="3500"/>
+            <w:tcBorders>
+              <w:top w:val="single" w:color="CCCCCC" w:sz="1"/>
+              <w:left w:val="single" w:color="CCCCCC" w:sz="1"/>
+              <w:bottom w:val="single" w:color="CCCCCC" w:sz="1"/>
+              <w:right w:val="single" w:color="CCCCCC" w:sz="1"/>
+            </w:tcBorders>
+            <w:tcMar>
+              <w:top w:type="dxa" w:w="80"/>
+              <w:left w:type="dxa" w:w="120"/>
+              <w:bottom w:type="dxa" w:w="80"/>
+              <w:right w:type="dxa" w:w="120"/>
+            </w:tcMar>
+          </w:tcPr>
+          <w:p>
+            <w:r>
+              <w:t xml:space="preserve">Scanner / scan-button overlay should dismiss when user swaps back to the app so Slice tab is reviewable without manually killing the overlay</w:t>
+            </w:r>
+          </w:p>
+        </w:tc>
+        <w:tc>
+          <w:tcPr>
+            <w:tcW w:type="dxa" w:w="2460"/>
+            <w:tcBorders>
+              <w:top w:val="single" w:color="CCCCCC" w:sz="1"/>
+              <w:left w:val="single" w:color="CCCCCC" w:sz="1"/>
+              <w:bottom w:val="single" w:color="CCCCCC" w:sz="1"/>
+              <w:right w:val="single" w:color="CCCCCC" w:sz="1"/>
+            </w:tcBorders>
+            <w:tcMar>
+              <w:top w:type="dxa" w:w="80"/>
+              <w:left w:type="dxa" w:w="120"/>
+              <w:bottom w:type="dxa" w:w="80"/>
+              <w:right w:type="dxa" w:w="120"/>
+            </w:tcMar>
+          </w:tcPr>
+          <w:p>
+            <w:r>
+              <w:t xml:space="preserve">OBSOLETE: after the first-run bubble fix the overlay persists across app swaps, so auto-dismissing would force a “Ready to scan” tap every time. Keeping the bubble up is the desired UX.</w:t>
+            </w:r>
+          </w:p>
+        </w:tc>
+      </w:tr>
+      <w:tr>
+        <w:tc>
+          <w:tcPr>
+            <w:tcW w:type="dxa" w:w="1400"/>
+            <w:tcBorders>
+              <w:top w:val="single" w:color="CCCCCC" w:sz="1"/>
+              <w:left w:val="single" w:color="CCCCCC" w:sz="1"/>
+              <w:bottom w:val="single" w:color="CCCCCC" w:sz="1"/>
+              <w:right w:val="single" w:color="CCCCCC" w:sz="1"/>
+            </w:tcBorders>
+            <w:shd w:fill="FFF4CE" w:val="clear"/>
+            <w:tcMar>
+              <w:top w:type="dxa" w:w="80"/>
+              <w:left w:type="dxa" w:w="120"/>
+              <w:bottom w:type="dxa" w:w="80"/>
+              <w:right w:type="dxa" w:w="120"/>
+            </w:tcMar>
+          </w:tcPr>
+          <w:p>
+            <w:r>
+              <w:rPr>
+                <w:b/>
+                <w:bCs/>
+              </w:rPr>
+              <w:t xml:space="preserve">OPEN</w:t>
+            </w:r>
+          </w:p>
+        </w:tc>
+        <w:tc>
+          <w:tcPr>
+            <w:tcW w:type="dxa" w:w="2000"/>
+            <w:tcBorders>
+              <w:top w:val="single" w:color="CCCCCC" w:sz="1"/>
+              <w:left w:val="single" w:color="CCCCCC" w:sz="1"/>
+              <w:bottom w:val="single" w:color="CCCCCC" w:sz="1"/>
+              <w:right w:val="single" w:color="CCCCCC" w:sz="1"/>
+            </w:tcBorders>
+            <w:tcMar>
+              <w:top w:type="dxa" w:w="80"/>
+              <w:left w:type="dxa" w:w="120"/>
+              <w:bottom w:type="dxa" w:w="80"/>
+              <w:right w:type="dxa" w:w="120"/>
+            </w:tcMar>
+          </w:tcPr>
+          <w:p>
+            <w:r>
+              <w:t xml:space="preserve">Slice engine / slot badge</w:t>
+            </w:r>
+          </w:p>
+        </w:tc>
+        <w:tc>
+          <w:tcPr>
+            <w:tcW w:type="dxa" w:w="3500"/>
+            <w:tcBorders>
+              <w:top w:val="single" w:color="CCCCCC" w:sz="1"/>
+              <w:left w:val="single" w:color="CCCCCC" w:sz="1"/>
+              <w:bottom w:val="single" w:color="CCCCCC" w:sz="1"/>
+              <w:right w:val="single" w:color="CCCCCC" w:sz="1"/>
+            </w:tcBorders>
+            <w:tcMar>
+              <w:top w:type="dxa" w:w="80"/>
+              <w:left w:type="dxa" w:w="120"/>
+              <w:bottom w:type="dxa" w:w="80"/>
+              <w:right w:type="dxa" w:w="120"/>
+            </w:tcMar>
+          </w:tcPr>
+          <w:p>
+            <w:r>
+              <w:t xml:space="preserve">Slot-aware mod badge should score scanned mod vs currently-equipped mod (upgrade / sidegrade / downgrade) using the slice engine, not just structural emptiness</w:t>
+            </w:r>
+          </w:p>
+        </w:tc>
+        <w:tc>
+          <w:tcPr>
+            <w:tcW w:type="dxa" w:w="2460"/>
+            <w:tcBorders>
+              <w:top w:val="single" w:color="CCCCCC" w:sz="1"/>
+              <w:left w:val="single" w:color="CCCCCC" w:sz="1"/>
+              <w:bottom w:val="single" w:color="CCCCCC" w:sz="1"/>
+              <w:right w:val="single" w:color="CCCCCC" w:sz="1"/>
+            </w:tcBorders>
+            <w:tcMar>
+              <w:top w:type="dxa" w:w="80"/>
+              <w:left w:type="dxa" w:w="120"/>
+              <w:bottom w:type="dxa" w:w="80"/>
+              <w:right w:type="dxa" w:w="120"/>
+            </w:tcMar>
+          </w:tcPr>
+          <w:p>
+            <w:r>
+              <w:t xml:space="preserve">Currently reports “Empty Circle” or “Circle maxed” structurally. Next: compute fit-score delta so the badge reads e.g. “Upgrade Circle — +8 speed”.</w:t>
             </w:r>
           </w:p>
         </w:tc>

</xml_diff>

<commit_message>
docs/TODO: flip slot-badge row to DONE
compareScannedVsEquipped() already scores scanned vs equipped mod
against match priorities and emits Upgrade/Sidegrade/Downgrade +
scoreDelta + per-stat deltas.

Co-Authored-By: Claude Opus 4.7 <noreply@anthropic.com>
</commit_message>
<xml_diff>
--- a/docs/TODO.docx
+++ b/docs/TODO.docx
@@ -3408,7 +3408,7 @@
               <w:bottom w:val="single" w:color="CCCCCC" w:sz="1"/>
               <w:right w:val="single" w:color="CCCCCC" w:sz="1"/>
             </w:tcBorders>
-            <w:shd w:fill="FFF4CE" w:val="clear"/>
+            <w:shd w:fill="D5F0D5" w:val="clear"/>
             <w:tcMar>
               <w:top w:type="dxa" w:w="80"/>
               <w:left w:type="dxa" w:w="120"/>
@@ -3422,7 +3422,7 @@
                 <w:b/>
                 <w:bCs/>
               </w:rPr>
-              <w:t xml:space="preserve">OPEN</w:t>
+              <w:t xml:space="preserve">DONE</w:t>
             </w:r>
           </w:p>
         </w:tc>
@@ -3466,7 +3466,7 @@
           </w:tcPr>
           <w:p>
             <w:r>
-              <w:t xml:space="preserve">Slot-aware mod badge should score scanned mod vs currently-equipped mod (upgrade / sidegrade / downgrade) using the slice engine, not just structural emptiness</w:t>
+              <w:t xml:space="preserve">Slot-aware mod badge scores scanned mod vs currently-equipped mod (Upgrade / Sidegrade / Downgrade) using the slice engine, not just structural emptiness</w:t>
             </w:r>
           </w:p>
         </w:tc>
@@ -3488,7 +3488,7 @@
           </w:tcPr>
           <w:p>
             <w:r>
-              <w:t xml:space="preserve">Currently reports “Empty Circle” or “Circle maxed” structurally. Next: compute fit-score delta so the badge reads e.g. “Upgrade Circle — +8 speed”.</w:t>
+              <w:t xml:space="preserve">compareScannedVsEquipped() in sliceEngine.js:1130 scores both mods against the match priorities, then returns verdict (rawDelta&gt;4 Upgrade, &lt;-6 Downgrade, else Sidegrade), scoreDelta, and per-priority stat deltas for the badge label. Archive on next sweep.</w:t>
             </w:r>
           </w:p>
         </w:tc>

</xml_diff>

<commit_message>
Slice engine: tier-ladder 4-state verdict
buildLadderPlan() walks the scanned mod's current tier through 6E using
rolled secondaries as signal. Emits one of four verdicts:

  USABLE        — worth slicing to 6E (mat cost justified)
  CAP_AT_5A     — finish the cheap 5A levels, skip 6-dot mats
  SELLABLE      — bail now, mats would be wasted
  NOT_SLICEABLE — already 6E, no tier, or no build uses this shell

Pre-5A steps each burn mats, so no-priority + no-Speed or minimal
priority quality triggers an early bail. The 5A→6E step also burns mats;
we require Speed evidence (3 rolls or speed arrow) or a high-SLICE_GAIN
priority stat rolled ≥65% quality to justify continuing.

SliceScreen renders a new ladder verdict card above the Decision card.
TODO row flipped to DONE.

Co-Authored-By: Claude Opus 4.7 <noreply@anthropic.com>
</commit_message>
<xml_diff>
--- a/docs/TODO.docx
+++ b/docs/TODO.docx
@@ -2553,7 +2553,7 @@
               <w:bottom w:val="single" w:color="CCCCCC" w:sz="1"/>
               <w:right w:val="single" w:color="CCCCCC" w:sz="1"/>
             </w:tcBorders>
-            <w:shd w:fill="FFF4CE" w:val="clear"/>
+            <w:shd w:fill="D5F0D5" w:val="clear"/>
             <w:tcMar>
               <w:top w:type="dxa" w:w="80"/>
               <w:left w:type="dxa" w:w="120"/>
@@ -2567,7 +2567,7 @@
                 <w:b/>
                 <w:bCs/>
               </w:rPr>
-              <w:t xml:space="preserve">OPEN</w:t>
+              <w:t xml:space="preserve">DONE</w:t>
             </w:r>
           </w:p>
         </w:tc>
@@ -2611,7 +2611,7 @@
           </w:tcPr>
           <w:p>
             <w:r>
-              <w:t xml:space="preserve">Update slicing recommendation to walk the tier ladder (E → D → C → B → A → 6-dot) using the previous roll as signal. Stop early if the rolls trend bad and surface a final verdict: Usable / Sellable / Not sliceable.</w:t>
+              <w:t xml:space="preserve">Walk tier ladder (E → D → C → B → A → 6E) using actual rolled secondaries as signal. 4-state verdict: Usable / Cap at 5A / Sellable / Not sliceable.</w:t>
             </w:r>
           </w:p>
         </w:tc>
@@ -2633,7 +2633,7 @@
           </w:tcPr>
           <w:p>
             <w:r>
-              <w:t xml:space="preserve">Current engine rates a single current-tier mod. New flow: for each tier step, weigh the roll outcome (which secondary bumped, by how much) to decide whether to continue or cut losses. Example: E→D rolls a non-target stat by minimum → mark Sellable. Needs: per-tier simulated expected-value model, a stop condition threshold, and 3-state output mapping. Audit src/services/sliceEngine.js and slice screen UI to surface the verdict.</w:t>
+              <w:t xml:space="preserve">buildLadderPlan() in sliceEngine.js reads scoredStats + secondaries, gates the pre-5A mat-cost path on priority-hit presence + quality, and gates the 5A→6E mat-cost path on Speed evidence or high-SLICE_GAIN priority rolls. SliceScreen renders a ladder verdict card above the Decision card. Cap at 5A is new — “finish the free-money climb but skip 6-dot mats.” Archive on next sweep.</w:t>
             </w:r>
           </w:p>
         </w:tc>

</xml_diff>

<commit_message>
Docs: log slice engine tier-ladder, FILLER, and community tuning
- READMEBEFOREEDITING: new sections covering the 5-state tier-ladder
  verdict (Usable / Cap at 5A / Filler / Sellable / Not sliceable) and
  the community-guidance tuning pass (Defense% 5.0 -> 4.0,
  strongUpside SLICE_GAIN cutoff 0.5 -> 0.3, hasDecentFit finalScore
  floor 40 -> 50).
- TODO: flip the tier-progression row to reflect the 5-state verdict,
  add a new DONE row for the community-tuning audit.
- Rebuild docs/TODO.docx from tools/build-todo-doc.js.

Co-Authored-By: Claude Opus 4.7 <noreply@anthropic.com>
</commit_message>
<xml_diff>
--- a/docs/TODO.docx
+++ b/docs/TODO.docx
@@ -2611,7 +2611,7 @@
           </w:tcPr>
           <w:p>
             <w:r>
-              <w:t xml:space="preserve">Walk tier ladder (E → D → C → B → A → 6E) using actual rolled secondaries as signal. 4-state verdict: Usable / Cap at 5A / Sellable / Not sliceable.</w:t>
+              <w:t xml:space="preserve">Walk tier ladder (E → D → C → B → A → 6E) using actual rolled secondaries as signal. 5-state verdict: Usable / Cap at 5A / Filler / Sellable / Not sliceable.</w:t>
             </w:r>
           </w:p>
         </w:tc>
@@ -2633,7 +2633,102 @@
           </w:tcPr>
           <w:p>
             <w:r>
-              <w:t xml:space="preserve">buildLadderPlan() in sliceEngine.js reads scoredStats + secondaries, gates the pre-5A mat-cost path on priority-hit presence + quality, and gates the 5A→6E mat-cost path on Speed evidence or high-SLICE_GAIN priority rolls. SliceScreen renders a ladder verdict card above the Decision card. Cap at 5A is new — “finish the free-money climb but skip 6-dot mats.” Archive on next sweep.</w:t>
+              <w:t xml:space="preserve">buildLadderPlan() in sliceEngine.js reads scoredStats + secondaries, gates the pre-5A mat-cost path on priority-hit presence + quality, and gates the 5A→6E mat-cost path on Speed evidence or high-SLICE_GAIN priority rolls. SliceScreen renders a ladder verdict card above the Decision card. Cap at 5A is scoped to mods already at 5A so sub-5A mods aren’t pushed to burn mats. Filler (blue) covers “decent stats but no 6-dot catalyst — equip as-is until replaced.” Archive on next sweep.</w:t>
+            </w:r>
+          </w:p>
+        </w:tc>
+      </w:tr>
+      <w:tr>
+        <w:tc>
+          <w:tcPr>
+            <w:tcW w:type="dxa" w:w="1400"/>
+            <w:tcBorders>
+              <w:top w:val="single" w:color="CCCCCC" w:sz="1"/>
+              <w:left w:val="single" w:color="CCCCCC" w:sz="1"/>
+              <w:bottom w:val="single" w:color="CCCCCC" w:sz="1"/>
+              <w:right w:val="single" w:color="CCCCCC" w:sz="1"/>
+            </w:tcBorders>
+            <w:shd w:fill="D5F0D5" w:val="clear"/>
+            <w:tcMar>
+              <w:top w:type="dxa" w:w="80"/>
+              <w:left w:type="dxa" w:w="120"/>
+              <w:bottom w:type="dxa" w:w="80"/>
+              <w:right w:type="dxa" w:w="120"/>
+            </w:tcMar>
+          </w:tcPr>
+          <w:p>
+            <w:r>
+              <w:rPr>
+                <w:b/>
+                <w:bCs/>
+              </w:rPr>
+              <w:t xml:space="preserve">DONE</w:t>
+            </w:r>
+          </w:p>
+        </w:tc>
+        <w:tc>
+          <w:tcPr>
+            <w:tcW w:type="dxa" w:w="2000"/>
+            <w:tcBorders>
+              <w:top w:val="single" w:color="CCCCCC" w:sz="1"/>
+              <w:left w:val="single" w:color="CCCCCC" w:sz="1"/>
+              <w:bottom w:val="single" w:color="CCCCCC" w:sz="1"/>
+              <w:right w:val="single" w:color="CCCCCC" w:sz="1"/>
+            </w:tcBorders>
+            <w:tcMar>
+              <w:top w:type="dxa" w:w="80"/>
+              <w:left w:type="dxa" w:w="120"/>
+              <w:bottom w:type="dxa" w:w="80"/>
+              <w:right w:type="dxa" w:w="120"/>
+            </w:tcMar>
+          </w:tcPr>
+          <w:p>
+            <w:r>
+              <w:t xml:space="preserve">Slice engine / community tuning</w:t>
+            </w:r>
+          </w:p>
+        </w:tc>
+        <w:tc>
+          <w:tcPr>
+            <w:tcW w:type="dxa" w:w="3500"/>
+            <w:tcBorders>
+              <w:top w:val="single" w:color="CCCCCC" w:sz="1"/>
+              <w:left w:val="single" w:color="CCCCCC" w:sz="1"/>
+              <w:bottom w:val="single" w:color="CCCCCC" w:sz="1"/>
+              <w:right w:val="single" w:color="CCCCCC" w:sz="1"/>
+            </w:tcBorders>
+            <w:tcMar>
+              <w:top w:type="dxa" w:w="80"/>
+              <w:left w:type="dxa" w:w="120"/>
+              <w:bottom w:type="dxa" w:w="80"/>
+              <w:right w:type="dxa" w:w="120"/>
+            </w:tcMar>
+          </w:tcPr>
+          <w:p>
+            <w:r>
+              <w:t xml:space="preserve">Audit weights + ladder thresholds against community guidance (swgoh.gg top-1000 Kyber meta, Grandivory, Crouching-Rancor)</w:t>
+            </w:r>
+          </w:p>
+        </w:tc>
+        <w:tc>
+          <w:tcPr>
+            <w:tcW w:type="dxa" w:w="2460"/>
+            <w:tcBorders>
+              <w:top w:val="single" w:color="CCCCCC" w:sz="1"/>
+              <w:left w:val="single" w:color="CCCCCC" w:sz="1"/>
+              <w:bottom w:val="single" w:color="CCCCCC" w:sz="1"/>
+              <w:right w:val="single" w:color="CCCCCC" w:sz="1"/>
+            </w:tcBorders>
+            <w:tcMar>
+              <w:top w:type="dxa" w:w="80"/>
+              <w:left w:type="dxa" w:w="120"/>
+              <w:bottom w:type="dxa" w:w="80"/>
+              <w:right w:type="dxa" w:w="120"/>
+            </w:tcMar>
+          </w:tcPr>
+          <w:p>
+            <w:r>
+              <w:t xml:space="preserve">Defense% weight 5.0 → 4.0 (was biasing tanks ~25% above consensus). strongUpside SLICE_GAIN cutoff 0.5 → 0.3 so Protection% (0.33) counts as a 6-dot catalyst on Prot%-primary mods with strong rolls. hasDecentFit finalScore floor 40 → 50 to tighten the Filler / Cap-at-5A gate vs Grandivory’s HOLD=60. Flat-stat sell, Speed-arrow rule, and Crouching-Rancor rollEfficiency formula verified against sources. See sliceRules.js weights + buildLadderPlan() in sliceEngine.js. Archive on next sweep.</w:t>
             </w:r>
           </w:p>
         </w:tc>

</xml_diff>

<commit_message>
Parser: catch stuck tier letter + preserve secondary roll counts
extractModTier: add last-resort pattern for when OCR glues the tier letter
onto the first secondary line (e.g. 'C (2) 4.12% Protection' on a 5C Cross).

extractSecondaries: when multiple regex patterns match the same line, prefer
the entry that carries an explicit rolls field so the (n) roll count from
rollFirstPattern isn't discarded by valueFirstPattern's earlier match.

Verified against tools/debug_out/ocr-debug-last.txt from R5CX10W4LJY.

Co-Authored-By: Claude Opus 4.7 <noreply@anthropic.com>
</commit_message>
<xml_diff>
--- a/docs/TODO.docx
+++ b/docs/TODO.docx
@@ -2729,6 +2729,101 @@
           <w:p>
             <w:r>
               <w:t xml:space="preserve">extractModTier() in modCaptureParser.js reads Tier/LVL/Level patterns from the OCR output and returns ‘5E’…‘5A’. Threaded through parsed.modTier → App.js slicePrefill.tier → SliceScreen. 6E (6-dot) isn’t auto-detected yet (needs pip-count detection) — user taps 6E manually. When OCR misses the letter, SliceScreen clears tier to ‘’ on prefill so the ladder plan falls through to “Not sliceable — No tier selected” rather than silently showing wrong 5A verdicts.</w:t>
+            </w:r>
+          </w:p>
+        </w:tc>
+      </w:tr>
+      <w:tr>
+        <w:tc>
+          <w:tcPr>
+            <w:tcW w:type="dxa" w:w="1400"/>
+            <w:tcBorders>
+              <w:top w:val="single" w:color="CCCCCC" w:sz="1"/>
+              <w:left w:val="single" w:color="CCCCCC" w:sz="1"/>
+              <w:bottom w:val="single" w:color="CCCCCC" w:sz="1"/>
+              <w:right w:val="single" w:color="CCCCCC" w:sz="1"/>
+            </w:tcBorders>
+            <w:shd w:fill="D5F0D5" w:val="clear"/>
+            <w:tcMar>
+              <w:top w:type="dxa" w:w="80"/>
+              <w:left w:type="dxa" w:w="120"/>
+              <w:bottom w:type="dxa" w:w="80"/>
+              <w:right w:type="dxa" w:w="120"/>
+            </w:tcMar>
+          </w:tcPr>
+          <w:p>
+            <w:r>
+              <w:rPr>
+                <w:b/>
+                <w:bCs/>
+              </w:rPr>
+              <w:t xml:space="preserve">DONE</w:t>
+            </w:r>
+          </w:p>
+        </w:tc>
+        <w:tc>
+          <w:tcPr>
+            <w:tcW w:type="dxa" w:w="2000"/>
+            <w:tcBorders>
+              <w:top w:val="single" w:color="CCCCCC" w:sz="1"/>
+              <w:left w:val="single" w:color="CCCCCC" w:sz="1"/>
+              <w:bottom w:val="single" w:color="CCCCCC" w:sz="1"/>
+              <w:right w:val="single" w:color="CCCCCC" w:sz="1"/>
+            </w:tcBorders>
+            <w:tcMar>
+              <w:top w:type="dxa" w:w="80"/>
+              <w:left w:type="dxa" w:w="120"/>
+              <w:bottom w:type="dxa" w:w="80"/>
+              <w:right w:type="dxa" w:w="120"/>
+            </w:tcMar>
+          </w:tcPr>
+          <w:p>
+            <w:r>
+              <w:t xml:space="preserve">Scanner / parser fixes</w:t>
+            </w:r>
+          </w:p>
+        </w:tc>
+        <w:tc>
+          <w:tcPr>
+            <w:tcW w:type="dxa" w:w="3500"/>
+            <w:tcBorders>
+              <w:top w:val="single" w:color="CCCCCC" w:sz="1"/>
+              <w:left w:val="single" w:color="CCCCCC" w:sz="1"/>
+              <w:bottom w:val="single" w:color="CCCCCC" w:sz="1"/>
+              <w:right w:val="single" w:color="CCCCCC" w:sz="1"/>
+            </w:tcBorders>
+            <w:tcMar>
+              <w:top w:type="dxa" w:w="80"/>
+              <w:left w:type="dxa" w:w="120"/>
+              <w:bottom w:type="dxa" w:w="80"/>
+              <w:right w:type="dxa" w:w="120"/>
+            </w:tcMar>
+          </w:tcPr>
+          <w:p>
+            <w:r>
+              <w:t xml:space="preserve">Parser: tier letter detection + secondary roll-count preservation fixes on OCR output</w:t>
+            </w:r>
+          </w:p>
+        </w:tc>
+        <w:tc>
+          <w:tcPr>
+            <w:tcW w:type="dxa" w:w="2460"/>
+            <w:tcBorders>
+              <w:top w:val="single" w:color="CCCCCC" w:sz="1"/>
+              <w:left w:val="single" w:color="CCCCCC" w:sz="1"/>
+              <w:bottom w:val="single" w:color="CCCCCC" w:sz="1"/>
+              <w:right w:val="single" w:color="CCCCCC" w:sz="1"/>
+            </w:tcBorders>
+            <w:tcMar>
+              <w:top w:type="dxa" w:w="80"/>
+              <w:left w:type="dxa" w:w="120"/>
+              <w:bottom w:type="dxa" w:w="80"/>
+              <w:right w:type="dxa" w:w="120"/>
+            </w:tcMar>
+          </w:tcPr>
+          <w:p>
+            <w:r>
+              <w:t xml:space="preserve">extractModTier() now catches the tier when OCR glues the letter onto the first secondary line (e.g. “C (2) 4.12% Protection”) via a new ^([A-E])\s+\(\d+\) pattern, in addition to “LVL 15 · C” / “15 - A” badge patterns. Second fix: extractSecondaries() was dropping the (n) roll counts because valueFirstPattern dedup-won over rollFirstPattern; now prefers the entry that carries an explicit rolls field so Protection% (2), Offense% (2), Speed (1), Defense (1) survive end-to-end. Verified on R5CX10W4LJY scan (ocr-debug-last.txt: 5C Cross).</w:t>
             </w:r>
           </w:p>
         </w:tc>

</xml_diff>

<commit_message>
GAC worker: scrape offense recs from who-to-attack page
Worker's offense scrape pointed at /gac/who-to-attack/ but reused the
stat-table parser, which doesn't match that page's layout (panel blocks
per lead, not a table of squads). Result: GAC Meta tab showed empty
Offense for both 3v3 and 5v5.

Added parseGacWhoToAttackHtml + scrapeGacOffense in worker.js: pulls
each lead's base ID + Seen + Win % out of the per-panel layout and
emits 1-member offense entries. Season parity gates bracket (odd=3v3,
even=5v5); current season auto-detected from embedded season IDs.

Verified live: /?gac=3v3 -> 50 offense entries, /?gac=5v5 -> 50 from
season 76. Client needs Refresh tap (or 12h cache expiry) to see new data.

Co-Authored-By: Claude Opus 4.7 <noreply@anthropic.com>
</commit_message>
<xml_diff>
--- a/docs/TODO.docx
+++ b/docs/TODO.docx
@@ -2919,6 +2919,101 @@
           <w:p>
             <w:r>
               <w:t xml:space="preserve">Previously SliceScreen rendered the ladder plan (“Slice to 5B”, cyan) AND a separate score-based Decision (“Filler — not worth slicing”) at the same time, which gave contradictory recommendations. Now renders one card driven by result.ladderPlan with Score: X/100 + reasonLines[0] folded in as footer lines. Old Decision card retained as fallback branch when ladderPlan is absent.</w:t>
+            </w:r>
+          </w:p>
+        </w:tc>
+      </w:tr>
+      <w:tr>
+        <w:tc>
+          <w:tcPr>
+            <w:tcW w:type="dxa" w:w="1400"/>
+            <w:tcBorders>
+              <w:top w:val="single" w:color="CCCCCC" w:sz="1"/>
+              <w:left w:val="single" w:color="CCCCCC" w:sz="1"/>
+              <w:bottom w:val="single" w:color="CCCCCC" w:sz="1"/>
+              <w:right w:val="single" w:color="CCCCCC" w:sz="1"/>
+            </w:tcBorders>
+            <w:shd w:fill="D5F0D5" w:val="clear"/>
+            <w:tcMar>
+              <w:top w:type="dxa" w:w="80"/>
+              <w:left w:type="dxa" w:w="120"/>
+              <w:bottom w:type="dxa" w:w="80"/>
+              <w:right w:type="dxa" w:w="120"/>
+            </w:tcMar>
+          </w:tcPr>
+          <w:p>
+            <w:r>
+              <w:rPr>
+                <w:b/>
+                <w:bCs/>
+              </w:rPr>
+              <w:t xml:space="preserve">DONE</w:t>
+            </w:r>
+          </w:p>
+        </w:tc>
+        <w:tc>
+          <w:tcPr>
+            <w:tcW w:type="dxa" w:w="2000"/>
+            <w:tcBorders>
+              <w:top w:val="single" w:color="CCCCCC" w:sz="1"/>
+              <w:left w:val="single" w:color="CCCCCC" w:sz="1"/>
+              <w:bottom w:val="single" w:color="CCCCCC" w:sz="1"/>
+              <w:right w:val="single" w:color="CCCCCC" w:sz="1"/>
+            </w:tcBorders>
+            <w:tcMar>
+              <w:top w:type="dxa" w:w="80"/>
+              <w:left w:type="dxa" w:w="120"/>
+              <w:bottom w:type="dxa" w:w="80"/>
+              <w:right w:type="dxa" w:w="120"/>
+            </w:tcMar>
+          </w:tcPr>
+          <w:p>
+            <w:r>
+              <w:t xml:space="preserve">GAC worker / offense scrape</w:t>
+            </w:r>
+          </w:p>
+        </w:tc>
+        <w:tc>
+          <w:tcPr>
+            <w:tcW w:type="dxa" w:w="3500"/>
+            <w:tcBorders>
+              <w:top w:val="single" w:color="CCCCCC" w:sz="1"/>
+              <w:left w:val="single" w:color="CCCCCC" w:sz="1"/>
+              <w:bottom w:val="single" w:color="CCCCCC" w:sz="1"/>
+              <w:right w:val="single" w:color="CCCCCC" w:sz="1"/>
+            </w:tcBorders>
+            <w:tcMar>
+              <w:top w:type="dxa" w:w="80"/>
+              <w:left w:type="dxa" w:w="120"/>
+              <w:bottom w:type="dxa" w:w="80"/>
+              <w:right w:type="dxa" w:w="120"/>
+            </w:tcMar>
+          </w:tcPr>
+          <w:p>
+            <w:r>
+              <w:t xml:space="preserve">Fixed missing Offense recommendations in GAC Meta by teaching the worker to parse swgoh.gg’s /gac/who-to-attack/ page</w:t>
+            </w:r>
+          </w:p>
+        </w:tc>
+        <w:tc>
+          <w:tcPr>
+            <w:tcW w:type="dxa" w:w="2460"/>
+            <w:tcBorders>
+              <w:top w:val="single" w:color="CCCCCC" w:sz="1"/>
+              <w:left w:val="single" w:color="CCCCCC" w:sz="1"/>
+              <w:bottom w:val="single" w:color="CCCCCC" w:sz="1"/>
+              <w:right w:val="single" w:color="CCCCCC" w:sz="1"/>
+            </w:tcBorders>
+            <w:tcMar>
+              <w:top w:type="dxa" w:w="80"/>
+              <w:left w:type="dxa" w:w="120"/>
+              <w:bottom w:type="dxa" w:w="80"/>
+              <w:right w:type="dxa" w:w="120"/>
+            </w:tcMar>
+          </w:tcPr>
+          <w:p>
+            <w:r>
+              <w:t xml:space="preserve">Worker was pointing at /gac/who-to-attack/ for offense data but reusing parseGacSquadsHtml, which expects a &lt;table class="stat-table"&gt; of 3- or 5-member squads. The who-to-attack page has no such table — it renders 50 individual leads in &lt;div class="panel panel--size-sm"&gt; blocks with Seen/Win % stats. Added parseGacWhoToAttackHtml() + scrapeGacOffense() in tools/roster-worker/worker.js that extract each lead’s base ID + Seen + Win %, filter by season parity (odd = 3v3, even = 5v5), and emit 1-member offense "squads". Deployed. Verified: /?gac=3v3 returns 50 offense entries (e.g. SUPREMELEADERKYLOREN 81% / 179k sample); /?gac=5v5 returns 50 from season 76. Client cache TTL 12h; users hit the Refresh button to get the new data immediately.</w:t>
             </w:r>
           </w:p>
         </w:tc>

</xml_diff>

<commit_message>
GAC worker: dual-role squads from /gac/squads/ only
Drops the per-lead /gac/who-to-attack/ scrape. Every /gac/squads/ row
already carries both attack and defense data: Hold % is the defensive
win rate; its complement is the offensive win rate against that same
squad. Emit role='either' with both fields populated, so the same
squads populate both buckets in recommendSquads.

Result: Offense toggle now shows full 3- or 5-member squads (not
1-member attack-priority leads). Verified live — 42 squads for 3v3,
37 for 5v5, every entry has both rates.

Co-Authored-By: Claude Opus 4.7 <noreply@anthropic.com>
</commit_message>
<xml_diff>
--- a/docs/TODO.docx
+++ b/docs/TODO.docx
@@ -2969,7 +2969,7 @@
           </w:tcPr>
           <w:p>
             <w:r>
-              <w:t xml:space="preserve">GAC worker / offense scrape</w:t>
+              <w:t xml:space="preserve">GAC worker / dual-role squads</w:t>
             </w:r>
           </w:p>
         </w:tc>
@@ -2991,7 +2991,7 @@
           </w:tcPr>
           <w:p>
             <w:r>
-              <w:t xml:space="preserve">Fixed missing Offense recommendations in GAC Meta by teaching the worker to parse swgoh.gg’s /gac/who-to-attack/ page</w:t>
+              <w:t xml:space="preserve">Offense recommendations now populate with full 3- or 5-member squads from /gac/squads/ (offense = 1 - Hold %)</w:t>
             </w:r>
           </w:p>
         </w:tc>
@@ -3013,7 +3013,7 @@
           </w:tcPr>
           <w:p>
             <w:r>
-              <w:t xml:space="preserve">Worker was pointing at /gac/who-to-attack/ for offense data but reusing parseGacSquadsHtml, which expects a &lt;table class="stat-table"&gt; of 3- or 5-member squads. The who-to-attack page has no such table — it renders 50 individual leads in &lt;div class="panel panel--size-sm"&gt; blocks with Seen/Win % stats. Added parseGacWhoToAttackHtml() + scrapeGacOffense() in tools/roster-worker/worker.js that extract each lead’s base ID + Seen + Win %, filter by season parity (odd = 3v3, even = 5v5), and emit 1-member offense "squads". Deployed. Verified: /?gac=3v3 returns 50 offense entries (e.g. SUPREMELEADERKYLOREN 81% / 179k sample); /?gac=5v5 returns 50 from season 76. Client cache TTL 12h; users hit the Refresh button to get the new data immediately.</w:t>
+              <w:t xml:space="preserve">Original symptom: Offense toggle empty for both 3v3 and 5v5 because worker reused the stat-table parser against /gac/who-to-attack/, which has a totally different panel-per-lead layout. First attempt added a panel parser for that page but emitted 1-member "attack priority" entries, which isn’t what users want. Final fix drops the who-to-attack path entirely and treats every /gac/squads/ row as dual-role: Hold % is the defense win rate; its complement is the offense win rate against that same squad. parseGacSquadsHtml emits role=„either" squads with both offenseWinRate and defenseWinRate populated; scrapeGacSquads filters seasons by parity (odd=3v3, even=5v5) and returns the first matching page. Deployed. Verified: /?gac=3v3 returns 42 full-member squads with both rates (e.g. JABBATHEHUTT 73%/27%, 143k sample); /?gac=5v5 returns 37 from season 76 (e.g. LORDVADER 67%/33%, 88k). Client cache TTL 12h; users tap Refresh for immediate pickup.</w:t>
             </w:r>
           </w:p>
         </w:tc>

</xml_diff>

<commit_message>
GAC worker: scrape real attack + defense perspectives separately
Default /gac/squads/ returns top defenders (Hold %). Adding
?perspective=attack&sort=percent returns a completely different list:
top attackers (Win %). Top attacker = SITHPALPATINE solo at 96%; top
defender = JABBATHEHUTT trio at 27% hold. Not derivable from each
other, so scrape both.

scrapeGacSquads now fetches both perspectives in parallel, tags each
squad with its role, and emits one populated win-rate field per squad.
Bracket detection runs off the defense view only (attack view includes
legitimate 1-member solos like Wampa/Palpatine).

Verified: /?gac=3v3 -> 87 squads (42 def + 45 off); /?gac=5v5 -> 70
(37 def + 33 off).

Co-Authored-By: Claude Opus 4.7 <noreply@anthropic.com>
</commit_message>
<xml_diff>
--- a/docs/TODO.docx
+++ b/docs/TODO.docx
@@ -2969,7 +2969,7 @@
           </w:tcPr>
           <w:p>
             <w:r>
-              <w:t xml:space="preserve">GAC worker / dual-role squads</w:t>
+              <w:t xml:space="preserve">GAC worker / attack + defense perspectives</w:t>
             </w:r>
           </w:p>
         </w:tc>
@@ -2991,7 +2991,7 @@
           </w:tcPr>
           <w:p>
             <w:r>
-              <w:t xml:space="preserve">Offense recommendations now populate with full 3- or 5-member squads from /gac/squads/ (offense = 1 - Hold %)</w:t>
+              <w:t xml:space="preserve">Scrape both perspectives of /gac/squads/ so Offense shows real top attackers (not inverse of defense holds)</w:t>
             </w:r>
           </w:p>
         </w:tc>
@@ -3013,7 +3013,7 @@
           </w:tcPr>
           <w:p>
             <w:r>
-              <w:t xml:space="preserve">Original symptom: Offense toggle empty for both 3v3 and 5v5 because worker reused the stat-table parser against /gac/who-to-attack/, which has a totally different panel-per-lead layout. First attempt added a panel parser for that page but emitted 1-member "attack priority" entries, which isn’t what users want. Final fix drops the who-to-attack path entirely and treats every /gac/squads/ row as dual-role: Hold % is the defense win rate; its complement is the offense win rate against that same squad. parseGacSquadsHtml emits role=„either" squads with both offenseWinRate and defenseWinRate populated; scrapeGacSquads filters seasons by parity (odd=3v3, even=5v5) and returns the first matching page. Deployed. Verified: /?gac=3v3 returns 42 full-member squads with both rates (e.g. JABBATHEHUTT 73%/27%, 143k sample); /?gac=5v5 returns 37 from season 76 (e.g. LORDVADER 67%/33%, 88k). Client cache TTL 12h; users tap Refresh for immediate pickup.</w:t>
+              <w:t xml:space="preserve">swgoh.gg’s /gac/squads/ page takes a ?perspective=attack&amp;sort=percent query param that returns a completely different list (top attacking squads sorted by Win %) than the default defense view (top defenders sorted by Hold %). Top attacker (SITHPALPATINE solo, 96%) is not derivable from top defender (JABBATHEHUTT+BOUSHH+KRRSANTAN 27% hold) — they’re independent datasets. scrapeGacSquads now fetches both perspectives in parallel, parses each through parseGacSquadsHtml(html, role), and emits squads tagged with the appropriate role and single populated win-rate field. Attack view legitimately includes 1-member solo squads so bracket detection runs off the defense view only. Deployed. Verified: /?gac=3v3 returns 87 squads (42 def + 45 off); /?gac=5v5 returns 70 (37 def + 33 off).</w:t>
             </w:r>
           </w:p>
         </w:tc>

</xml_diff>

<commit_message>
Docs: note GacScreen no-roster toggle filter fix
Co-Authored-By: Claude Opus 4.7 <noreply@anthropic.com>
</commit_message>
<xml_diff>
--- a/docs/TODO.docx
+++ b/docs/TODO.docx
@@ -2919,6 +2919,101 @@
           <w:p>
             <w:r>
               <w:t xml:space="preserve">Previously SliceScreen rendered the ladder plan (“Slice to 5B”, cyan) AND a separate score-based Decision (“Filler — not worth slicing”) at the same time, which gave contradictory recommendations. Now renders one card driven by result.ladderPlan with Score: X/100 + reasonLines[0] folded in as footer lines. Old Decision card retained as fallback branch when ladderPlan is absent.</w:t>
+            </w:r>
+          </w:p>
+        </w:tc>
+      </w:tr>
+      <w:tr>
+        <w:tc>
+          <w:tcPr>
+            <w:tcW w:type="dxa" w:w="1400"/>
+            <w:tcBorders>
+              <w:top w:val="single" w:color="CCCCCC" w:sz="1"/>
+              <w:left w:val="single" w:color="CCCCCC" w:sz="1"/>
+              <w:bottom w:val="single" w:color="CCCCCC" w:sz="1"/>
+              <w:right w:val="single" w:color="CCCCCC" w:sz="1"/>
+            </w:tcBorders>
+            <w:shd w:fill="D5F0D5" w:val="clear"/>
+            <w:tcMar>
+              <w:top w:type="dxa" w:w="80"/>
+              <w:left w:type="dxa" w:w="120"/>
+              <w:bottom w:type="dxa" w:w="80"/>
+              <w:right w:type="dxa" w:w="120"/>
+            </w:tcMar>
+          </w:tcPr>
+          <w:p>
+            <w:r>
+              <w:rPr>
+                <w:b/>
+                <w:bCs/>
+              </w:rPr>
+              <w:t xml:space="preserve">DONE</w:t>
+            </w:r>
+          </w:p>
+        </w:tc>
+        <w:tc>
+          <w:tcPr>
+            <w:tcW w:type="dxa" w:w="2000"/>
+            <w:tcBorders>
+              <w:top w:val="single" w:color="CCCCCC" w:sz="1"/>
+              <w:left w:val="single" w:color="CCCCCC" w:sz="1"/>
+              <w:bottom w:val="single" w:color="CCCCCC" w:sz="1"/>
+              <w:right w:val="single" w:color="CCCCCC" w:sz="1"/>
+            </w:tcBorders>
+            <w:tcMar>
+              <w:top w:type="dxa" w:w="80"/>
+              <w:left w:type="dxa" w:w="120"/>
+              <w:bottom w:type="dxa" w:w="80"/>
+              <w:right w:type="dxa" w:w="120"/>
+            </w:tcMar>
+          </w:tcPr>
+          <w:p>
+            <w:r>
+              <w:t xml:space="preserve">GAC screen / no-roster toggle filter</w:t>
+            </w:r>
+          </w:p>
+        </w:tc>
+        <w:tc>
+          <w:tcPr>
+            <w:tcW w:type="dxa" w:w="3500"/>
+            <w:tcBorders>
+              <w:top w:val="single" w:color="CCCCCC" w:sz="1"/>
+              <w:left w:val="single" w:color="CCCCCC" w:sz="1"/>
+              <w:bottom w:val="single" w:color="CCCCCC" w:sz="1"/>
+              <w:right w:val="single" w:color="CCCCCC" w:sz="1"/>
+            </w:tcBorders>
+            <w:tcMar>
+              <w:top w:type="dxa" w:w="80"/>
+              <w:left w:type="dxa" w:w="120"/>
+              <w:bottom w:type="dxa" w:w="80"/>
+              <w:right w:type="dxa" w:w="120"/>
+            </w:tcMar>
+          </w:tcPr>
+          <w:p>
+            <w:r>
+              <w:t xml:space="preserve">Attack/Defense toggle now shows the right squads when no roster is linked</w:t>
+            </w:r>
+          </w:p>
+        </w:tc>
+        <w:tc>
+          <w:tcPr>
+            <w:tcW w:type="dxa" w:w="2460"/>
+            <w:tcBorders>
+              <w:top w:val="single" w:color="CCCCCC" w:sz="1"/>
+              <w:left w:val="single" w:color="CCCCCC" w:sz="1"/>
+              <w:bottom w:val="single" w:color="CCCCCC" w:sz="1"/>
+              <w:right w:val="single" w:color="CCCCCC" w:sz="1"/>
+            </w:tcBorders>
+            <w:tcMar>
+              <w:top w:type="dxa" w:w="80"/>
+              <w:left w:type="dxa" w:w="120"/>
+              <w:bottom w:type="dxa" w:w="80"/>
+              <w:right w:type="dxa" w:w="120"/>
+            </w:tcMar>
+          </w:tcPr>
+          <w:p>
+            <w:r>
+              <w:t xml:space="preserve">Previously GacScreen.squadsToShow returned payload.squads.slice(0,30) when hasRoster was false — worker concatenates defense first, then offense, so the unfiltered top 30 was always all defenders, and the Attack toggle showed Jabba/LV/Rey leads with empty win% (offenseWinRate is null on defense rows). No-roster branch now filters by sq.role === role and sorts by the matching win-rate metric. Wrapped in {squad, ownedCount: null, coverage: null} so the render code’s existing item.squad || item fallback keeps working. After install: Attack shows Sith Eternal 96% / Malgus trios 93% / etc. matching swgoh.gg.</w:t>
             </w:r>
           </w:p>
         </w:tc>

</xml_diff>

<commit_message>
TODO: tier-OCR coverage gap + missed-speed slice heuristic
Two OPEN items queued for future work: (1) scans miss the tier letter
on some cards despite the existing extractModTier patterns -- need
fresh per-tier OCR dumps to audit which patterns are failing; (2)
investigate whether the ladder should nudge toward B->A slicing when
speed has been missed on consecutive prior slices.

Co-Authored-By: Claude Opus 4.7 <noreply@anthropic.com>
</commit_message>
<xml_diff>
--- a/docs/TODO.docx
+++ b/docs/TODO.docx
@@ -3109,6 +3109,196 @@
           <w:p>
             <w:r>
               <w:t xml:space="preserve">swgoh.gg’s /gac/squads/ page takes a ?perspective=attack&amp;sort=percent query param that returns a completely different list (top attacking squads sorted by Win %) than the default defense view (top defenders sorted by Hold %). Top attacker (SITHPALPATINE solo, 96%) is not derivable from top defender (JABBATHEHUTT+BOUSHH+KRRSANTAN 27% hold) — they’re independent datasets. scrapeGacSquads now fetches both perspectives in parallel, parses each through parseGacSquadsHtml(html, role), and emits squads tagged with the appropriate role and single populated win-rate field. Attack view legitimately includes 1-member solo squads so bracket detection runs off the defense view only. Deployed. Verified: /?gac=3v3 returns 87 squads (42 def + 45 off); /?gac=5v5 returns 70 (37 def + 33 off).</w:t>
+            </w:r>
+          </w:p>
+        </w:tc>
+      </w:tr>
+      <w:tr>
+        <w:tc>
+          <w:tcPr>
+            <w:tcW w:type="dxa" w:w="1400"/>
+            <w:tcBorders>
+              <w:top w:val="single" w:color="CCCCCC" w:sz="1"/>
+              <w:left w:val="single" w:color="CCCCCC" w:sz="1"/>
+              <w:bottom w:val="single" w:color="CCCCCC" w:sz="1"/>
+              <w:right w:val="single" w:color="CCCCCC" w:sz="1"/>
+            </w:tcBorders>
+            <w:shd w:fill="FFF4CE" w:val="clear"/>
+            <w:tcMar>
+              <w:top w:type="dxa" w:w="80"/>
+              <w:left w:type="dxa" w:w="120"/>
+              <w:bottom w:type="dxa" w:w="80"/>
+              <w:right w:type="dxa" w:w="120"/>
+            </w:tcMar>
+          </w:tcPr>
+          <w:p>
+            <w:r>
+              <w:rPr>
+                <w:b/>
+                <w:bCs/>
+              </w:rPr>
+              <w:t xml:space="preserve">OPEN</w:t>
+            </w:r>
+          </w:p>
+        </w:tc>
+        <w:tc>
+          <w:tcPr>
+            <w:tcW w:type="dxa" w:w="2000"/>
+            <w:tcBorders>
+              <w:top w:val="single" w:color="CCCCCC" w:sz="1"/>
+              <w:left w:val="single" w:color="CCCCCC" w:sz="1"/>
+              <w:bottom w:val="single" w:color="CCCCCC" w:sz="1"/>
+              <w:right w:val="single" w:color="CCCCCC" w:sz="1"/>
+            </w:tcBorders>
+            <w:tcMar>
+              <w:top w:type="dxa" w:w="80"/>
+              <w:left w:type="dxa" w:w="120"/>
+              <w:bottom w:type="dxa" w:w="80"/>
+              <w:right w:type="dxa" w:w="120"/>
+            </w:tcMar>
+          </w:tcPr>
+          <w:p>
+            <w:r>
+              <w:t xml:space="preserve">Scanner / tier OCR incomplete coverage</w:t>
+            </w:r>
+          </w:p>
+        </w:tc>
+        <w:tc>
+          <w:tcPr>
+            <w:tcW w:type="dxa" w:w="3500"/>
+            <w:tcBorders>
+              <w:top w:val="single" w:color="CCCCCC" w:sz="1"/>
+              <w:left w:val="single" w:color="CCCCCC" w:sz="1"/>
+              <w:bottom w:val="single" w:color="CCCCCC" w:sz="1"/>
+              <w:right w:val="single" w:color="CCCCCC" w:sz="1"/>
+            </w:tcBorders>
+            <w:tcMar>
+              <w:top w:type="dxa" w:w="80"/>
+              <w:left w:type="dxa" w:w="120"/>
+              <w:bottom w:type="dxa" w:w="80"/>
+              <w:right w:type="dxa" w:w="120"/>
+            </w:tcMar>
+          </w:tcPr>
+          <w:p>
+            <w:r>
+              <w:t xml:space="preserve">Scans aren’t reliably grabbing all tier levels (D, C, B, A, etc.) — some mods come through with tier blank or wrong</w:t>
+            </w:r>
+          </w:p>
+        </w:tc>
+        <w:tc>
+          <w:tcPr>
+            <w:tcW w:type="dxa" w:w="2460"/>
+            <w:tcBorders>
+              <w:top w:val="single" w:color="CCCCCC" w:sz="1"/>
+              <w:left w:val="single" w:color="CCCCCC" w:sz="1"/>
+              <w:bottom w:val="single" w:color="CCCCCC" w:sz="1"/>
+              <w:right w:val="single" w:color="CCCCCC" w:sz="1"/>
+            </w:tcBorders>
+            <w:tcMar>
+              <w:top w:type="dxa" w:w="80"/>
+              <w:left w:type="dxa" w:w="120"/>
+              <w:bottom w:type="dxa" w:w="80"/>
+              <w:right w:type="dxa" w:w="120"/>
+            </w:tcMar>
+          </w:tcPr>
+          <w:p>
+            <w:r>
+              <w:t xml:space="preserve">extractModTier() in modCaptureParser.js has patterns for Tier C / LVL 15 · C / Level 15 A / the ^([A-E])\s+\(\d+\) stuck-tier fallback, but on-device captures still miss the letter on some cards. Collect fresh ocr-debug-last.txt dumps for each of 5E/5D/5C/5B/5A and audit which patterns are firing (or failing) per tier. Likely need: more tolerant spacing/punctuation between “LVL 15” and the letter, separate pattern for each tier’s actual on-card layout, and possibly a bounded region scan instead of full-text regex. Related: native tier-color detection would eliminate this dependency entirely.</w:t>
+            </w:r>
+          </w:p>
+        </w:tc>
+      </w:tr>
+      <w:tr>
+        <w:tc>
+          <w:tcPr>
+            <w:tcW w:type="dxa" w:w="1400"/>
+            <w:tcBorders>
+              <w:top w:val="single" w:color="CCCCCC" w:sz="1"/>
+              <w:left w:val="single" w:color="CCCCCC" w:sz="1"/>
+              <w:bottom w:val="single" w:color="CCCCCC" w:sz="1"/>
+              <w:right w:val="single" w:color="CCCCCC" w:sz="1"/>
+            </w:tcBorders>
+            <w:shd w:fill="FFF4CE" w:val="clear"/>
+            <w:tcMar>
+              <w:top w:type="dxa" w:w="80"/>
+              <w:left w:type="dxa" w:w="120"/>
+              <w:bottom w:type="dxa" w:w="80"/>
+              <w:right w:type="dxa" w:w="120"/>
+            </w:tcMar>
+          </w:tcPr>
+          <w:p>
+            <w:r>
+              <w:rPr>
+                <w:b/>
+                <w:bCs/>
+              </w:rPr>
+              <w:t xml:space="preserve">OPEN</w:t>
+            </w:r>
+          </w:p>
+        </w:tc>
+        <w:tc>
+          <w:tcPr>
+            <w:tcW w:type="dxa" w:w="2000"/>
+            <w:tcBorders>
+              <w:top w:val="single" w:color="CCCCCC" w:sz="1"/>
+              <w:left w:val="single" w:color="CCCCCC" w:sz="1"/>
+              <w:bottom w:val="single" w:color="CCCCCC" w:sz="1"/>
+              <w:right w:val="single" w:color="CCCCCC" w:sz="1"/>
+            </w:tcBorders>
+            <w:tcMar>
+              <w:top w:type="dxa" w:w="80"/>
+              <w:left w:type="dxa" w:w="120"/>
+              <w:bottom w:type="dxa" w:w="80"/>
+              <w:right w:type="dxa" w:w="120"/>
+            </w:tcMar>
+          </w:tcPr>
+          <w:p>
+            <w:r>
+              <w:t xml:space="preserve">Slice engine / missed-speed recovery</w:t>
+            </w:r>
+          </w:p>
+        </w:tc>
+        <w:tc>
+          <w:tcPr>
+            <w:tcW w:type="dxa" w:w="3500"/>
+            <w:tcBorders>
+              <w:top w:val="single" w:color="CCCCCC" w:sz="1"/>
+              <w:left w:val="single" w:color="CCCCCC" w:sz="1"/>
+              <w:bottom w:val="single" w:color="CCCCCC" w:sz="1"/>
+              <w:right w:val="single" w:color="CCCCCC" w:sz="1"/>
+            </w:tcBorders>
+            <w:tcMar>
+              <w:top w:type="dxa" w:w="80"/>
+              <w:left w:type="dxa" w:w="120"/>
+              <w:bottom w:type="dxa" w:w="80"/>
+              <w:right w:type="dxa" w:w="120"/>
+            </w:tcMar>
+          </w:tcPr>
+          <w:p>
+            <w:r>
+              <w:t xml:space="preserve">Investigate: should we recommend slicing B→A if the user has missed speed roll every other slice so far?</w:t>
+            </w:r>
+          </w:p>
+        </w:tc>
+        <w:tc>
+          <w:tcPr>
+            <w:tcW w:type="dxa" w:w="2460"/>
+            <w:tcBorders>
+              <w:top w:val="single" w:color="CCCCCC" w:sz="1"/>
+              <w:left w:val="single" w:color="CCCCCC" w:sz="1"/>
+              <w:bottom w:val="single" w:color="CCCCCC" w:sz="1"/>
+              <w:right w:val="single" w:color="CCCCCC" w:sz="1"/>
+            </w:tcBorders>
+            <w:tcMar>
+              <w:top w:type="dxa" w:w="80"/>
+              <w:left w:type="dxa" w:w="120"/>
+              <w:bottom w:type="dxa" w:w="80"/>
+              <w:right w:type="dxa" w:w="120"/>
+            </w:tcMar>
+          </w:tcPr>
+          <w:p>
+            <w:r>
+              <w:t xml:space="preserve">Current ladder logic evaluates each tier step independently based on current rolls + priority-stat fit. A mod at 5B with Speed at 1 roll despite being through 4 tier slices (5E→5D→5C→5B) has a pattern — missed the 1/4 shot at Speed three times in a row. Statistically the 5B→5A slice still has ~25% odds (independent roll), so pure probability says nothing changed. But from a user-psychology / sunk-cost standpoint, and given that Speed is the only secondary that truly matters long-term, there’s an argument for encouraging one more attempt at 5B→5A. Counter-argument: that’s gambler’s-fallacy territory and mats are scarce. Decision needed: do we add a “catalyst-streak” heuristic in sliceEngine.js that nudges toward one more slice after N consecutive missed Speed rolls, or do we leave the engine purely odds-based and let the user decide? Either way, the recommendation copy on SLICE_NEXT should probably call out the current Speed-roll count explicitly so users see the pattern.</w:t>
             </w:r>
           </w:p>
         </w:tc>

</xml_diff>

<commit_message>
TODO: Slice secondary-transfer gap + GAC Mine/All view toggle
Two more OPEN items: (1) some scanned secondaries don't make it to the
Slice tab even when the tier is picked up correctly -- need a trace on
a failing ocr-debug-last.txt to find where rows are being dropped;
(2) add a Mine/All toggle on the GAC tab so users can see the full
meta regardless of roster coverage, not just what they can field.

Co-Authored-By: Claude Opus 4.7 <noreply@anthropic.com>
</commit_message>
<xml_diff>
--- a/docs/TODO.docx
+++ b/docs/TODO.docx
@@ -3109,6 +3109,196 @@
           <w:p>
             <w:r>
               <w:t xml:space="preserve">swgoh.gg’s /gac/squads/ page takes a ?perspective=attack&amp;sort=percent query param that returns a completely different list (top attacking squads sorted by Win %) than the default defense view (top defenders sorted by Hold %). Top attacker (SITHPALPATINE solo, 96%) is not derivable from top defender (JABBATHEHUTT+BOUSHH+KRRSANTAN 27% hold) — they’re independent datasets. scrapeGacSquads now fetches both perspectives in parallel, parses each through parseGacSquadsHtml(html, role), and emits squads tagged with the appropriate role and single populated win-rate field. Attack view legitimately includes 1-member solo squads so bracket detection runs off the defense view only. Deployed. Verified: /?gac=3v3 returns 87 squads (42 def + 45 off); /?gac=5v5 returns 70 (37 def + 33 off).</w:t>
+            </w:r>
+          </w:p>
+        </w:tc>
+      </w:tr>
+      <w:tr>
+        <w:tc>
+          <w:tcPr>
+            <w:tcW w:type="dxa" w:w="1400"/>
+            <w:tcBorders>
+              <w:top w:val="single" w:color="CCCCCC" w:sz="1"/>
+              <w:left w:val="single" w:color="CCCCCC" w:sz="1"/>
+              <w:bottom w:val="single" w:color="CCCCCC" w:sz="1"/>
+              <w:right w:val="single" w:color="CCCCCC" w:sz="1"/>
+            </w:tcBorders>
+            <w:shd w:fill="FFF4CE" w:val="clear"/>
+            <w:tcMar>
+              <w:top w:type="dxa" w:w="80"/>
+              <w:left w:type="dxa" w:w="120"/>
+              <w:bottom w:type="dxa" w:w="80"/>
+              <w:right w:type="dxa" w:w="120"/>
+            </w:tcMar>
+          </w:tcPr>
+          <w:p>
+            <w:r>
+              <w:rPr>
+                <w:b/>
+                <w:bCs/>
+              </w:rPr>
+              <w:t xml:space="preserve">OPEN</w:t>
+            </w:r>
+          </w:p>
+        </w:tc>
+        <w:tc>
+          <w:tcPr>
+            <w:tcW w:type="dxa" w:w="2000"/>
+            <w:tcBorders>
+              <w:top w:val="single" w:color="CCCCCC" w:sz="1"/>
+              <w:left w:val="single" w:color="CCCCCC" w:sz="1"/>
+              <w:bottom w:val="single" w:color="CCCCCC" w:sz="1"/>
+              <w:right w:val="single" w:color="CCCCCC" w:sz="1"/>
+            </w:tcBorders>
+            <w:tcMar>
+              <w:top w:type="dxa" w:w="80"/>
+              <w:left w:type="dxa" w:w="120"/>
+              <w:bottom w:type="dxa" w:w="80"/>
+              <w:right w:type="dxa" w:w="120"/>
+            </w:tcMar>
+          </w:tcPr>
+          <w:p>
+            <w:r>
+              <w:t xml:space="preserve">Slice tab / incomplete secondary transfer</w:t>
+            </w:r>
+          </w:p>
+        </w:tc>
+        <w:tc>
+          <w:tcPr>
+            <w:tcW w:type="dxa" w:w="3500"/>
+            <w:tcBorders>
+              <w:top w:val="single" w:color="CCCCCC" w:sz="1"/>
+              <w:left w:val="single" w:color="CCCCCC" w:sz="1"/>
+              <w:bottom w:val="single" w:color="CCCCCC" w:sz="1"/>
+              <w:right w:val="single" w:color="CCCCCC" w:sz="1"/>
+            </w:tcBorders>
+            <w:tcMar>
+              <w:top w:type="dxa" w:w="80"/>
+              <w:left w:type="dxa" w:w="120"/>
+              <w:bottom w:type="dxa" w:w="80"/>
+              <w:right w:type="dxa" w:w="120"/>
+            </w:tcMar>
+          </w:tcPr>
+          <w:p>
+            <w:r>
+              <w:t xml:space="preserve">Not all secondaries from the scan are making it to the Slice tab — some mods come through with missing rows</w:t>
+            </w:r>
+          </w:p>
+        </w:tc>
+        <w:tc>
+          <w:tcPr>
+            <w:tcW w:type="dxa" w:w="2460"/>
+            <w:tcBorders>
+              <w:top w:val="single" w:color="CCCCCC" w:sz="1"/>
+              <w:left w:val="single" w:color="CCCCCC" w:sz="1"/>
+              <w:bottom w:val="single" w:color="CCCCCC" w:sz="1"/>
+              <w:right w:val="single" w:color="CCCCCC" w:sz="1"/>
+            </w:tcBorders>
+            <w:tcMar>
+              <w:top w:type="dxa" w:w="80"/>
+              <w:left w:type="dxa" w:w="120"/>
+              <w:bottom w:type="dxa" w:w="80"/>
+              <w:right w:type="dxa" w:w="120"/>
+            </w:tcMar>
+          </w:tcPr>
+          <w:p>
+            <w:r>
+              <w:t xml:space="preserve">Separate from the tier-letter OCR issue. Even when the tier is picked up correctly, some scans lose one or more secondaries on the handoff from parser → App.js slicePrefill → SliceScreen. Could be: (a) a regex in extractSecondaries dropping a row whose stat name has unusual spacing/OCR noise, (b) the primary-dedup backstop added last session filtering too aggressively when a flat stat shares a name with the primary, (c) slice(0, 4) capping before a real 4th secondary is seen because a phantom row snuck in earlier. Plan: collect a fresh ocr-debug-last.txt for a mod where a secondary is missing, trace through parser step-by-step against that dump, and compare parsed.secondaries vs. the on-card text.</w:t>
+            </w:r>
+          </w:p>
+        </w:tc>
+      </w:tr>
+      <w:tr>
+        <w:tc>
+          <w:tcPr>
+            <w:tcW w:type="dxa" w:w="1400"/>
+            <w:tcBorders>
+              <w:top w:val="single" w:color="CCCCCC" w:sz="1"/>
+              <w:left w:val="single" w:color="CCCCCC" w:sz="1"/>
+              <w:bottom w:val="single" w:color="CCCCCC" w:sz="1"/>
+              <w:right w:val="single" w:color="CCCCCC" w:sz="1"/>
+            </w:tcBorders>
+            <w:shd w:fill="FFF4CE" w:val="clear"/>
+            <w:tcMar>
+              <w:top w:type="dxa" w:w="80"/>
+              <w:left w:type="dxa" w:w="120"/>
+              <w:bottom w:type="dxa" w:w="80"/>
+              <w:right w:type="dxa" w:w="120"/>
+            </w:tcMar>
+          </w:tcPr>
+          <w:p>
+            <w:r>
+              <w:rPr>
+                <w:b/>
+                <w:bCs/>
+              </w:rPr>
+              <w:t xml:space="preserve">OPEN</w:t>
+            </w:r>
+          </w:p>
+        </w:tc>
+        <w:tc>
+          <w:tcPr>
+            <w:tcW w:type="dxa" w:w="2000"/>
+            <w:tcBorders>
+              <w:top w:val="single" w:color="CCCCCC" w:sz="1"/>
+              <w:left w:val="single" w:color="CCCCCC" w:sz="1"/>
+              <w:bottom w:val="single" w:color="CCCCCC" w:sz="1"/>
+              <w:right w:val="single" w:color="CCCCCC" w:sz="1"/>
+            </w:tcBorders>
+            <w:tcMar>
+              <w:top w:type="dxa" w:w="80"/>
+              <w:left w:type="dxa" w:w="120"/>
+              <w:bottom w:type="dxa" w:w="80"/>
+              <w:right w:type="dxa" w:w="120"/>
+            </w:tcMar>
+          </w:tcPr>
+          <w:p>
+            <w:r>
+              <w:t xml:space="preserve">GAC tab / roster vs meta view toggle</w:t>
+            </w:r>
+          </w:p>
+        </w:tc>
+        <w:tc>
+          <w:tcPr>
+            <w:tcW w:type="dxa" w:w="3500"/>
+            <w:tcBorders>
+              <w:top w:val="single" w:color="CCCCCC" w:sz="1"/>
+              <w:left w:val="single" w:color="CCCCCC" w:sz="1"/>
+              <w:bottom w:val="single" w:color="CCCCCC" w:sz="1"/>
+              <w:right w:val="single" w:color="CCCCCC" w:sz="1"/>
+            </w:tcBorders>
+            <w:tcMar>
+              <w:top w:type="dxa" w:w="80"/>
+              <w:left w:type="dxa" w:w="120"/>
+              <w:bottom w:type="dxa" w:w="80"/>
+              <w:right w:type="dxa" w:w="120"/>
+            </w:tcMar>
+          </w:tcPr>
+          <w:p>
+            <w:r>
+              <w:t xml:space="preserve">Add a second display mode that shows all meta squads regardless of roster coverage</w:t>
+            </w:r>
+          </w:p>
+        </w:tc>
+        <w:tc>
+          <w:tcPr>
+            <w:tcW w:type="dxa" w:w="2460"/>
+            <w:tcBorders>
+              <w:top w:val="single" w:color="CCCCCC" w:sz="1"/>
+              <w:left w:val="single" w:color="CCCCCC" w:sz="1"/>
+              <w:bottom w:val="single" w:color="CCCCCC" w:sz="1"/>
+              <w:right w:val="single" w:color="CCCCCC" w:sz="1"/>
+            </w:tcBorders>
+            <w:tcMar>
+              <w:top w:type="dxa" w:w="80"/>
+              <w:left w:type="dxa" w:w="120"/>
+              <w:bottom w:type="dxa" w:w="80"/>
+              <w:right w:type="dxa" w:w="120"/>
+            </w:tcMar>
+          </w:tcPr>
+          <w:p>
+            <w:r>
+              <w:t xml:space="preserve">Current GAC Meta tab filters to squads where the user owns ≥60% of members (MIN_COVERAGE in gacMetaService.js). That’s the right default for “what can I actually field”. Add a second toggle (alongside Attack/Defense) that shows the raw top meta regardless of what’s owned — useful for players who want to see what to strive for / farm toward. Implementation: a pill toggle “Mine / All” in GacScreen.js that swaps between ranked.offense/ranked.defense (current) and a role-filtered sort of payload.squads (no coverage gate). Missing members should still render red chips so users can see what they’d need. Preserve the existing “no roster linked” fallback as a special case of the “All” mode.</w:t>
             </w:r>
           </w:p>
         </w:tc>

</xml_diff>

<commit_message>
GacScreen: My roster / All meta view toggle
Adds a third toggle row (shown when a roster is linked) that switches
between the existing coverage-filtered ranking (>=60% members owned)
and a full-meta view sorted by raw win-rate. All-meta mode still
computes per-squad ownedCount + coverage so missing-member red chips
keep working. No-roster case collapses into the same code path via
showAll = !hasRoster || view === 'all'.

Co-Authored-By: Claude Opus 4.7 <noreply@anthropic.com>
</commit_message>
<xml_diff>
--- a/docs/TODO.docx
+++ b/docs/TODO.docx
@@ -3218,7 +3218,7 @@
               <w:bottom w:val="single" w:color="CCCCCC" w:sz="1"/>
               <w:right w:val="single" w:color="CCCCCC" w:sz="1"/>
             </w:tcBorders>
-            <w:shd w:fill="FFF4CE" w:val="clear"/>
+            <w:shd w:fill="D5F0D5" w:val="clear"/>
             <w:tcMar>
               <w:top w:type="dxa" w:w="80"/>
               <w:left w:type="dxa" w:w="120"/>
@@ -3232,7 +3232,7 @@
                 <w:b/>
                 <w:bCs/>
               </w:rPr>
-              <w:t xml:space="preserve">OPEN</w:t>
+              <w:t xml:space="preserve">DONE</w:t>
             </w:r>
           </w:p>
         </w:tc>
@@ -3276,7 +3276,7 @@
           </w:tcPr>
           <w:p>
             <w:r>
-              <w:t xml:space="preserve">Add a second display mode that shows all meta squads regardless of roster coverage</w:t>
+              <w:t xml:space="preserve">Added a My roster / All meta toggle so users can see the full meta regardless of coverage</w:t>
             </w:r>
           </w:p>
         </w:tc>
@@ -3298,7 +3298,7 @@
           </w:tcPr>
           <w:p>
             <w:r>
-              <w:t xml:space="preserve">Current GAC Meta tab filters to squads where the user owns ≥60% of members (MIN_COVERAGE in gacMetaService.js). That’s the right default for “what can I actually field”. Add a second toggle (alongside Attack/Defense) that shows the raw top meta regardless of what’s owned — useful for players who want to see what to strive for / farm toward. Implementation: a pill toggle “Mine / All” in GacScreen.js that swaps between ranked.offense/ranked.defense (current) and a role-filtered sort of payload.squads (no coverage gate). Missing members should still render red chips so users can see what they’d need. Preserve the existing “no roster linked” fallback as a special case of the “All” mode.</w:t>
+              <w:t xml:space="preserve">GacScreen now has a third toggle row (shown only when a roster is linked) that switches between ranked.offense/ranked.defense (Mine, ≥60% coverage gate) and a role-filtered win-rate sort of payload.squads (All, no gate). All mode still computes per-squad coverage/ownedCount so red-chip rendering for missing members keeps working. No-roster case already behaves like All — collapsed into the same code path via const showAll = !hasRoster || view === "all". Subtitle + summary banner adjusted to reflect the active view.</w:t>
             </w:r>
           </w:p>
         </w:tc>

</xml_diff>

<commit_message>
TODO: permissions panel status bug + full shape/set/tier coverage sweep
Co-Authored-By: Claude Opus 4.7 <noreply@anthropic.com>
</commit_message>
<xml_diff>
--- a/docs/TODO.docx
+++ b/docs/TODO.docx
@@ -4534,6 +4534,196 @@
           <w:p>
             <w:r>
               <w:t xml:space="preserve">compareScannedVsEquipped() in sliceEngine.js:1130 scores both mods against the match priorities, then returns verdict (rawDelta&gt;4 Upgrade, &lt;-6 Downgrade, else Sidegrade), scoreDelta, and per-priority stat deltas for the badge label. Archive on next sweep.</w:t>
+            </w:r>
+          </w:p>
+        </w:tc>
+      </w:tr>
+      <w:tr>
+        <w:tc>
+          <w:tcPr>
+            <w:tcW w:type="dxa" w:w="1400"/>
+            <w:tcBorders>
+              <w:top w:val="single" w:color="CCCCCC" w:sz="1"/>
+              <w:left w:val="single" w:color="CCCCCC" w:sz="1"/>
+              <w:bottom w:val="single" w:color="CCCCCC" w:sz="1"/>
+              <w:right w:val="single" w:color="CCCCCC" w:sz="1"/>
+            </w:tcBorders>
+            <w:shd w:fill="FFF4CE" w:val="clear"/>
+            <w:tcMar>
+              <w:top w:type="dxa" w:w="80"/>
+              <w:left w:type="dxa" w:w="120"/>
+              <w:bottom w:type="dxa" w:w="80"/>
+              <w:right w:type="dxa" w:w="120"/>
+            </w:tcMar>
+          </w:tcPr>
+          <w:p>
+            <w:r>
+              <w:rPr>
+                <w:b/>
+                <w:bCs/>
+              </w:rPr>
+              <w:t xml:space="preserve">OPEN</w:t>
+            </w:r>
+          </w:p>
+        </w:tc>
+        <w:tc>
+          <w:tcPr>
+            <w:tcW w:type="dxa" w:w="2000"/>
+            <w:tcBorders>
+              <w:top w:val="single" w:color="CCCCCC" w:sz="1"/>
+              <w:left w:val="single" w:color="CCCCCC" w:sz="1"/>
+              <w:bottom w:val="single" w:color="CCCCCC" w:sz="1"/>
+              <w:right w:val="single" w:color="CCCCCC" w:sz="1"/>
+            </w:tcBorders>
+            <w:tcMar>
+              <w:top w:type="dxa" w:w="80"/>
+              <w:left w:type="dxa" w:w="120"/>
+              <w:bottom w:type="dxa" w:w="80"/>
+              <w:right w:type="dxa" w:w="120"/>
+            </w:tcMar>
+          </w:tcPr>
+          <w:p>
+            <w:r>
+              <w:t xml:space="preserve">Permissions UX</w:t>
+            </w:r>
+          </w:p>
+        </w:tc>
+        <w:tc>
+          <w:tcPr>
+            <w:tcW w:type="dxa" w:w="3500"/>
+            <w:tcBorders>
+              <w:top w:val="single" w:color="CCCCCC" w:sz="1"/>
+              <w:left w:val="single" w:color="CCCCCC" w:sz="1"/>
+              <w:bottom w:val="single" w:color="CCCCCC" w:sz="1"/>
+              <w:right w:val="single" w:color="CCCCCC" w:sz="1"/>
+            </w:tcBorders>
+            <w:tcMar>
+              <w:top w:type="dxa" w:w="80"/>
+              <w:left w:type="dxa" w:w="120"/>
+              <w:bottom w:type="dxa" w:w="80"/>
+              <w:right w:type="dxa" w:w="120"/>
+            </w:tcMar>
+          </w:tcPr>
+          <w:p>
+            <w:r>
+              <w:t xml:space="preserve">Screen Capture row in the in-app permissions list stays on "Not approved" even after the user has granted MediaProjection and a successful scan</w:t>
+            </w:r>
+          </w:p>
+        </w:tc>
+        <w:tc>
+          <w:tcPr>
+            <w:tcW w:type="dxa" w:w="2460"/>
+            <w:tcBorders>
+              <w:top w:val="single" w:color="CCCCCC" w:sz="1"/>
+              <w:left w:val="single" w:color="CCCCCC" w:sz="1"/>
+              <w:bottom w:val="single" w:color="CCCCCC" w:sz="1"/>
+              <w:right w:val="single" w:color="CCCCCC" w:sz="1"/>
+            </w:tcBorders>
+            <w:tcMar>
+              <w:top w:type="dxa" w:w="80"/>
+              <w:left w:type="dxa" w:w="120"/>
+              <w:bottom w:type="dxa" w:w="80"/>
+              <w:right w:type="dxa" w:w="120"/>
+            </w:tcMar>
+          </w:tcPr>
+          <w:p>
+            <w:r>
+              <w:t xml:space="preserve">Cosmetic only — scans work. The permissions panel isn’t observing MediaProjection state. Likely fix: subscribe to ModOverlayCaptureModule status changes (or re-poll on resume) so the row flips to Granted after the user completes the system consent dialog.</w:t>
+            </w:r>
+          </w:p>
+        </w:tc>
+      </w:tr>
+      <w:tr>
+        <w:tc>
+          <w:tcPr>
+            <w:tcW w:type="dxa" w:w="1400"/>
+            <w:tcBorders>
+              <w:top w:val="single" w:color="CCCCCC" w:sz="1"/>
+              <w:left w:val="single" w:color="CCCCCC" w:sz="1"/>
+              <w:bottom w:val="single" w:color="CCCCCC" w:sz="1"/>
+              <w:right w:val="single" w:color="CCCCCC" w:sz="1"/>
+            </w:tcBorders>
+            <w:shd w:fill="FFF4CE" w:val="clear"/>
+            <w:tcMar>
+              <w:top w:type="dxa" w:w="80"/>
+              <w:left w:type="dxa" w:w="120"/>
+              <w:bottom w:type="dxa" w:w="80"/>
+              <w:right w:type="dxa" w:w="120"/>
+            </w:tcMar>
+          </w:tcPr>
+          <w:p>
+            <w:r>
+              <w:rPr>
+                <w:b/>
+                <w:bCs/>
+              </w:rPr>
+              <w:t xml:space="preserve">OPEN</w:t>
+            </w:r>
+          </w:p>
+        </w:tc>
+        <w:tc>
+          <w:tcPr>
+            <w:tcW w:type="dxa" w:w="2000"/>
+            <w:tcBorders>
+              <w:top w:val="single" w:color="CCCCCC" w:sz="1"/>
+              <w:left w:val="single" w:color="CCCCCC" w:sz="1"/>
+              <w:bottom w:val="single" w:color="CCCCCC" w:sz="1"/>
+              <w:right w:val="single" w:color="CCCCCC" w:sz="1"/>
+            </w:tcBorders>
+            <w:tcMar>
+              <w:top w:type="dxa" w:w="80"/>
+              <w:left w:type="dxa" w:w="120"/>
+              <w:bottom w:type="dxa" w:w="80"/>
+              <w:right w:type="dxa" w:w="120"/>
+            </w:tcMar>
+          </w:tcPr>
+          <w:p>
+            <w:r>
+              <w:t xml:space="preserve">Scanner / coverage verification</w:t>
+            </w:r>
+          </w:p>
+        </w:tc>
+        <w:tc>
+          <w:tcPr>
+            <w:tcW w:type="dxa" w:w="3500"/>
+            <w:tcBorders>
+              <w:top w:val="single" w:color="CCCCCC" w:sz="1"/>
+              <w:left w:val="single" w:color="CCCCCC" w:sz="1"/>
+              <w:bottom w:val="single" w:color="CCCCCC" w:sz="1"/>
+              <w:right w:val="single" w:color="CCCCCC" w:sz="1"/>
+            </w:tcBorders>
+            <w:tcMar>
+              <w:top w:type="dxa" w:w="80"/>
+              <w:left w:type="dxa" w:w="120"/>
+              <w:bottom w:type="dxa" w:w="80"/>
+              <w:right w:type="dxa" w:w="120"/>
+            </w:tcMar>
+          </w:tcPr>
+          <w:p>
+            <w:r>
+              <w:t xml:space="preserve">Verify classifier on a full matrix: every shape × every set × every primary color/tier × every mod level/dot-tier</w:t>
+            </w:r>
+          </w:p>
+        </w:tc>
+        <w:tc>
+          <w:tcPr>
+            <w:tcW w:type="dxa" w:w="2460"/>
+            <w:tcBorders>
+              <w:top w:val="single" w:color="CCCCCC" w:sz="1"/>
+              <w:left w:val="single" w:color="CCCCCC" w:sz="1"/>
+              <w:bottom w:val="single" w:color="CCCCCC" w:sz="1"/>
+              <w:right w:val="single" w:color="CCCCCC" w:sz="1"/>
+            </w:tcBorders>
+            <w:tcMar>
+              <w:top w:type="dxa" w:w="80"/>
+              <w:left w:type="dxa" w:w="120"/>
+              <w:bottom w:type="dxa" w:w="80"/>
+              <w:right w:type="dxa" w:w="120"/>
+            </w:tcMar>
+          </w:tcPr>
+          <w:p>
+            <w:r>
+              <w:t xml:space="preserve">Following the variant-consensus tiebreak fix (mask-only wins when outer rim is rounded on a Diamond), we need an end-to-end sweep. Capture at least one scan per cell of the matrix: 6 shapes (Square/Arrow/Diamond/Triangle/Circle/Cross) × all sets (Health/Defense/Crit Chance/Crit Dmg/Offense/Potency/Tenacity/Speed) × tier colors (E gray/D green/C blue/B purple/A gold) × dot levels (5 vs 6) × primaries. Log shape/set classification result + OCR primary+secondaries per cell, then fix misses. Batch the captures into tools/debug_out/ with a naming convention so we can regression-test later.</w:t>
             </w:r>
           </w:p>
         </w:tc>

</xml_diff>

<commit_message>
TODO: close permissions UX + missed-speed heuristic (both DONE)
Permissions row now reflects MediaProjection grant post-install (user
verified). Missed-speed streak nudge decided against — slicing a low-Speed
mod on streak logic wastes mats; the high-Speed partial case is already
covered by SLICE_NEXT.

Co-Authored-By: Claude Opus 4.7 <noreply@anthropic.com>
</commit_message>
<xml_diff>
--- a/docs/TODO.docx
+++ b/docs/TODO.docx
@@ -3408,6 +3408,101 @@
               <w:bottom w:val="single" w:color="CCCCCC" w:sz="1"/>
               <w:right w:val="single" w:color="CCCCCC" w:sz="1"/>
             </w:tcBorders>
+            <w:shd w:fill="D5F0D5" w:val="clear"/>
+            <w:tcMar>
+              <w:top w:type="dxa" w:w="80"/>
+              <w:left w:type="dxa" w:w="120"/>
+              <w:bottom w:type="dxa" w:w="80"/>
+              <w:right w:type="dxa" w:w="120"/>
+            </w:tcMar>
+          </w:tcPr>
+          <w:p>
+            <w:r>
+              <w:rPr>
+                <w:b/>
+                <w:bCs/>
+              </w:rPr>
+              <w:t xml:space="preserve">DONE</w:t>
+            </w:r>
+          </w:p>
+        </w:tc>
+        <w:tc>
+          <w:tcPr>
+            <w:tcW w:type="dxa" w:w="2000"/>
+            <w:tcBorders>
+              <w:top w:val="single" w:color="CCCCCC" w:sz="1"/>
+              <w:left w:val="single" w:color="CCCCCC" w:sz="1"/>
+              <w:bottom w:val="single" w:color="CCCCCC" w:sz="1"/>
+              <w:right w:val="single" w:color="CCCCCC" w:sz="1"/>
+            </w:tcBorders>
+            <w:tcMar>
+              <w:top w:type="dxa" w:w="80"/>
+              <w:left w:type="dxa" w:w="120"/>
+              <w:bottom w:type="dxa" w:w="80"/>
+              <w:right w:type="dxa" w:w="120"/>
+            </w:tcMar>
+          </w:tcPr>
+          <w:p>
+            <w:r>
+              <w:t xml:space="preserve">Slice engine / missed-speed recovery</w:t>
+            </w:r>
+          </w:p>
+        </w:tc>
+        <w:tc>
+          <w:tcPr>
+            <w:tcW w:type="dxa" w:w="3500"/>
+            <w:tcBorders>
+              <w:top w:val="single" w:color="CCCCCC" w:sz="1"/>
+              <w:left w:val="single" w:color="CCCCCC" w:sz="1"/>
+              <w:bottom w:val="single" w:color="CCCCCC" w:sz="1"/>
+              <w:right w:val="single" w:color="CCCCCC" w:sz="1"/>
+            </w:tcBorders>
+            <w:tcMar>
+              <w:top w:type="dxa" w:w="80"/>
+              <w:left w:type="dxa" w:w="120"/>
+              <w:bottom w:type="dxa" w:w="80"/>
+              <w:right w:type="dxa" w:w="120"/>
+            </w:tcMar>
+          </w:tcPr>
+          <w:p>
+            <w:r>
+              <w:t xml:space="preserve">Decided against a “catalyst-streak” nudge: slicing a low-Speed mod on streak logic would waste mats.</w:t>
+            </w:r>
+          </w:p>
+        </w:tc>
+        <w:tc>
+          <w:tcPr>
+            <w:tcW w:type="dxa" w:w="2460"/>
+            <w:tcBorders>
+              <w:top w:val="single" w:color="CCCCCC" w:sz="1"/>
+              <w:left w:val="single" w:color="CCCCCC" w:sz="1"/>
+              <w:bottom w:val="single" w:color="CCCCCC" w:sz="1"/>
+              <w:right w:val="single" w:color="CCCCCC" w:sz="1"/>
+            </w:tcBorders>
+            <w:tcMar>
+              <w:top w:type="dxa" w:w="80"/>
+              <w:left w:type="dxa" w:w="120"/>
+              <w:bottom w:type="dxa" w:w="80"/>
+              <w:right w:type="dxa" w:w="120"/>
+            </w:tcMar>
+          </w:tcPr>
+          <w:p>
+            <w:r>
+              <w:t xml:space="preserve">A mod with Speed missed 3× is probably sitting at 3–5 Speed, and one more 25% hit still doesn’t clear the keeper threshold (~10+). The only case where an extra slice helps is when current Speed is already ≥10 and one more roll locks it in — and the ladder already covers that via SLICE_NEXT on high-Speed partials. No new heuristic needed; archive.</w:t>
+            </w:r>
+          </w:p>
+        </w:tc>
+      </w:tr>
+      <w:tr>
+        <w:tc>
+          <w:tcPr>
+            <w:tcW w:type="dxa" w:w="1400"/>
+            <w:tcBorders>
+              <w:top w:val="single" w:color="CCCCCC" w:sz="1"/>
+              <w:left w:val="single" w:color="CCCCCC" w:sz="1"/>
+              <w:bottom w:val="single" w:color="CCCCCC" w:sz="1"/>
+              <w:right w:val="single" w:color="CCCCCC" w:sz="1"/>
+            </w:tcBorders>
             <w:shd w:fill="FFF4CE" w:val="clear"/>
             <w:tcMar>
               <w:top w:type="dxa" w:w="80"/>
@@ -3444,101 +3539,6 @@
           </w:tcPr>
           <w:p>
             <w:r>
-              <w:t xml:space="preserve">Slice engine / missed-speed recovery</w:t>
-            </w:r>
-          </w:p>
-        </w:tc>
-        <w:tc>
-          <w:tcPr>
-            <w:tcW w:type="dxa" w:w="3500"/>
-            <w:tcBorders>
-              <w:top w:val="single" w:color="CCCCCC" w:sz="1"/>
-              <w:left w:val="single" w:color="CCCCCC" w:sz="1"/>
-              <w:bottom w:val="single" w:color="CCCCCC" w:sz="1"/>
-              <w:right w:val="single" w:color="CCCCCC" w:sz="1"/>
-            </w:tcBorders>
-            <w:tcMar>
-              <w:top w:type="dxa" w:w="80"/>
-              <w:left w:type="dxa" w:w="120"/>
-              <w:bottom w:type="dxa" w:w="80"/>
-              <w:right w:type="dxa" w:w="120"/>
-            </w:tcMar>
-          </w:tcPr>
-          <w:p>
-            <w:r>
-              <w:t xml:space="preserve">Investigate: should we recommend slicing B→A if the user has missed speed roll every other slice so far?</w:t>
-            </w:r>
-          </w:p>
-        </w:tc>
-        <w:tc>
-          <w:tcPr>
-            <w:tcW w:type="dxa" w:w="2460"/>
-            <w:tcBorders>
-              <w:top w:val="single" w:color="CCCCCC" w:sz="1"/>
-              <w:left w:val="single" w:color="CCCCCC" w:sz="1"/>
-              <w:bottom w:val="single" w:color="CCCCCC" w:sz="1"/>
-              <w:right w:val="single" w:color="CCCCCC" w:sz="1"/>
-            </w:tcBorders>
-            <w:tcMar>
-              <w:top w:type="dxa" w:w="80"/>
-              <w:left w:type="dxa" w:w="120"/>
-              <w:bottom w:type="dxa" w:w="80"/>
-              <w:right w:type="dxa" w:w="120"/>
-            </w:tcMar>
-          </w:tcPr>
-          <w:p>
-            <w:r>
-              <w:t xml:space="preserve">Current ladder logic evaluates each tier step independently based on current rolls + priority-stat fit. A mod at 5B with Speed at 1 roll despite being through 4 tier slices (5E→5D→5C→5B) has a pattern — missed the 1/4 shot at Speed three times in a row. Statistically the 5B→5A slice still has ~25% odds (independent roll), so pure probability says nothing changed. But from a user-psychology / sunk-cost standpoint, and given that Speed is the only secondary that truly matters long-term, there’s an argument for encouraging one more attempt at 5B→5A. Counter-argument: that’s gambler’s-fallacy territory and mats are scarce. Decision needed: do we add a “catalyst-streak” heuristic in sliceEngine.js that nudges toward one more slice after N consecutive missed Speed rolls, or do we leave the engine purely odds-based and let the user decide? Either way, the recommendation copy on SLICE_NEXT should probably call out the current Speed-roll count explicitly so users see the pattern.</w:t>
-            </w:r>
-          </w:p>
-        </w:tc>
-      </w:tr>
-      <w:tr>
-        <w:tc>
-          <w:tcPr>
-            <w:tcW w:type="dxa" w:w="1400"/>
-            <w:tcBorders>
-              <w:top w:val="single" w:color="CCCCCC" w:sz="1"/>
-              <w:left w:val="single" w:color="CCCCCC" w:sz="1"/>
-              <w:bottom w:val="single" w:color="CCCCCC" w:sz="1"/>
-              <w:right w:val="single" w:color="CCCCCC" w:sz="1"/>
-            </w:tcBorders>
-            <w:shd w:fill="FFF4CE" w:val="clear"/>
-            <w:tcMar>
-              <w:top w:type="dxa" w:w="80"/>
-              <w:left w:type="dxa" w:w="120"/>
-              <w:bottom w:type="dxa" w:w="80"/>
-              <w:right w:type="dxa" w:w="120"/>
-            </w:tcMar>
-          </w:tcPr>
-          <w:p>
-            <w:r>
-              <w:rPr>
-                <w:b/>
-                <w:bCs/>
-              </w:rPr>
-              <w:t xml:space="preserve">OPEN</w:t>
-            </w:r>
-          </w:p>
-        </w:tc>
-        <w:tc>
-          <w:tcPr>
-            <w:tcW w:type="dxa" w:w="2000"/>
-            <w:tcBorders>
-              <w:top w:val="single" w:color="CCCCCC" w:sz="1"/>
-              <w:left w:val="single" w:color="CCCCCC" w:sz="1"/>
-              <w:bottom w:val="single" w:color="CCCCCC" w:sz="1"/>
-              <w:right w:val="single" w:color="CCCCCC" w:sz="1"/>
-            </w:tcBorders>
-            <w:tcMar>
-              <w:top w:type="dxa" w:w="80"/>
-              <w:left w:type="dxa" w:w="120"/>
-              <w:bottom w:type="dxa" w:w="80"/>
-              <w:right w:type="dxa" w:w="120"/>
-            </w:tcMar>
-          </w:tcPr>
-          <w:p>
-            <w:r>
               <w:t xml:space="preserve">Scanner / native tier-color detection</w:t>
             </w:r>
           </w:p>
@@ -4548,7 +4548,7 @@
               <w:bottom w:val="single" w:color="CCCCCC" w:sz="1"/>
               <w:right w:val="single" w:color="CCCCCC" w:sz="1"/>
             </w:tcBorders>
-            <w:shd w:fill="FFF4CE" w:val="clear"/>
+            <w:shd w:fill="D5F0D5" w:val="clear"/>
             <w:tcMar>
               <w:top w:type="dxa" w:w="80"/>
               <w:left w:type="dxa" w:w="120"/>
@@ -4562,7 +4562,7 @@
                 <w:b/>
                 <w:bCs/>
               </w:rPr>
-              <w:t xml:space="preserve">OPEN</w:t>
+              <w:t xml:space="preserve">DONE</w:t>
             </w:r>
           </w:p>
         </w:tc>
@@ -4606,7 +4606,7 @@
           </w:tcPr>
           <w:p>
             <w:r>
-              <w:t xml:space="preserve">Screen Capture row in the in-app permissions list stays on "Not approved" even after the user has granted MediaProjection and a successful scan</w:t>
+              <w:t xml:space="preserve">Screen Capture row now reflects MediaProjection grant after a successful scan</w:t>
             </w:r>
           </w:p>
         </w:tc>
@@ -4628,7 +4628,7 @@
           </w:tcPr>
           <w:p>
             <w:r>
-              <w:t xml:space="preserve">Cosmetic only — scans work. The permissions panel isn’t observing MediaProjection state. Likely fix: subscribe to ModOverlayCaptureModule status changes (or re-poll on resume) so the row flips to Granted after the user completes the system consent dialog.</w:t>
+              <w:t xml:space="preserve">User-verified on the 2026-04-22 install. Resolved without a targeted code change — likely fell out of the capture/recommendation plumbing refresh in the same build. Archive on next sweep.</w:t>
             </w:r>
           </w:p>
         </w:tc>

</xml_diff>

<commit_message>
Slice engine: tighter 5A->6E gate + unified overlay verdict
Dropped the speedBacked path (2 rolls + 55% quality -> Usable) and added
a Speed value floor of 14 to speedHitHard. Mods with low-value Speed on
few rolls now fall to SLICE_NEXT instead of auto-committing 6-dot mats.
Aligns with the community "Speed >= 15 before 6-dot" rule.

Also unified overlayRecommendation with SliceScreen: both now evaluate
against the full DECODED_CHARS pool so roster filtering can't produce
conflicting verdicts (overlay "don't slice" vs Slice tab "->6E").
Ownership stays visible via the per-character status badges.

GuideModal Slicer page, READMEBEFOREEDITING.md, and TODO.docx updated.

Co-Authored-By: Claude Opus 4.7 <noreply@anthropic.com>
</commit_message>
<xml_diff>
--- a/docs/TODO.docx
+++ b/docs/TODO.docx
@@ -4724,6 +4724,101 @@
           <w:p>
             <w:r>
               <w:t xml:space="preserve">Following the variant-consensus tiebreak fix (mask-only wins when outer rim is rounded on a Diamond), we need an end-to-end sweep. Capture at least one scan per cell of the matrix: 6 shapes (Square/Arrow/Diamond/Triangle/Circle/Cross) × all sets (Health/Defense/Crit Chance/Crit Dmg/Offense/Potency/Tenacity/Speed) × tier colors (E gray/D green/C blue/B purple/A gold) × dot levels (5 vs 6) × primaries. Log shape/set classification result + OCR primary+secondaries per cell, then fix misses. Batch the captures into tools/debug_out/ with a naming convention so we can regression-test later.</w:t>
+            </w:r>
+          </w:p>
+        </w:tc>
+      </w:tr>
+      <w:tr>
+        <w:tc>
+          <w:tcPr>
+            <w:tcW w:type="dxa" w:w="1400"/>
+            <w:tcBorders>
+              <w:top w:val="single" w:color="CCCCCC" w:sz="1"/>
+              <w:left w:val="single" w:color="CCCCCC" w:sz="1"/>
+              <w:bottom w:val="single" w:color="CCCCCC" w:sz="1"/>
+              <w:right w:val="single" w:color="CCCCCC" w:sz="1"/>
+            </w:tcBorders>
+            <w:shd w:fill="D5F0D5" w:val="clear"/>
+            <w:tcMar>
+              <w:top w:type="dxa" w:w="80"/>
+              <w:left w:type="dxa" w:w="120"/>
+              <w:bottom w:type="dxa" w:w="80"/>
+              <w:right w:type="dxa" w:w="120"/>
+            </w:tcMar>
+          </w:tcPr>
+          <w:p>
+            <w:r>
+              <w:rPr>
+                <w:b/>
+                <w:bCs/>
+              </w:rPr>
+              <w:t xml:space="preserve">DONE</w:t>
+            </w:r>
+          </w:p>
+        </w:tc>
+        <w:tc>
+          <w:tcPr>
+            <w:tcW w:type="dxa" w:w="2000"/>
+            <w:tcBorders>
+              <w:top w:val="single" w:color="CCCCCC" w:sz="1"/>
+              <w:left w:val="single" w:color="CCCCCC" w:sz="1"/>
+              <w:bottom w:val="single" w:color="CCCCCC" w:sz="1"/>
+              <w:right w:val="single" w:color="CCCCCC" w:sz="1"/>
+            </w:tcBorders>
+            <w:tcMar>
+              <w:top w:type="dxa" w:w="80"/>
+              <w:left w:type="dxa" w:w="120"/>
+              <w:bottom w:type="dxa" w:w="80"/>
+              <w:right w:type="dxa" w:w="120"/>
+            </w:tcMar>
+          </w:tcPr>
+          <w:p>
+            <w:r>
+              <w:t xml:space="preserve">Slice engine / 6-dot gate</w:t>
+            </w:r>
+          </w:p>
+        </w:tc>
+        <w:tc>
+          <w:tcPr>
+            <w:tcW w:type="dxa" w:w="3500"/>
+            <w:tcBorders>
+              <w:top w:val="single" w:color="CCCCCC" w:sz="1"/>
+              <w:left w:val="single" w:color="CCCCCC" w:sz="1"/>
+              <w:bottom w:val="single" w:color="CCCCCC" w:sz="1"/>
+              <w:right w:val="single" w:color="CCCCCC" w:sz="1"/>
+            </w:tcBorders>
+            <w:tcMar>
+              <w:top w:type="dxa" w:w="80"/>
+              <w:left w:type="dxa" w:w="120"/>
+              <w:bottom w:type="dxa" w:w="80"/>
+              <w:right w:type="dxa" w:w="120"/>
+            </w:tcMar>
+          </w:tcPr>
+          <w:p>
+            <w:r>
+              <w:t xml:space="preserve">Tightened the 5A→6E gate: dropped the 2-roll “speedBacked” path, added a Speed value floor of 14 to the 3-roll path, and unified overlay + slice-tab verdicts</w:t>
+            </w:r>
+          </w:p>
+        </w:tc>
+        <w:tc>
+          <w:tcPr>
+            <w:tcW w:type="dxa" w:w="2460"/>
+            <w:tcBorders>
+              <w:top w:val="single" w:color="CCCCCC" w:sz="1"/>
+              <w:left w:val="single" w:color="CCCCCC" w:sz="1"/>
+              <w:bottom w:val="single" w:color="CCCCCC" w:sz="1"/>
+              <w:right w:val="single" w:color="CCCCCC" w:sz="1"/>
+            </w:tcBorders>
+            <w:tcMar>
+              <w:top w:type="dxa" w:w="80"/>
+              <w:left w:type="dxa" w:w="120"/>
+              <w:bottom w:type="dxa" w:w="80"/>
+              <w:right w:type="dxa" w:w="120"/>
+            </w:tcMar>
+          </w:tcPr>
+          <w:p>
+            <w:r>
+              <w:t xml:space="preserve">Previously a mod like Speed 10 × 2 rolls with mid-55% avgPriorityQuality would fire USABLE → 6E; now it falls to SLICE_NEXT → 5B (step-by-step). Added `speedVal &gt;= 14` to `speedHitHard` so an unlucky 3-roll Speed that landed 9–13 doesn’t slip through. overlayRecommendation.js now evaluates against the full DECODED_CHARS pool (matches SliceScreen) so roster-filter differences don’t produce conflicting verdicts between the overlay and the Slice tab. Aligns with community guidance (“Speed ≥15 before 6-dot”). GuideModal Slicer page + READMEBEFOREEDITING.md updated.</w:t>
             </w:r>
           </w:p>
         </w:tc>

</xml_diff>

<commit_message>
Slice screen: cap suggestions at top 25 by fit
Previously all 140 matchable characters rendered in Best Characters /
Your Roster. matchedCharacters is already sorted desc by matchScore,
so slicing to 25 surfaces the strongest fits without reshuffling.
Card headers show "Top 25 of N" when truncated, plain "N" otherwise.

Co-Authored-By: Claude Opus 4.7 <noreply@anthropic.com>
</commit_message>
<xml_diff>
--- a/docs/TODO.docx
+++ b/docs/TODO.docx
@@ -1033,7 +1033,7 @@
               <w:bottom w:val="single" w:color="CCCCCC" w:sz="1"/>
               <w:right w:val="single" w:color="CCCCCC" w:sz="1"/>
             </w:tcBorders>
-            <w:shd w:fill="FFF4CE" w:val="clear"/>
+            <w:shd w:fill="D5F0D5" w:val="clear"/>
             <w:tcMar>
               <w:top w:type="dxa" w:w="80"/>
               <w:left w:type="dxa" w:w="120"/>
@@ -1047,7 +1047,7 @@
                 <w:b/>
                 <w:bCs/>
               </w:rPr>
-              <w:t xml:space="preserve">OPEN</w:t>
+              <w:t xml:space="preserve">DONE</w:t>
             </w:r>
           </w:p>
         </w:tc>
@@ -1091,7 +1091,7 @@
           </w:tcPr>
           <w:p>
             <w:r>
-              <w:t xml:space="preserve">Reduce total number of suggested characters — 140 is too high</w:t>
+              <w:t xml:space="preserve">Capped Best Characters + Your Roster to top 25 by fit score</w:t>
             </w:r>
           </w:p>
         </w:tc>
@@ -1113,7 +1113,7 @@
           </w:tcPr>
           <w:p>
             <w:r>
-              <w:t xml:space="preserve">Pick a sane cap (e.g. top 20–30 by fit score) and sort by best match.</w:t>
+              <w:t xml:space="preserve">SliceScreen slices setFilteredMatches and ownedMatches to MAX_VISIBLE_MATCHES=25. matchedCharacters is already sorted desc by matchScore so the cap surfaces the strongest fits. Headers show “Top 25 of N” when truncated, plain “N” otherwise. Archive on next sweep.</w:t>
             </w:r>
           </w:p>
         </w:tc>

</xml_diff>

<commit_message>
pull_debug.ps1: downscale PNGs to 400px longest edge
Classifier debug PNGs were landing at native resolution (~100KB+), which
broke Claude's Read tool on replay. Added a System.Drawing bicubic
downscale pass inside Pull-SafePng that caps the longest edge at 400px.
Typical crops drop to ~20-40KB while retaining enough detail to eyeball
shape/mask decisions. -Full switch bypasses when native res is needed.

Co-Authored-By: Claude Opus 4.7 <noreply@anthropic.com>
</commit_message>
<xml_diff>
--- a/docs/TODO.docx
+++ b/docs/TODO.docx
@@ -558,7 +558,7 @@
               <w:bottom w:val="single" w:color="CCCCCC" w:sz="1"/>
               <w:right w:val="single" w:color="CCCCCC" w:sz="1"/>
             </w:tcBorders>
-            <w:shd w:fill="D9E7FF" w:val="clear"/>
+            <w:shd w:fill="D5F0D5" w:val="clear"/>
             <w:tcMar>
               <w:top w:type="dxa" w:w="80"/>
               <w:left w:type="dxa" w:w="120"/>
@@ -572,7 +572,7 @@
                 <w:b/>
                 <w:bCs/>
               </w:rPr>
-              <w:t xml:space="preserve">IN PROGRESS</w:t>
+              <w:t xml:space="preserve">DONE</w:t>
             </w:r>
           </w:p>
         </w:tc>
@@ -616,7 +616,7 @@
           </w:tcPr>
           <w:p>
             <w:r>
-              <w:t xml:space="preserve">Pull-debug workflow keeps breaking Claude when large shape PNGs get sampled — add size cap / text-first flow</w:t>
+              <w:t xml:space="preserve">pull_debug.ps1 now downscales PNGs to a 400px longest edge before writing to tools/debug_out/</w:t>
             </w:r>
           </w:p>
         </w:tc>
@@ -638,7 +638,7 @@
           </w:tcPr>
           <w:p>
             <w:r>
-              <w:t xml:space="preserve">Shape classifier now writes debug to &lt;getExternalFilesDir&gt;/overlay-debug. Next: update pull_debug.ps1 to always grab the .txt first + downscale PNGs before they land in tools/debug_out/, so Claude never reads raw 100KB+ crops.</w:t>
+              <w:t xml:space="preserve">Text debug was already pulled first. Added a System.Drawing bicubic downscale step in Pull-SafePng that runs after the magic-byte guard and before the final Move-Item. Typical classifier crops drop from ~100KB to ~20–40KB, which keeps Claude’s Read tool happy. -Full switch bypasses the downscale when native-resolution is actually needed. Archive on next sweep.</w:t>
             </w:r>
           </w:p>
         </w:tc>

</xml_diff>

<commit_message>
Permissions UX: strengthen rationale copy for Play review
Overlay + MediaProjection rationale dialogs already fired before their
system prompts; the copy now hits every Play-reviewer checklist item
explicitly. Overlay dialog calls out user-initiated only, no foreign
app content access, no input simulation. Capture dialog calls out
user-initiated only, on-device parsing, immediate image discard, no
cloud or ad upload. Bulleted layout makes the "no automation" and
"no tracking" claims easy to verify in a review pass.

Closed the matching TODO rows: rationale UX and FOREGROUND_SERVICE
manifest declarations were already wired but the doc lagged.

Co-Authored-By: Claude Opus 4.7 <noreply@anthropic.com>
</commit_message>
<xml_diff>
--- a/docs/TODO.docx
+++ b/docs/TODO.docx
@@ -1888,6 +1888,101 @@
               <w:bottom w:val="single" w:color="CCCCCC" w:sz="1"/>
               <w:right w:val="single" w:color="CCCCCC" w:sz="1"/>
             </w:tcBorders>
+            <w:shd w:fill="D5F0D5" w:val="clear"/>
+            <w:tcMar>
+              <w:top w:type="dxa" w:w="80"/>
+              <w:left w:type="dxa" w:w="120"/>
+              <w:bottom w:type="dxa" w:w="80"/>
+              <w:right w:type="dxa" w:w="120"/>
+            </w:tcMar>
+          </w:tcPr>
+          <w:p>
+            <w:r>
+              <w:rPr>
+                <w:b/>
+                <w:bCs/>
+              </w:rPr>
+              <w:t xml:space="preserve">DONE</w:t>
+            </w:r>
+          </w:p>
+        </w:tc>
+        <w:tc>
+          <w:tcPr>
+            <w:tcW w:type="dxa" w:w="2000"/>
+            <w:tcBorders>
+              <w:top w:val="single" w:color="CCCCCC" w:sz="1"/>
+              <w:left w:val="single" w:color="CCCCCC" w:sz="1"/>
+              <w:bottom w:val="single" w:color="CCCCCC" w:sz="1"/>
+              <w:right w:val="single" w:color="CCCCCC" w:sz="1"/>
+            </w:tcBorders>
+            <w:tcMar>
+              <w:top w:type="dxa" w:w="80"/>
+              <w:left w:type="dxa" w:w="120"/>
+              <w:bottom w:type="dxa" w:w="80"/>
+              <w:right w:type="dxa" w:w="120"/>
+            </w:tcMar>
+          </w:tcPr>
+          <w:p>
+            <w:r>
+              <w:t xml:space="preserve">Launch / permissions UX</w:t>
+            </w:r>
+          </w:p>
+        </w:tc>
+        <w:tc>
+          <w:tcPr>
+            <w:tcW w:type="dxa" w:w="3500"/>
+            <w:tcBorders>
+              <w:top w:val="single" w:color="CCCCCC" w:sz="1"/>
+              <w:left w:val="single" w:color="CCCCCC" w:sz="1"/>
+              <w:bottom w:val="single" w:color="CCCCCC" w:sz="1"/>
+              <w:right w:val="single" w:color="CCCCCC" w:sz="1"/>
+            </w:tcBorders>
+            <w:tcMar>
+              <w:top w:type="dxa" w:w="80"/>
+              <w:left w:type="dxa" w:w="120"/>
+              <w:bottom w:type="dxa" w:w="80"/>
+              <w:right w:type="dxa" w:w="120"/>
+            </w:tcMar>
+          </w:tcPr>
+          <w:p>
+            <w:r>
+              <w:t xml:space="preserve">Rationale alerts now fire before both SYSTEM_ALERT_WINDOW and MediaProjection prompts, with Play-reviewer-friendly copy</w:t>
+            </w:r>
+          </w:p>
+        </w:tc>
+        <w:tc>
+          <w:tcPr>
+            <w:tcW w:type="dxa" w:w="2460"/>
+            <w:tcBorders>
+              <w:top w:val="single" w:color="CCCCCC" w:sz="1"/>
+              <w:left w:val="single" w:color="CCCCCC" w:sz="1"/>
+              <w:bottom w:val="single" w:color="CCCCCC" w:sz="1"/>
+              <w:right w:val="single" w:color="CCCCCC" w:sz="1"/>
+            </w:tcBorders>
+            <w:tcMar>
+              <w:top w:type="dxa" w:w="80"/>
+              <w:left w:type="dxa" w:w="120"/>
+              <w:bottom w:type="dxa" w:w="80"/>
+              <w:right w:type="dxa" w:w="120"/>
+            </w:tcMar>
+          </w:tcPr>
+          <w:p>
+            <w:r>
+              <w:t xml:space="preserve">OverlayCaptureScreen.runStartFlow() wraps both permission grants in confirmRationale() with bullet-pointed explanations. Overlay dialog calls out: user-initiated only, no content reading from other apps, no input simulation. Capture dialog calls out: user-initiated only, on-device parsing, image discarded immediately, no cloud/ad upload. Archive on next sweep.</w:t>
+            </w:r>
+          </w:p>
+        </w:tc>
+      </w:tr>
+      <w:tr>
+        <w:tc>
+          <w:tcPr>
+            <w:tcW w:type="dxa" w:w="1400"/>
+            <w:tcBorders>
+              <w:top w:val="single" w:color="CCCCCC" w:sz="1"/>
+              <w:left w:val="single" w:color="CCCCCC" w:sz="1"/>
+              <w:bottom w:val="single" w:color="CCCCCC" w:sz="1"/>
+              <w:right w:val="single" w:color="CCCCCC" w:sz="1"/>
+            </w:tcBorders>
             <w:shd w:fill="FFF4CE" w:val="clear"/>
             <w:tcMar>
               <w:top w:type="dxa" w:w="80"/>
@@ -1924,7 +2019,7 @@
           </w:tcPr>
           <w:p>
             <w:r>
-              <w:t xml:space="preserve">Launch / permissions UX</w:t>
+              <w:t xml:space="preserve">Launch / Play Console</w:t>
             </w:r>
           </w:p>
         </w:tc>
@@ -1946,7 +2041,7 @@
           </w:tcPr>
           <w:p>
             <w:r>
-              <w:t xml:space="preserve">Show in-app rationale dialog BEFORE opening Settings.ACTION_MANAGE_OVERLAY_PERMISSION</w:t>
+              <w:t xml:space="preserve">Complete Data Safety form: be honest about screen capture + local mod storage</w:t>
             </w:r>
           </w:p>
         </w:tc>
@@ -1968,7 +2063,7 @@
           </w:tcPr>
           <w:p>
             <w:r>
-              <w:t xml:space="preserve">Play reviewers actively test for this. Alert must explain: the app draws a small scan button over other apps, does NOT read other apps’ content, does NOT simulate input, only captures screen when user taps the button. Apps that jump straight to the system dialog get rejected. Same treatment needed before the MediaProjection consent dialog.</w:t>
+              <w:t xml:space="preserve">Data collected = "App activity" (scanned mod data stored locally); shared = None; security = user can delete data. Google audits and pulls apps that misrepresent. Description must explicitly acknowledge screen capture to match this form.</w:t>
             </w:r>
           </w:p>
         </w:tc>
@@ -1983,7 +2078,7 @@
               <w:bottom w:val="single" w:color="CCCCCC" w:sz="1"/>
               <w:right w:val="single" w:color="CCCCCC" w:sz="1"/>
             </w:tcBorders>
-            <w:shd w:fill="FFF4CE" w:val="clear"/>
+            <w:shd w:fill="D5F0D5" w:val="clear"/>
             <w:tcMar>
               <w:top w:type="dxa" w:w="80"/>
               <w:left w:type="dxa" w:w="120"/>
@@ -1997,7 +2092,7 @@
                 <w:b/>
                 <w:bCs/>
               </w:rPr>
-              <w:t xml:space="preserve">OPEN</w:t>
+              <w:t xml:space="preserve">DONE</w:t>
             </w:r>
           </w:p>
         </w:tc>
@@ -2019,7 +2114,7 @@
           </w:tcPr>
           <w:p>
             <w:r>
-              <w:t xml:space="preserve">Launch / Play Console</w:t>
+              <w:t xml:space="preserve">Launch / manifest</w:t>
             </w:r>
           </w:p>
         </w:tc>
@@ -2041,7 +2136,7 @@
           </w:tcPr>
           <w:p>
             <w:r>
-              <w:t xml:space="preserve">Complete Data Safety form: be honest about screen capture + local mod storage</w:t>
+              <w:t xml:space="preserve">FOREGROUND_SERVICE + FOREGROUND_SERVICE_MEDIA_PROJECTION permissions declared; capture service flagged with android:foregroundServiceType="specialUse|mediaProjection"</w:t>
             </w:r>
           </w:p>
         </w:tc>
@@ -2063,102 +2158,7 @@
           </w:tcPr>
           <w:p>
             <w:r>
-              <w:t xml:space="preserve">Data collected = "App activity" (scanned mod data stored locally); shared = None; security = user can delete data. Google audits and pulls apps that misrepresent. Description must explicitly acknowledge screen capture to match this form.</w:t>
-            </w:r>
-          </w:p>
-        </w:tc>
-      </w:tr>
-      <w:tr>
-        <w:tc>
-          <w:tcPr>
-            <w:tcW w:type="dxa" w:w="1400"/>
-            <w:tcBorders>
-              <w:top w:val="single" w:color="CCCCCC" w:sz="1"/>
-              <w:left w:val="single" w:color="CCCCCC" w:sz="1"/>
-              <w:bottom w:val="single" w:color="CCCCCC" w:sz="1"/>
-              <w:right w:val="single" w:color="CCCCCC" w:sz="1"/>
-            </w:tcBorders>
-            <w:shd w:fill="FFF4CE" w:val="clear"/>
-            <w:tcMar>
-              <w:top w:type="dxa" w:w="80"/>
-              <w:left w:type="dxa" w:w="120"/>
-              <w:bottom w:type="dxa" w:w="80"/>
-              <w:right w:type="dxa" w:w="120"/>
-            </w:tcMar>
-          </w:tcPr>
-          <w:p>
-            <w:r>
-              <w:rPr>
-                <w:b/>
-                <w:bCs/>
-              </w:rPr>
-              <w:t xml:space="preserve">OPEN</w:t>
-            </w:r>
-          </w:p>
-        </w:tc>
-        <w:tc>
-          <w:tcPr>
-            <w:tcW w:type="dxa" w:w="2000"/>
-            <w:tcBorders>
-              <w:top w:val="single" w:color="CCCCCC" w:sz="1"/>
-              <w:left w:val="single" w:color="CCCCCC" w:sz="1"/>
-              <w:bottom w:val="single" w:color="CCCCCC" w:sz="1"/>
-              <w:right w:val="single" w:color="CCCCCC" w:sz="1"/>
-            </w:tcBorders>
-            <w:tcMar>
-              <w:top w:type="dxa" w:w="80"/>
-              <w:left w:type="dxa" w:w="120"/>
-              <w:bottom w:type="dxa" w:w="80"/>
-              <w:right w:type="dxa" w:w="120"/>
-            </w:tcMar>
-          </w:tcPr>
-          <w:p>
-            <w:r>
-              <w:t xml:space="preserve">Launch / manifest</w:t>
-            </w:r>
-          </w:p>
-        </w:tc>
-        <w:tc>
-          <w:tcPr>
-            <w:tcW w:type="dxa" w:w="3500"/>
-            <w:tcBorders>
-              <w:top w:val="single" w:color="CCCCCC" w:sz="1"/>
-              <w:left w:val="single" w:color="CCCCCC" w:sz="1"/>
-              <w:bottom w:val="single" w:color="CCCCCC" w:sz="1"/>
-              <w:right w:val="single" w:color="CCCCCC" w:sz="1"/>
-            </w:tcBorders>
-            <w:tcMar>
-              <w:top w:type="dxa" w:w="80"/>
-              <w:left w:type="dxa" w:w="120"/>
-              <w:bottom w:type="dxa" w:w="80"/>
-              <w:right w:type="dxa" w:w="120"/>
-            </w:tcMar>
-          </w:tcPr>
-          <w:p>
-            <w:r>
-              <w:t xml:space="preserve">Declare FOREGROUND_SERVICE + FOREGROUND_SERVICE_MEDIA_PROJECTION and mark the overlay/capture service with android:foregroundServiceType="mediaProjection"</w:t>
-            </w:r>
-          </w:p>
-        </w:tc>
-        <w:tc>
-          <w:tcPr>
-            <w:tcW w:type="dxa" w:w="2460"/>
-            <w:tcBorders>
-              <w:top w:val="single" w:color="CCCCCC" w:sz="1"/>
-              <w:left w:val="single" w:color="CCCCCC" w:sz="1"/>
-              <w:bottom w:val="single" w:color="CCCCCC" w:sz="1"/>
-              <w:right w:val="single" w:color="CCCCCC" w:sz="1"/>
-            </w:tcBorders>
-            <w:tcMar>
-              <w:top w:type="dxa" w:w="80"/>
-              <w:left w:type="dxa" w:w="120"/>
-              <w:bottom w:type="dxa" w:w="80"/>
-              <w:right w:type="dxa" w:w="120"/>
-            </w:tcMar>
-          </w:tcPr>
-          <w:p>
-            <w:r>
-              <w:t xml:space="preserve">Android 14+ requires this pair for screen-capture foreground services. Separate Play Console declaration under App content → Foreground services also required with justification.</w:t>
+              <w:t xml:space="preserve">AndroidManifest.xml already has the pair plus FOREGROUND_SERVICE_SPECIAL_USE; ModOverlayCaptureService declared with foregroundServiceType="specialUse|mediaProjection" and a PROPERTY_SPECIAL_USE_FGS_SUBTYPE of "overlay_capture_mod_scanner". Still pending on the Play side: the separate App-content → Foreground services declaration form. Archive on next sweep.</w:t>
             </w:r>
           </w:p>
         </w:tc>

</xml_diff>

<commit_message>
Docs: mark Circle/Diamond shape items DONE, expand cross-shape + EV TODOs
Closed by today's scanner work:
- "Inner cavity mask shows notch on Circle" — covered by the Circle/
  Diamond rescue rules added in 7433247.
- "Second Circle mod reads as Cross" — fixed by the chooseShape
  same-variant runner-up preference + Triangle guard.

Expanded with implementation outlines:
- Cross-shape secondary-set match (was OPEN/sparse; now describes
  the setOnlyMatch branch in findMatchingBuilds, the
  rankFitTier slot, and the alignedCount gate).
- Deep EV modeling (new entry; describes a
  projectSliceLadder Monte Carlo that returns probability
  distributions of post-slice stat values, percentile-based
  recommendations, and the roster-aware extension).

Co-Authored-By: Claude Opus 4.7 (1M context) <noreply@anthropic.com>
</commit_message>
<xml_diff>
--- a/docs/TODO.docx
+++ b/docs/TODO.docx
@@ -463,101 +463,6 @@
               <w:bottom w:val="single" w:color="CCCCCC" w:sz="1"/>
               <w:right w:val="single" w:color="CCCCCC" w:sz="1"/>
             </w:tcBorders>
-            <w:shd w:fill="E6E0EC" w:val="clear"/>
-            <w:tcMar>
-              <w:top w:type="dxa" w:w="80"/>
-              <w:left w:type="dxa" w:w="120"/>
-              <w:bottom w:type="dxa" w:w="80"/>
-              <w:right w:type="dxa" w:w="120"/>
-            </w:tcMar>
-          </w:tcPr>
-          <w:p>
-            <w:r>
-              <w:rPr>
-                <w:b/>
-                <w:bCs/>
-              </w:rPr>
-              <w:t xml:space="preserve">PARKED</w:t>
-            </w:r>
-          </w:p>
-        </w:tc>
-        <w:tc>
-          <w:tcPr>
-            <w:tcW w:type="dxa" w:w="2000"/>
-            <w:tcBorders>
-              <w:top w:val="single" w:color="CCCCCC" w:sz="1"/>
-              <w:left w:val="single" w:color="CCCCCC" w:sz="1"/>
-              <w:bottom w:val="single" w:color="CCCCCC" w:sz="1"/>
-              <w:right w:val="single" w:color="CCCCCC" w:sz="1"/>
-            </w:tcBorders>
-            <w:tcMar>
-              <w:top w:type="dxa" w:w="80"/>
-              <w:left w:type="dxa" w:w="120"/>
-              <w:bottom w:type="dxa" w:w="80"/>
-              <w:right w:type="dxa" w:w="120"/>
-            </w:tcMar>
-          </w:tcPr>
-          <w:p>
-            <w:r>
-              <w:t xml:space="preserve">Shape classifier</w:t>
-            </w:r>
-          </w:p>
-        </w:tc>
-        <w:tc>
-          <w:tcPr>
-            <w:tcW w:type="dxa" w:w="3500"/>
-            <w:tcBorders>
-              <w:top w:val="single" w:color="CCCCCC" w:sz="1"/>
-              <w:left w:val="single" w:color="CCCCCC" w:sz="1"/>
-              <w:bottom w:val="single" w:color="CCCCCC" w:sz="1"/>
-              <w:right w:val="single" w:color="CCCCCC" w:sz="1"/>
-            </w:tcBorders>
-            <w:tcMar>
-              <w:top w:type="dxa" w:w="80"/>
-              <w:left w:type="dxa" w:w="120"/>
-              <w:bottom w:type="dxa" w:w="80"/>
-              <w:right w:type="dxa" w:w="120"/>
-            </w:tcMar>
-          </w:tcPr>
-          <w:p>
-            <w:r>
-              <w:t xml:space="preserve">Inner cavity mask shows notch at top on Circle — investigate if portrait-removal or pip-cleanup clipping the rim</w:t>
-            </w:r>
-          </w:p>
-        </w:tc>
-        <w:tc>
-          <w:tcPr>
-            <w:tcW w:type="dxa" w:w="2460"/>
-            <w:tcBorders>
-              <w:top w:val="single" w:color="CCCCCC" w:sz="1"/>
-              <w:left w:val="single" w:color="CCCCCC" w:sz="1"/>
-              <w:bottom w:val="single" w:color="CCCCCC" w:sz="1"/>
-              <w:right w:val="single" w:color="CCCCCC" w:sz="1"/>
-            </w:tcBorders>
-            <w:tcMar>
-              <w:top w:type="dxa" w:w="80"/>
-              <w:left w:type="dxa" w:w="120"/>
-              <w:bottom w:type="dxa" w:w="80"/>
-              <w:right w:type="dxa" w:w="120"/>
-            </w:tcMar>
-          </w:tcPr>
-          <w:p>
-            <w:r>
-              <w:t xml:space="preserve">Parked 2026-04-23 pending fresh sample. See shape-classifier-candidate-inner-mask.png from the Apr 20 Circle scan.</w:t>
-            </w:r>
-          </w:p>
-        </w:tc>
-      </w:tr>
-      <w:tr>
-        <w:tc>
-          <w:tcPr>
-            <w:tcW w:type="dxa" w:w="1400"/>
-            <w:tcBorders>
-              <w:top w:val="single" w:color="CCCCCC" w:sz="1"/>
-              <w:left w:val="single" w:color="CCCCCC" w:sz="1"/>
-              <w:bottom w:val="single" w:color="CCCCCC" w:sz="1"/>
-              <w:right w:val="single" w:color="CCCCCC" w:sz="1"/>
-            </w:tcBorders>
             <w:shd w:fill="D5F0D5" w:val="clear"/>
             <w:tcMar>
               <w:top w:type="dxa" w:w="80"/>
@@ -594,7 +499,7 @@
           </w:tcPr>
           <w:p>
             <w:r>
-              <w:t xml:space="preserve">Tooling / debug</w:t>
+              <w:t xml:space="preserve">Shape classifier</w:t>
             </w:r>
           </w:p>
         </w:tc>
@@ -616,7 +521,7 @@
           </w:tcPr>
           <w:p>
             <w:r>
-              <w:t xml:space="preserve">pull_debug.ps1 now downscales PNGs to a 400px longest edge before writing to tools/debug_out/</w:t>
+              <w:t xml:space="preserve">Inner cavity mask shows notch at top on Circle — investigate if portrait-removal or pip-cleanup clipping the rim</w:t>
             </w:r>
           </w:p>
         </w:tc>
@@ -638,7 +543,7 @@
           </w:tcPr>
           <w:p>
             <w:r>
-              <w:t xml:space="preserve">Text debug was already pulled first. Added a System.Drawing bicubic downscale step in Pull-SafePng that runs after the magic-byte guard and before the final Move-Item. Typical classifier crops drop from ~100KB to ~20–40KB, which keeps Claude’s Read tool happy. -Full switch bypasses the downscale when native-resolution is actually needed. Archive on next sweep.</w:t>
+              <w:t xml:space="preserve">Resolved during the 2026-05-02 shape-classifier sweep. The rescue rules added on 2026-05-02 (strong-Diamond-corners, chooseShape priority fix, Square→Cross geometry rescue, Cross→Square extent rescue) closed the failure modes this notch was causing. Multiple Circle scans verified correct on device.</w:t>
             </w:r>
           </w:p>
         </w:tc>
@@ -689,7 +594,7 @@
           </w:tcPr>
           <w:p>
             <w:r>
-              <w:t xml:space="preserve">UI / shape icons</w:t>
+              <w:t xml:space="preserve">Tooling / debug</w:t>
             </w:r>
           </w:p>
         </w:tc>
@@ -711,7 +616,7 @@
           </w:tcPr>
           <w:p>
             <w:r>
-              <w:t xml:space="preserve">Shape icons on Slice/Finder pickers now use assets/shapes PNGs and were bumped 22 → 28</w:t>
+              <w:t xml:space="preserve">pull_debug.ps1 now downscales PNGs to a 400px longest edge before writing to tools/debug_out/</w:t>
             </w:r>
           </w:p>
         </w:tc>
@@ -733,7 +638,7 @@
           </w:tcPr>
           <w:p>
             <w:r>
-              <w:t xml:space="preserve">ModShapeIcon.js was already wired to assets/shapes/*.png. Bumped size on SliceScreen.js:278 and FinderScreen.js:597. Archive on next sweep.</w:t>
+              <w:t xml:space="preserve">Text debug was already pulled first. Added a System.Drawing bicubic downscale step in Pull-SafePng that runs after the magic-byte guard and before the final Move-Item. Typical classifier crops drop from ~100KB to ~20–40KB, which keeps Claude’s Read tool happy. -Full switch bypasses the downscale when native-resolution is actually needed. Archive on next sweep.</w:t>
             </w:r>
           </w:p>
         </w:tc>
@@ -784,7 +689,7 @@
           </w:tcPr>
           <w:p>
             <w:r>
-              <w:t xml:space="preserve">Ally code / privacy</w:t>
+              <w:t xml:space="preserve">UI / shape icons</w:t>
             </w:r>
           </w:p>
         </w:tc>
@@ -806,7 +711,7 @@
           </w:tcPr>
           <w:p>
             <w:r>
-              <w:t xml:space="preserve">AllyCodePanel placeholder changed from the owner’s real ally code to 123-456-789</w:t>
+              <w:t xml:space="preserve">Shape icons on Slice/Finder pickers now use assets/shapes PNGs and were bumped 22 → 28</w:t>
             </w:r>
           </w:p>
         </w:tc>
@@ -828,7 +733,7 @@
           </w:tcPr>
           <w:p>
             <w:r>
-              <w:t xml:space="preserve">Change captured in the staged diff for AllyCodePanel.js (489-758-819 → 123-456-789). Archive on next sweep.</w:t>
+              <w:t xml:space="preserve">ModShapeIcon.js was already wired to assets/shapes/*.png. Bumped size on SliceScreen.js:278 and FinderScreen.js:597. Archive on next sweep.</w:t>
             </w:r>
           </w:p>
         </w:tc>
@@ -879,7 +784,7 @@
           </w:tcPr>
           <w:p>
             <w:r>
-              <w:t xml:space="preserve">Repo hygiene</w:t>
+              <w:t xml:space="preserve">Ally code / privacy</w:t>
             </w:r>
           </w:p>
         </w:tc>
@@ -901,7 +806,7 @@
           </w:tcPr>
           <w:p>
             <w:r>
-              <w:t xml:space="preserve">references/mod-source-html/*_files/ (SWGOH.GG webpack bundles) removed from working tree; not tracked in git on either branch</w:t>
+              <w:t xml:space="preserve">AllyCodePanel placeholder changed from the owner’s real ally code to 123-456-789</w:t>
             </w:r>
           </w:p>
         </w:tc>
@@ -923,7 +828,7 @@
           </w:tcPr>
           <w:p>
             <w:r>
-              <w:t xml:space="preserve">User confirmed external backup kept in case parsers ever need them. Verified on 2026-04-25: references/ contains only character-data, mod-source, and native-overlay-template; no _files/ subdirs anywhere; git ls-files references/mod-source-html returns 0 entries on both main and friendly-stonebraker. Archive on next sweep.</w:t>
+              <w:t xml:space="preserve">Change captured in the staged diff for AllyCodePanel.js (489-758-819 → 123-456-789). Archive on next sweep.</w:t>
             </w:r>
           </w:p>
         </w:tc>
@@ -974,7 +879,7 @@
           </w:tcPr>
           <w:p>
             <w:r>
-              <w:t xml:space="preserve">Repo hygiene / cleanup</w:t>
+              <w:t xml:space="preserve">Repo hygiene</w:t>
             </w:r>
           </w:p>
         </w:tc>
@@ -996,7 +901,7 @@
           </w:tcPr>
           <w:p>
             <w:r>
-              <w:t xml:space="preserve">Codebase cleanup pass: deleted archive/, removed src/data/chars.js.bak, deduplicated DECODED_CHARS, consolidated verdict helpers, documented tools/</w:t>
+              <w:t xml:space="preserve">references/mod-source-html/*_files/ (SWGOH.GG webpack bundles) removed from working tree; not tracked in git on either branch</w:t>
             </w:r>
           </w:p>
         </w:tc>
@@ -1018,7 +923,7 @@
           </w:tcPr>
           <w:p>
             <w:r>
-              <w:t xml:space="preserve">Landed 2026-04-24. archive/ (53 files) deleted with backup pushed to backup/pre-cleanup-2026-04-24 and chars.js.bak copied to C:/Users/Chad/my-app/backups/. New src/data/charDecoding.js exports DECODED_CHARS + ENGINE_SLICE_REF used by both overlayRecommendation and SliceScreen. New getDecisionDescription() export on sliceEngine.js replaces two slightly drifted decisionDefinition() helpers. New tools/README.md catalogs all 22 dev scripts.</w:t>
+              <w:t xml:space="preserve">User confirmed external backup kept in case parsers ever need them. Verified on 2026-04-25: references/ contains only character-data, mod-source, and native-overlay-template; no _files/ subdirs anywhere; git ls-files references/mod-source-html returns 0 entries on both main and friendly-stonebraker. Archive on next sweep.</w:t>
             </w:r>
           </w:p>
         </w:tc>
@@ -1069,7 +974,7 @@
           </w:tcPr>
           <w:p>
             <w:r>
-              <w:t xml:space="preserve">Theme / shape icons</w:t>
+              <w:t xml:space="preserve">Repo hygiene / cleanup</w:t>
             </w:r>
           </w:p>
         </w:tc>
@@ -1091,7 +996,7 @@
           </w:tcPr>
           <w:p>
             <w:r>
-              <w:t xml:space="preserve">Light-mode shape icons: cross/triangle/diamond/etc. now have light-mode variants so they don’t render as black blobs on the white background</w:t>
+              <w:t xml:space="preserve">Codebase cleanup pass: deleted archive/, removed src/data/chars.js.bak, deduplicated DECODED_CHARS, consolidated verdict helpers, documented tools/</w:t>
             </w:r>
           </w:p>
         </w:tc>
@@ -1113,7 +1018,7 @@
           </w:tcPr>
           <w:p>
             <w:r>
-              <w:t xml:space="preserve">Each shape PNG has a metallic colored frame + dark inner cavity + dark outer drop-shadow. New tools/gen-shape-lightmode.py rewrites pixels with max(R,G,B) &lt; 55 to white while preserving alpha (soft black aura becomes soft white glow). Generated assets/shapes/{name}-light.png for all 6 shapes. ModShapeIcon.js now reads isDark from useThemeControls() and swaps source maps accordingly. Verified visually before commit. Push LUM_MAX from 55 to 65 in the script if any dark specks survive on-device.</w:t>
+              <w:t xml:space="preserve">Landed 2026-04-24. archive/ (53 files) deleted with backup pushed to backup/pre-cleanup-2026-04-24 and chars.js.bak copied to C:/Users/Chad/my-app/backups/. New src/data/charDecoding.js exports DECODED_CHARS + ENGINE_SLICE_REF used by both overlayRecommendation and SliceScreen. New getDecisionDescription() export on sliceEngine.js replaces two slightly drifted decisionDefinition() helpers. New tools/README.md catalogs all 22 dev scripts.</w:t>
             </w:r>
           </w:p>
         </w:tc>
@@ -1164,7 +1069,7 @@
           </w:tcPr>
           <w:p>
             <w:r>
-              <w:t xml:space="preserve">Slice screen / layout</w:t>
+              <w:t xml:space="preserve">Theme / shape icons</w:t>
             </w:r>
           </w:p>
         </w:tc>
@@ -1186,7 +1091,7 @@
           </w:tcPr>
           <w:p>
             <w:r>
-              <w:t xml:space="preserve">Shrink the Best Character Fit card and place a "Your Characters" card next to it (premium-only)</w:t>
+              <w:t xml:space="preserve">Light-mode shape icons: cross/triangle/diamond/etc. now have light-mode variants so they don’t render as black blobs on the white background</w:t>
             </w:r>
           </w:p>
         </w:tc>
@@ -1208,7 +1113,7 @@
           </w:tcPr>
           <w:p>
             <w:r>
-              <w:t xml:space="preserve">Two-card row. "Your Characters" populated from ally-code roster; gated behind premium.</w:t>
+              <w:t xml:space="preserve">Each shape PNG has a metallic colored frame + dark inner cavity + dark outer drop-shadow. New tools/gen-shape-lightmode.py rewrites pixels with max(R,G,B) &lt; 55 to white while preserving alpha (soft black aura becomes soft white glow). Generated assets/shapes/{name}-light.png for all 6 shapes. ModShapeIcon.js now reads isDark from useThemeControls() and swaps source maps accordingly. Verified visually before commit. Push LUM_MAX from 55 to 65 in the script if any dark specks survive on-device.</w:t>
             </w:r>
           </w:p>
         </w:tc>
@@ -1259,7 +1164,7 @@
           </w:tcPr>
           <w:p>
             <w:r>
-              <w:t xml:space="preserve">Slice screen / suggestions</w:t>
+              <w:t xml:space="preserve">Slice screen / layout</w:t>
             </w:r>
           </w:p>
         </w:tc>
@@ -1281,7 +1186,7 @@
           </w:tcPr>
           <w:p>
             <w:r>
-              <w:t xml:space="preserve">Capped Best Characters + Your Roster to top 25 by fit score</w:t>
+              <w:t xml:space="preserve">Shrink the Best Character Fit card and place a "Your Characters" card next to it (premium-only)</w:t>
             </w:r>
           </w:p>
         </w:tc>
@@ -1303,7 +1208,7 @@
           </w:tcPr>
           <w:p>
             <w:r>
-              <w:t xml:space="preserve">SliceScreen slices setFilteredMatches and ownedMatches to MAX_VISIBLE_MATCHES=25. matchedCharacters is already sorted desc by matchScore so the cap surfaces the strongest fits. Headers show “Top 25 of N” when truncated, plain “N” otherwise. Archive on next sweep.</w:t>
+              <w:t xml:space="preserve">Two-card row. "Your Characters" populated from ally-code roster; gated behind premium.</w:t>
             </w:r>
           </w:p>
         </w:tc>
@@ -1354,6 +1259,101 @@
           </w:tcPr>
           <w:p>
             <w:r>
+              <w:t xml:space="preserve">Slice screen / suggestions</w:t>
+            </w:r>
+          </w:p>
+        </w:tc>
+        <w:tc>
+          <w:tcPr>
+            <w:tcW w:type="dxa" w:w="3500"/>
+            <w:tcBorders>
+              <w:top w:val="single" w:color="CCCCCC" w:sz="1"/>
+              <w:left w:val="single" w:color="CCCCCC" w:sz="1"/>
+              <w:bottom w:val="single" w:color="CCCCCC" w:sz="1"/>
+              <w:right w:val="single" w:color="CCCCCC" w:sz="1"/>
+            </w:tcBorders>
+            <w:tcMar>
+              <w:top w:type="dxa" w:w="80"/>
+              <w:left w:type="dxa" w:w="120"/>
+              <w:bottom w:type="dxa" w:w="80"/>
+              <w:right w:type="dxa" w:w="120"/>
+            </w:tcMar>
+          </w:tcPr>
+          <w:p>
+            <w:r>
+              <w:t xml:space="preserve">Capped Best Characters + Your Roster to top 25 by fit score</w:t>
+            </w:r>
+          </w:p>
+        </w:tc>
+        <w:tc>
+          <w:tcPr>
+            <w:tcW w:type="dxa" w:w="2460"/>
+            <w:tcBorders>
+              <w:top w:val="single" w:color="CCCCCC" w:sz="1"/>
+              <w:left w:val="single" w:color="CCCCCC" w:sz="1"/>
+              <w:bottom w:val="single" w:color="CCCCCC" w:sz="1"/>
+              <w:right w:val="single" w:color="CCCCCC" w:sz="1"/>
+            </w:tcBorders>
+            <w:tcMar>
+              <w:top w:type="dxa" w:w="80"/>
+              <w:left w:type="dxa" w:w="120"/>
+              <w:bottom w:type="dxa" w:w="80"/>
+              <w:right w:type="dxa" w:w="120"/>
+            </w:tcMar>
+          </w:tcPr>
+          <w:p>
+            <w:r>
+              <w:t xml:space="preserve">SliceScreen slices setFilteredMatches and ownedMatches to MAX_VISIBLE_MATCHES=25. matchedCharacters is already sorted desc by matchScore so the cap surfaces the strongest fits. Headers show “Top 25 of N” when truncated, plain “N” otherwise. Archive on next sweep.</w:t>
+            </w:r>
+          </w:p>
+        </w:tc>
+      </w:tr>
+      <w:tr>
+        <w:tc>
+          <w:tcPr>
+            <w:tcW w:type="dxa" w:w="1400"/>
+            <w:tcBorders>
+              <w:top w:val="single" w:color="CCCCCC" w:sz="1"/>
+              <w:left w:val="single" w:color="CCCCCC" w:sz="1"/>
+              <w:bottom w:val="single" w:color="CCCCCC" w:sz="1"/>
+              <w:right w:val="single" w:color="CCCCCC" w:sz="1"/>
+            </w:tcBorders>
+            <w:shd w:fill="D5F0D5" w:val="clear"/>
+            <w:tcMar>
+              <w:top w:type="dxa" w:w="80"/>
+              <w:left w:type="dxa" w:w="120"/>
+              <w:bottom w:type="dxa" w:w="80"/>
+              <w:right w:type="dxa" w:w="120"/>
+            </w:tcMar>
+          </w:tcPr>
+          <w:p>
+            <w:r>
+              <w:rPr>
+                <w:b/>
+                <w:bCs/>
+              </w:rPr>
+              <w:t xml:space="preserve">DONE</w:t>
+            </w:r>
+          </w:p>
+        </w:tc>
+        <w:tc>
+          <w:tcPr>
+            <w:tcW w:type="dxa" w:w="2000"/>
+            <w:tcBorders>
+              <w:top w:val="single" w:color="CCCCCC" w:sz="1"/>
+              <w:left w:val="single" w:color="CCCCCC" w:sz="1"/>
+              <w:bottom w:val="single" w:color="CCCCCC" w:sz="1"/>
+              <w:right w:val="single" w:color="CCCCCC" w:sz="1"/>
+            </w:tcBorders>
+            <w:tcMar>
+              <w:top w:type="dxa" w:w="80"/>
+              <w:left w:type="dxa" w:w="120"/>
+              <w:bottom w:type="dxa" w:w="80"/>
+              <w:right w:type="dxa" w:w="120"/>
+            </w:tcMar>
+          </w:tcPr>
+          <w:p>
+            <w:r>
               <w:t xml:space="preserve">Slice screen / scoring</w:t>
             </w:r>
           </w:p>
@@ -1698,101 +1698,6 @@
               <w:bottom w:val="single" w:color="CCCCCC" w:sz="1"/>
               <w:right w:val="single" w:color="CCCCCC" w:sz="1"/>
             </w:tcBorders>
-            <w:shd w:fill="E6E0EC" w:val="clear"/>
-            <w:tcMar>
-              <w:top w:type="dxa" w:w="80"/>
-              <w:left w:type="dxa" w:w="120"/>
-              <w:bottom w:type="dxa" w:w="80"/>
-              <w:right w:type="dxa" w:w="120"/>
-            </w:tcMar>
-          </w:tcPr>
-          <w:p>
-            <w:r>
-              <w:rPr>
-                <w:b/>
-                <w:bCs/>
-              </w:rPr>
-              <w:t xml:space="preserve">PARKED</w:t>
-            </w:r>
-          </w:p>
-        </w:tc>
-        <w:tc>
-          <w:tcPr>
-            <w:tcW w:type="dxa" w:w="2000"/>
-            <w:tcBorders>
-              <w:top w:val="single" w:color="CCCCCC" w:sz="1"/>
-              <w:left w:val="single" w:color="CCCCCC" w:sz="1"/>
-              <w:bottom w:val="single" w:color="CCCCCC" w:sz="1"/>
-              <w:right w:val="single" w:color="CCCCCC" w:sz="1"/>
-            </w:tcBorders>
-            <w:tcMar>
-              <w:top w:type="dxa" w:w="80"/>
-              <w:left w:type="dxa" w:w="120"/>
-              <w:bottom w:type="dxa" w:w="80"/>
-              <w:right w:type="dxa" w:w="120"/>
-            </w:tcMar>
-          </w:tcPr>
-          <w:p>
-            <w:r>
-              <w:t xml:space="preserve">Shape classifier</w:t>
-            </w:r>
-          </w:p>
-        </w:tc>
-        <w:tc>
-          <w:tcPr>
-            <w:tcW w:type="dxa" w:w="3500"/>
-            <w:tcBorders>
-              <w:top w:val="single" w:color="CCCCCC" w:sz="1"/>
-              <w:left w:val="single" w:color="CCCCCC" w:sz="1"/>
-              <w:bottom w:val="single" w:color="CCCCCC" w:sz="1"/>
-              <w:right w:val="single" w:color="CCCCCC" w:sz="1"/>
-            </w:tcBorders>
-            <w:tcMar>
-              <w:top w:type="dxa" w:w="80"/>
-              <w:left w:type="dxa" w:w="120"/>
-              <w:bottom w:type="dxa" w:w="80"/>
-              <w:right w:type="dxa" w:w="120"/>
-            </w:tcMar>
-          </w:tcPr>
-          <w:p>
-            <w:r>
-              <w:t xml:space="preserve">Second Circle mod reads as Cross: no candidate view sees a round outline (outer circularity 0.404, mask-only circularity 0.333, extent 0.933, stronglyRound=false)</w:t>
-            </w:r>
-          </w:p>
-        </w:tc>
-        <w:tc>
-          <w:tcPr>
-            <w:tcW w:type="dxa" w:w="2460"/>
-            <w:tcBorders>
-              <w:top w:val="single" w:color="CCCCCC" w:sz="1"/>
-              <w:left w:val="single" w:color="CCCCCC" w:sz="1"/>
-              <w:bottom w:val="single" w:color="CCCCCC" w:sz="1"/>
-              <w:right w:val="single" w:color="CCCCCC" w:sz="1"/>
-            </w:tcBorders>
-            <w:tcMar>
-              <w:top w:type="dxa" w:w="80"/>
-              <w:left w:type="dxa" w:w="120"/>
-              <w:bottom w:type="dxa" w:w="80"/>
-              <w:right w:type="dxa" w:w="120"/>
-            </w:tcMar>
-          </w:tcPr>
-          <w:p>
-            <w:r>
-              <w:t xml:space="preserve">Parked 2026-04-23 pending broader Circle sample set. Unlike Grievous, this Circle’s mask-only candidate doesn’t see the round outline at all. Hypotheses: (a) capture framing cut off part of the mod, (b) different Circle visual tier/set produces a different silhouette profile. Collect multiple Circle scans (different tiers/sets/primaries) to determine whether new rescue rule is needed or whether it’s a capture artifact.</w:t>
-            </w:r>
-          </w:p>
-        </w:tc>
-      </w:tr>
-      <w:tr>
-        <w:tc>
-          <w:tcPr>
-            <w:tcW w:type="dxa" w:w="1400"/>
-            <w:tcBorders>
-              <w:top w:val="single" w:color="CCCCCC" w:sz="1"/>
-              <w:left w:val="single" w:color="CCCCCC" w:sz="1"/>
-              <w:bottom w:val="single" w:color="CCCCCC" w:sz="1"/>
-              <w:right w:val="single" w:color="CCCCCC" w:sz="1"/>
-            </w:tcBorders>
             <w:shd w:fill="D5F0D5" w:val="clear"/>
             <w:tcMar>
               <w:top w:type="dxa" w:w="80"/>
@@ -1829,6 +1734,101 @@
           </w:tcPr>
           <w:p>
             <w:r>
+              <w:t xml:space="preserve">Shape classifier</w:t>
+            </w:r>
+          </w:p>
+        </w:tc>
+        <w:tc>
+          <w:tcPr>
+            <w:tcW w:type="dxa" w:w="3500"/>
+            <w:tcBorders>
+              <w:top w:val="single" w:color="CCCCCC" w:sz="1"/>
+              <w:left w:val="single" w:color="CCCCCC" w:sz="1"/>
+              <w:bottom w:val="single" w:color="CCCCCC" w:sz="1"/>
+              <w:right w:val="single" w:color="CCCCCC" w:sz="1"/>
+            </w:tcBorders>
+            <w:tcMar>
+              <w:top w:type="dxa" w:w="80"/>
+              <w:left w:type="dxa" w:w="120"/>
+              <w:bottom w:type="dxa" w:w="80"/>
+              <w:right w:type="dxa" w:w="120"/>
+            </w:tcMar>
+          </w:tcPr>
+          <w:p>
+            <w:r>
+              <w:t xml:space="preserve">Second Circle mod reads as Cross: no candidate view sees a round outline</w:t>
+            </w:r>
+          </w:p>
+        </w:tc>
+        <w:tc>
+          <w:tcPr>
+            <w:tcW w:type="dxa" w:w="2460"/>
+            <w:tcBorders>
+              <w:top w:val="single" w:color="CCCCCC" w:sz="1"/>
+              <w:left w:val="single" w:color="CCCCCC" w:sz="1"/>
+              <w:bottom w:val="single" w:color="CCCCCC" w:sz="1"/>
+              <w:right w:val="single" w:color="CCCCCC" w:sz="1"/>
+            </w:tcBorders>
+            <w:tcMar>
+              <w:top w:type="dxa" w:w="80"/>
+              <w:left w:type="dxa" w:w="120"/>
+              <w:bottom w:type="dxa" w:w="80"/>
+              <w:right w:type="dxa" w:w="120"/>
+            </w:tcMar>
+          </w:tcPr>
+          <w:p>
+            <w:r>
+              <w:t xml:space="preserve">Resolved 2026-05-02 via two layered fixes: (1) chooseShape now prefers the same-variant runner-up over cross-variant consensus when the native winner is rejected by the primary-stat filter; (2) the Circle/Diamond→Triangle rescue gained a triangleScore-vs-diamondCornerScore guard so a rounded silhouette with strong diamond geometry no longer flips to Triangle. Verified end-to-end: 3 Circle Offense scans passed, the one remaining 5D Circle Protection misclass turned out to be the chooseShape consensus bug and was fixed in the same commit.</w:t>
+            </w:r>
+          </w:p>
+        </w:tc>
+      </w:tr>
+      <w:tr>
+        <w:tc>
+          <w:tcPr>
+            <w:tcW w:type="dxa" w:w="1400"/>
+            <w:tcBorders>
+              <w:top w:val="single" w:color="CCCCCC" w:sz="1"/>
+              <w:left w:val="single" w:color="CCCCCC" w:sz="1"/>
+              <w:bottom w:val="single" w:color="CCCCCC" w:sz="1"/>
+              <w:right w:val="single" w:color="CCCCCC" w:sz="1"/>
+            </w:tcBorders>
+            <w:shd w:fill="D5F0D5" w:val="clear"/>
+            <w:tcMar>
+              <w:top w:type="dxa" w:w="80"/>
+              <w:left w:type="dxa" w:w="120"/>
+              <w:bottom w:type="dxa" w:w="80"/>
+              <w:right w:type="dxa" w:w="120"/>
+            </w:tcMar>
+          </w:tcPr>
+          <w:p>
+            <w:r>
+              <w:rPr>
+                <w:b/>
+                <w:bCs/>
+              </w:rPr>
+              <w:t xml:space="preserve">DONE</w:t>
+            </w:r>
+          </w:p>
+        </w:tc>
+        <w:tc>
+          <w:tcPr>
+            <w:tcW w:type="dxa" w:w="2000"/>
+            <w:tcBorders>
+              <w:top w:val="single" w:color="CCCCCC" w:sz="1"/>
+              <w:left w:val="single" w:color="CCCCCC" w:sz="1"/>
+              <w:bottom w:val="single" w:color="CCCCCC" w:sz="1"/>
+              <w:right w:val="single" w:color="CCCCCC" w:sz="1"/>
+            </w:tcBorders>
+            <w:tcMar>
+              <w:top w:type="dxa" w:w="80"/>
+              <w:left w:type="dxa" w:w="120"/>
+              <w:bottom w:type="dxa" w:w="80"/>
+              <w:right w:type="dxa" w:w="120"/>
+            </w:tcMar>
+          </w:tcPr>
+          <w:p>
+            <w:r>
               <w:t xml:space="preserve">Branch hygiene</w:t>
             </w:r>
           </w:p>
@@ -5936,7 +5936,7 @@
           </w:tcPr>
           <w:p>
             <w:r>
-              <w:t xml:space="preserve">Match characters by SECONDARY set membership across all shapes, not just by exact shape+set</w:t>
+              <w:t xml:space="preserve">Match characters by SECONDARY set membership across all shapes, not just by exact shape+primary</w:t>
             </w:r>
           </w:p>
         </w:tc>
@@ -5958,7 +5958,102 @@
           </w:tcPr>
           <w:p>
             <w:r>
-              <w:t xml:space="preserve">When a character's build calls for Speed(x4)+Health(x2), a scanned Health-set mod should match that character regardless of shape if its secondaries align — currently only the matching shape gets matched. Engine path: findMatchingBuilds in sliceEngine.js requires shape match; add a secondary-set path that accepts any shape when the scanned mod's set fills the x2/x4 slot of the build. Strong-fit threshold should rely on alignedCount/strongAlignedCount, not on shape match.</w:t>
+              <w:t xml:space="preserve">Today: findMatchingBuilds in sliceEngine.js requires BOTH shape-and-primary match (e.g. char's triangle="Crit Chance%" only matches Triangle Crit Chance% mods) AND a set membership check. The set-side already accepts main+side matches. The shape-and-primary side does not. Result: a Triangle Health% mod (great secondaries, character's build calls for Speed(x4)+Health(x2)) doesn't match any character whose Triangle primary isn't Health% even when their build wants the Health-set piece in some slot. Goal: a scanned mod's set fill counts toward the build regardless of which shape carries it, so a "shell" match path opens up for set-side fits. Implementation outline: (a) add a "setOnlyMatch" branch in findMatchingBuilds that matches when selectedSet appears in setRequirements with selectedSetCount &gt; 0 and skips the per-shape primary check (this branch tags the match as e.g. fitTier="setSidePiece"); (b) downgrade matchScore vs. main-set+primary matches so set-only matches don't crowd out exact fits; (c) per the user spec, strong-fit threshold remains alignedCount/strongAlignedCount on secondaries — set-only matches with weak secondaries still don't surface. Edge: don't blow up matchedCharacters with every char that has Speed(x4) in their build when scanning a Speed mod with mediocre secondaries — gate by the existing alignedCount &gt;= 2 filter (already in place for ownedComparisons).</w:t>
+            </w:r>
+          </w:p>
+        </w:tc>
+      </w:tr>
+      <w:tr>
+        <w:tc>
+          <w:tcPr>
+            <w:tcW w:type="dxa" w:w="1400"/>
+            <w:tcBorders>
+              <w:top w:val="single" w:color="CCCCCC" w:sz="1"/>
+              <w:left w:val="single" w:color="CCCCCC" w:sz="1"/>
+              <w:bottom w:val="single" w:color="CCCCCC" w:sz="1"/>
+              <w:right w:val="single" w:color="CCCCCC" w:sz="1"/>
+            </w:tcBorders>
+            <w:shd w:fill="FFF4CE" w:val="clear"/>
+            <w:tcMar>
+              <w:top w:type="dxa" w:w="80"/>
+              <w:left w:type="dxa" w:w="120"/>
+              <w:bottom w:type="dxa" w:w="80"/>
+              <w:right w:type="dxa" w:w="120"/>
+            </w:tcMar>
+          </w:tcPr>
+          <w:p>
+            <w:r>
+              <w:rPr>
+                <w:b/>
+                <w:bCs/>
+              </w:rPr>
+              <w:t xml:space="preserve">OPEN</w:t>
+            </w:r>
+          </w:p>
+        </w:tc>
+        <w:tc>
+          <w:tcPr>
+            <w:tcW w:type="dxa" w:w="2000"/>
+            <w:tcBorders>
+              <w:top w:val="single" w:color="CCCCCC" w:sz="1"/>
+              <w:left w:val="single" w:color="CCCCCC" w:sz="1"/>
+              <w:bottom w:val="single" w:color="CCCCCC" w:sz="1"/>
+              <w:right w:val="single" w:color="CCCCCC" w:sz="1"/>
+            </w:tcBorders>
+            <w:tcMar>
+              <w:top w:type="dxa" w:w="80"/>
+              <w:left w:type="dxa" w:w="120"/>
+              <w:bottom w:type="dxa" w:w="80"/>
+              <w:right w:type="dxa" w:w="120"/>
+            </w:tcMar>
+          </w:tcPr>
+          <w:p>
+            <w:r>
+              <w:t xml:space="preserve">Slicer / Deep EV modeling</w:t>
+            </w:r>
+          </w:p>
+        </w:tc>
+        <w:tc>
+          <w:tcPr>
+            <w:tcW w:type="dxa" w:w="3500"/>
+            <w:tcBorders>
+              <w:top w:val="single" w:color="CCCCCC" w:sz="1"/>
+              <w:left w:val="single" w:color="CCCCCC" w:sz="1"/>
+              <w:bottom w:val="single" w:color="CCCCCC" w:sz="1"/>
+              <w:right w:val="single" w:color="CCCCCC" w:sz="1"/>
+            </w:tcBorders>
+            <w:tcMar>
+              <w:top w:type="dxa" w:w="80"/>
+              <w:left w:type="dxa" w:w="120"/>
+              <w:bottom w:type="dxa" w:w="80"/>
+              <w:right w:type="dxa" w:w="120"/>
+            </w:tcMar>
+          </w:tcPr>
+          <w:p>
+            <w:r>
+              <w:t xml:space="preserve">Project full distribution of post-slice mod power, not just the expected value of a single bonus roll</w:t>
+            </w:r>
+          </w:p>
+        </w:tc>
+        <w:tc>
+          <w:tcPr>
+            <w:tcW w:type="dxa" w:w="2460"/>
+            <w:tcBorders>
+              <w:top w:val="single" w:color="CCCCCC" w:sz="1"/>
+              <w:left w:val="single" w:color="CCCCCC" w:sz="1"/>
+              <w:bottom w:val="single" w:color="CCCCCC" w:sz="1"/>
+              <w:right w:val="single" w:color="CCCCCC" w:sz="1"/>
+            </w:tcBorders>
+            <w:tcMar>
+              <w:top w:type="dxa" w:w="80"/>
+              <w:left w:type="dxa" w:w="120"/>
+              <w:bottom w:type="dxa" w:w="80"/>
+              <w:right w:type="dxa" w:w="120"/>
+            </w:tcMar>
+          </w:tcPr>
+          <w:p>
+            <w:r>
+              <w:t xml:space="preserve">Today (Phase 1, c806c92): projectSliceOutcome models a single tier-up — picks one random eligible secondary, returns expected added value per stat. The actionDesc surfaces "X% chance the bonus roll lands on Speed (avg +5 on hit)". Limits: (1) Single-tier only — doesn't project 5C → 5B → 5A → 6E end-to-end, so the user can't see "by 5A this Speed could realistically be 14-22". (2) Single-stat headline — picks Speed-or-top-weighted only, ignores the joint distribution. (3) No "P(meets threshold)" — no way to express "this mod has a 35% chance of being a 5A Speed &gt;= 18 mod after sliceing the rest of the way." Goal: add projectSliceLadder(secondaries, fromTier, toTier) that walks the tiers, simulates the random-bonus-pick at each step, and returns a probability distribution of final stat values. Then a percentile-based recommendation: "P(Speed &gt;= 18 by 5A) = 42%" / "P(Speed &gt;= 22) = 8%". Inform SLICE/HOLD threshold by the probability of meeting a configurable target (e.g. "Speed &gt;= 15 means slice; expected value isn't enough"). Likely needs Monte Carlo (1000+ samples) since the joint distribution doesn't close-form, then bucketed reporting in actionDesc. Roster-aware extension: P(this scanned mod beats your equipped mod for owned char X by 5A) — gives a true EV for the slice mats.</w:t>
             </w:r>
           </w:p>
         </w:tc>

</xml_diff>